<commit_message>
feat(defense): add speaker-script lines for 4 methodology zoom-in slides + re-sync 43-slide index
- Insert SLIDES entries for slides 14/16/18/21 (ZOOM-IN interstitials)
  with tight ~15 sec script lines orienting the panel
- Bump all subsequent num values (old 14-34 → 15/17/19-20/22-38)
  so inject_speaker_notes() targets correct 0-based pptx indices
- Fix _APPENDIX_OFFSET 34 → 38 (appendix A1-A5 now at pptx slides 39-43)
- Regenerate Poly_defense_script_v2.docx and re-inject all 43 slide notes
- Spot-checked: zoom slides 14/16/18/21 + appendix boundary A1/A5 all correct

Co-Authored-By: Claude Sonnet 4.6 <noreply@anthropic.com>
</commit_message>
<xml_diff>
--- a/thesis/health_rl/Poly_defense_script_v2.docx
+++ b/thesis/health_rl/Poly_defense_script_v2.docx
@@ -1075,7 +1075,7 @@
         <w:rPr>
           <w:color w:val="2E74B5"/>
         </w:rPr>
-        <w:t>SLIDE 14  ·  DATASET &amp; CONTEXT</w:t>
+        <w:t>SLIDE 14  ·  ZOOM-IN: APPLICANT CONTEXT</w:t>
       </w:r>
     </w:p>
     <w:p>
@@ -1088,7 +1088,7 @@
           <w:color w:val="707070"/>
           <w:sz w:val="18"/>
         </w:rPr>
-        <w:t>Timing: ~1.5 min</w:t>
+        <w:t>Timing: ~15 sec</w:t>
       </w:r>
     </w:p>
     <w:p>
@@ -1099,7 +1099,7 @@
         <w:rPr>
           <w:sz w:val="22"/>
         </w:rPr>
-        <w:t>Here is how the system sees Sophea: 34 numbers, nothing more.</w:t>
+        <w:t>We have seen the architecture pipeline from left to right. We now zoom in to the first stage — applicant context.</w:t>
       </w:r>
     </w:p>
     <w:p>
@@ -1110,7 +1110,7 @@
         <w:rPr>
           <w:sz w:val="22"/>
         </w:rPr>
-        <w:t>[Point to the stat boxes at the top.]</w:t>
+        <w:t>[Point to the highlighted input block.]</w:t>
       </w:r>
     </w:p>
     <w:p>
@@ -1121,40 +1121,7 @@
         <w:rPr>
           <w:sz w:val="22"/>
         </w:rPr>
-        <w:t>2,000 synthetic applicants. 34 context features. 4 underwriting arms. 4 real-world anchoring sources.</w:t>
-      </w:r>
-    </w:p>
-    <w:p>
-      <w:pPr>
-        <w:spacing w:before="80" w:after="80"/>
-      </w:pPr>
-      <w:r>
-        <w:rPr>
-          <w:sz w:val="22"/>
-        </w:rPr>
-        <w:t>[Point to the feature table.]</w:t>
-      </w:r>
-    </w:p>
-    <w:p>
-      <w:pPr>
-        <w:spacing w:before="80" w:after="80"/>
-      </w:pPr>
-      <w:r>
-        <w:rPr>
-          <w:sz w:val="22"/>
-        </w:rPr>
-        <w:t>The 34 dimensions come from seven feature categories. Demographics and vitals — age, gender, BMI. Lifestyle — smoking, alcohol, exercise. Social determinants — education, wealth, self-rated health. Economic features. Clinical flags — hypertension, diabetes, heart disease, COPD, arthritis, TB, hepatitis B. Region — eight one-hot encoded CDHS macro-regions. Occupation — seven one-hot encoded categories.</w:t>
-      </w:r>
-    </w:p>
-    <w:p>
-      <w:pPr>
-        <w:spacing w:before="80" w:after="80"/>
-      </w:pPr>
-      <w:r>
-        <w:rPr>
-          <w:sz w:val="22"/>
-        </w:rPr>
-        <w:t>Sophea is represented in this dataset as a vector: age 42, female, BMI 24.1, non-smoker, hypertension flag on, Kampong Cham indicator on, agriculture indicator on, and twenty-seven more features. The static system saw two of those features. The bandit sees all 34.</w:t>
+        <w:t>Each applicant is encoded as a 34-dimensional vector drawn from CDHS-anchored features. That vector is the bandit's sole input to every underwriting decision.</w:t>
       </w:r>
     </w:p>
     <w:p/>
@@ -1166,7 +1133,7 @@
         <w:rPr>
           <w:color w:val="2E74B5"/>
         </w:rPr>
-        <w:t>SLIDE 15  ·  ACTUARIAL REWARD SIMULATOR (TABLE 8)</w:t>
+        <w:t>SLIDE 15  ·  DATASET &amp; CONTEXT</w:t>
       </w:r>
     </w:p>
     <w:p>
@@ -1190,7 +1157,7 @@
         <w:rPr>
           <w:sz w:val="22"/>
         </w:rPr>
-        <w:t>[Point to the reward formula at the top.]</w:t>
+        <w:t>Here is how the system sees Sophea: 34 numbers, nothing more.</w:t>
       </w:r>
     </w:p>
     <w:p>
@@ -1201,7 +1168,7 @@
         <w:rPr>
           <w:sz w:val="22"/>
         </w:rPr>
-        <w:t>Reward equals premium revenue minus expected claims, with noise of plus-or-minus 8 percent. The adverse-selection factor of 1.35 applies when the risk multiplier exceeds 2.0 — this penalises overloading high-risk applicants who then drop out of the pool.</w:t>
+        <w:t>[Point to the stat boxes at the top.]</w:t>
       </w:r>
     </w:p>
     <w:p>
@@ -1212,7 +1179,7 @@
         <w:rPr>
           <w:sz w:val="22"/>
         </w:rPr>
-        <w:t>[Point to the table rows.]</w:t>
+        <w:t>2,000 synthetic applicants. 34 context features. 4 underwriting arms. 4 real-world anchoring sources.</w:t>
       </w:r>
     </w:p>
     <w:p>
@@ -1223,7 +1190,7 @@
         <w:rPr>
           <w:sz w:val="22"/>
         </w:rPr>
-        <w:t>STANDARD: accept at standard premium. Positive net reward for a correctly priced risk. Sophea at STANDARD earns a healthy actuarial margin.</w:t>
+        <w:t>[Point to the feature table.]</w:t>
       </w:r>
     </w:p>
     <w:p>
@@ -1234,7 +1201,7 @@
         <w:rPr>
           <w:sz w:val="22"/>
         </w:rPr>
-        <w:t>RATED: accept with a 25 percent loading. Higher revenue, but elastic demand penalises over-charging healthy applicants. The slope is negative 3.5.</w:t>
+        <w:t>The 34 dimensions come from seven feature categories. Demographics and vitals — age, gender, BMI. Lifestyle — smoking, alcohol, exercise. Social determinants — education, wealth, self-rated health. Economic features. Clinical flags — hypertension, diabetes, heart disease, COPD, arthritis, TB, hepatitis B. Region — eight one-hot encoded CDHS macro-regions. Occupation — seven one-hot encoded categories.</w:t>
       </w:r>
     </w:p>
     <w:p>
@@ -1245,18 +1212,7 @@
         <w:rPr>
           <w:sz w:val="22"/>
         </w:rPr>
-        <w:t>DECLINE: reject. Zero premium revenue. The penalty of minus $10 captures the opportunity cost of refusing a viable applicant.</w:t>
-      </w:r>
-    </w:p>
-    <w:p>
-      <w:pPr>
-        <w:spacing w:before="80" w:after="80"/>
-      </w:pPr>
-      <w:r>
-        <w:rPr>
-          <w:sz w:val="22"/>
-        </w:rPr>
-        <w:t>REFER: escalate to human. Deferred reward — 70 percent of the best available arm, minus $35 review cost. This incentivises selective escalation, not blanket referral.</w:t>
+        <w:t>Sophea is represented in this dataset as a vector: age 42, female, BMI 24.1, non-smoker, hypertension flag on, Kampong Cham indicator on, agriculture indicator on, and twenty-seven more features. The static system saw two of those features. The bandit sees all 34.</w:t>
       </w:r>
     </w:p>
     <w:p/>
@@ -1268,7 +1224,7 @@
         <w:rPr>
           <w:color w:val="2E74B5"/>
         </w:rPr>
-        <w:t>SLIDE 16  ·  BANDIT IN ACTION: SOPHEA'S CONTEXT &amp; ARM SCORES</w:t>
+        <w:t>SLIDE 16  ·  ZOOM-IN: ACTUARIAL REWARD</w:t>
       </w:r>
     </w:p>
     <w:p>
@@ -1281,7 +1237,7 @@
           <w:color w:val="707070"/>
           <w:sz w:val="18"/>
         </w:rPr>
-        <w:t>Timing: ~1.5 min</w:t>
+        <w:t>Timing: ~15 sec</w:t>
       </w:r>
     </w:p>
     <w:p>
@@ -1292,7 +1248,7 @@
         <w:rPr>
           <w:sz w:val="22"/>
         </w:rPr>
-        <w:t>Step one: Sophea's vector enters the bandit.</w:t>
+        <w:t>We have seen how the context enters the pipeline. We now zoom in to the reward stage.</w:t>
       </w:r>
     </w:p>
     <w:p>
@@ -1303,7 +1259,7 @@
         <w:rPr>
           <w:sz w:val="22"/>
         </w:rPr>
-        <w:t>[Point to the left feature list.]</w:t>
+        <w:t>[Point to the highlighted reward block.]</w:t>
       </w:r>
     </w:p>
     <w:p>
@@ -1314,40 +1270,7 @@
         <w:rPr>
           <w:sz w:val="22"/>
         </w:rPr>
-        <w:t>`age_std=0.3, bmi_std=−0.1, smoker=0, hypertension=1, kampong_cham=1, agriculture=1` — and twenty-eight more standardised features. This 34-dimensional vector is the bandit's complete and only view of Sophea. No underwriter notes. No prior history.</w:t>
-      </w:r>
-    </w:p>
-    <w:p>
-      <w:pPr>
-        <w:spacing w:before="80" w:after="80"/>
-      </w:pPr>
-      <w:r>
-        <w:rPr>
-          <w:sz w:val="22"/>
-        </w:rPr>
-        <w:t>[Point to the LinUCB formula on the right.]</w:t>
-      </w:r>
-    </w:p>
-    <w:p>
-      <w:pPr>
-        <w:spacing w:before="80" w:after="80"/>
-      </w:pPr>
-      <w:r>
-        <w:rPr>
-          <w:sz w:val="22"/>
-        </w:rPr>
-        <w:t>The LinUCB arm score formula: theta-hat transposed Sophea's vector, plus alpha times the square root of her vector transposed A-inverse her vector. The second term is the exploration bonus — large early in training when A is sparse, shrinking as the gram matrix fills in.</w:t>
-      </w:r>
-    </w:p>
-    <w:p>
-      <w:pPr>
-        <w:spacing w:before="80" w:after="80"/>
-      </w:pPr>
-      <w:r>
-        <w:rPr>
-          <w:sz w:val="22"/>
-        </w:rPr>
-        <w:t>The bandit computes this score for each of the four arms — RATED, STANDARD, DECLINE, REFER — and takes the argmax.</w:t>
+        <w:t>After the bandit selects an arm, the actuarial simulator scores that decision — premium revenue minus expected claims, with an adverse-selection penalty and noise of plus-or-minus 8 percent. That number is the signal that drives learning.</w:t>
       </w:r>
     </w:p>
     <w:p/>
@@ -1359,7 +1282,7 @@
         <w:rPr>
           <w:color w:val="2E74B5"/>
         </w:rPr>
-        <w:t>SLIDE 17  ·  POLICY LADDER: CUMULATIVE REWARD OVER 5,000 ROUNDS</w:t>
+        <w:t>SLIDE 17  ·  ACTUARIAL REWARD SIMULATOR (TABLE 8)</w:t>
       </w:r>
     </w:p>
     <w:p>
@@ -1372,7 +1295,7 @@
           <w:color w:val="707070"/>
           <w:sz w:val="18"/>
         </w:rPr>
-        <w:t>Timing: ~2 min</w:t>
+        <w:t>Timing: ~1.5 min</w:t>
       </w:r>
     </w:p>
     <w:p>
@@ -1383,7 +1306,7 @@
         <w:rPr>
           <w:sz w:val="22"/>
         </w:rPr>
-        <w:t>[Point to the argmax banner at the top.]</w:t>
+        <w:t>[Point to the reward formula at the top.]</w:t>
       </w:r>
     </w:p>
     <w:p>
@@ -1394,7 +1317,7 @@
         <w:rPr>
           <w:sz w:val="22"/>
         </w:rPr>
-        <w:t>ArgMax = STANDARD (0.52). The bandit gives Sophea the right answer.</w:t>
+        <w:t>Reward equals premium revenue minus expected claims, with noise of plus-or-minus 8 percent. The adverse-selection factor of 1.35 applies when the risk multiplier exceeds 2.0 — this penalises overloading high-risk applicants who then drop out of the pool.</w:t>
       </w:r>
     </w:p>
     <w:p>
@@ -1405,7 +1328,7 @@
         <w:rPr>
           <w:sz w:val="22"/>
         </w:rPr>
-        <w:t>After sufficient training, the computed arm values for Sophea are: RATED 0.31, STANDARD 0.52, DECLINE 0.10, REFER 0.28. The STANDARD arm wins by a clear margin. The system issues coverage at the correct actuarial price.</w:t>
+        <w:t>[Point to the table rows.]</w:t>
       </w:r>
     </w:p>
     <w:p>
@@ -1416,7 +1339,7 @@
         <w:rPr>
           <w:sz w:val="22"/>
         </w:rPr>
-        <w:t>[Point to the policy ladder table.]</w:t>
+        <w:t>STANDARD: accept at standard premium. Positive net reward for a correctly priced risk. Sophea at STANDARD earns a healthy actuarial margin.</w:t>
       </w:r>
     </w:p>
     <w:p>
@@ -1427,7 +1350,7 @@
         <w:rPr>
           <w:sz w:val="22"/>
         </w:rPr>
-        <w:t>Here is the full policy ladder across 5,000 rounds. Oracle — the theoretically perfect policy — earns $126,804. That is the ceiling.</w:t>
+        <w:t>RATED: accept with a 25 percent loading. Higher revenue, but elastic demand penalises over-charging healthy applicants. The slope is negative 3.5.</w:t>
       </w:r>
     </w:p>
     <w:p>
@@ -1438,7 +1361,7 @@
         <w:rPr>
           <w:sz w:val="22"/>
         </w:rPr>
-        <w:t>LinTS earns $93,723 at plus 29.8 percent over Static XGB. LinUCB earns $91,864 at plus 27.2 percent. Epsilon-Greedy earns $76,441. Static XGB — the system that declined Sophea — earns $72,206.</w:t>
+        <w:t>DECLINE: reject. Zero premium revenue. The penalty of minus $10 captures the opportunity cost of refusing a viable applicant.</w:t>
       </w:r>
     </w:p>
     <w:p>
@@ -1449,18 +1372,7 @@
         <w:rPr>
           <w:sz w:val="22"/>
         </w:rPr>
-        <w:t>[Point to the note at the bottom.]</w:t>
-      </w:r>
-    </w:p>
-    <w:p>
-      <w:pPr>
-        <w:spacing w:before="80" w:after="80"/>
-      </w:pPr>
-      <w:r>
-        <w:rPr>
-          <w:sz w:val="22"/>
-        </w:rPr>
-        <w:t>AlwaysRATED earns $122,287 — between Oracle and LinTS. This is reported honestly in the note: commercially and regulatorily inadmissible. It cannot be deployed. The admissible comparison is LinUCB versus Static XGB.</w:t>
+        <w:t>REFER: escalate to human. Deferred reward — 70 percent of the best available arm, minus $35 review cost. This incentivises selective escalation, not blanket referral.</w:t>
       </w:r>
     </w:p>
     <w:p/>
@@ -1472,7 +1384,7 @@
         <w:rPr>
           <w:color w:val="2E74B5"/>
         </w:rPr>
-        <w:t>SLIDE 18  ·  PSI FAIRNESS GUARDRAIL</w:t>
+        <w:t>SLIDE 18  ·  ZOOM-IN: BANDIT POLICY &amp; ACTION</w:t>
       </w:r>
     </w:p>
     <w:p>
@@ -1485,7 +1397,7 @@
           <w:color w:val="707070"/>
           <w:sz w:val="18"/>
         </w:rPr>
-        <w:t>Timing: ~1.5 min</w:t>
+        <w:t>Timing: ~15 sec</w:t>
       </w:r>
     </w:p>
     <w:p>
@@ -1496,7 +1408,7 @@
         <w:rPr>
           <w:sz w:val="22"/>
         </w:rPr>
-        <w:t>[Point to the traffic-light zones.]</w:t>
+        <w:t>We have seen how the reward is constructed. We now zoom in to the decision stage.</w:t>
       </w:r>
     </w:p>
     <w:p>
@@ -1507,7 +1419,7 @@
         <w:rPr>
           <w:sz w:val="22"/>
         </w:rPr>
-        <w:t>The PSI guardrail monitors the approved-portfolio distribution against the applicant population on a rolling 500-round window — separately for region and occupation.</w:t>
+        <w:t>[Point to the highlighted policy block.]</w:t>
       </w:r>
     </w:p>
     <w:p>
@@ -1518,51 +1430,7 @@
         <w:rPr>
           <w:sz w:val="22"/>
         </w:rPr>
-        <w:t>PSI equals the sum over each segment of: actual approval percentage minus expected percentage, times the natural log of actual over expected. This follows Siddiqi 2006, validated by Yurdakul and Naranjo 2020.</w:t>
-      </w:r>
-    </w:p>
-    <w:p>
-      <w:pPr>
-        <w:spacing w:before="80" w:after="80"/>
-      </w:pPr>
-      <w:r>
-        <w:rPr>
-          <w:sz w:val="22"/>
-        </w:rPr>
-        <w:t>GREEN below 0.10 — no significant shift, policy is stable.</w:t>
-      </w:r>
-    </w:p>
-    <w:p>
-      <w:pPr>
-        <w:spacing w:before="80" w:after="80"/>
-      </w:pPr>
-      <w:r>
-        <w:rPr>
-          <w:sz w:val="22"/>
-        </w:rPr>
-        <w:t>AMBER 0.10 to 0.25 — moderate shift, monitor closely, flag for review.</w:t>
-      </w:r>
-    </w:p>
-    <w:p>
-      <w:pPr>
-        <w:spacing w:before="80" w:after="80"/>
-      </w:pPr>
-      <w:r>
-        <w:rPr>
-          <w:sz w:val="22"/>
-        </w:rPr>
-        <w:t>RED above 0.25 — major shift, halt or recalibrate the bandit, escalate to compliance.</w:t>
-      </w:r>
-    </w:p>
-    <w:p>
-      <w:pPr>
-        <w:spacing w:before="80" w:after="80"/>
-      </w:pPr>
-      <w:r>
-        <w:rPr>
-          <w:sz w:val="22"/>
-        </w:rPr>
-        <w:t>The EXP-006 result: LinUCB sits GREEN on all 8 regions and 7 occupations across 20 seeds. Mean PSI 0.042 for region and 0.037 for occupation. Sophea's Kampong Cham region PSI: 0.082 — GREEN. Her occupation category PSI max: 0.123 — AMBER, in the monitor zone, below RED.</w:t>
+        <w:t>The bandit computes a UCB score for each of the four arms — STANDARD, RATED, DECLINE, REFER — and selects the argmax. This is the step where the exploration-exploitation trade-off meets the actuarial judgment.</w:t>
       </w:r>
     </w:p>
     <w:p/>
@@ -1574,7 +1442,7 @@
         <w:rPr>
           <w:color w:val="2E74B5"/>
         </w:rPr>
-        <w:t>SLIDE 19  ·  HUMAN-IN-THE-LOOP (HITL) WRAPPER</w:t>
+        <w:t>SLIDE 19  ·  BANDIT IN ACTION: SOPHEA'S CONTEXT &amp; ARM SCORES</w:t>
       </w:r>
     </w:p>
     <w:p>
@@ -1598,7 +1466,7 @@
         <w:rPr>
           <w:sz w:val="22"/>
         </w:rPr>
-        <w:t>[Point to the four-step loop on the left.]</w:t>
+        <w:t>Step one: Sophea's vector enters the bandit.</w:t>
       </w:r>
     </w:p>
     <w:p>
@@ -1609,7 +1477,7 @@
         <w:rPr>
           <w:sz w:val="22"/>
         </w:rPr>
-        <w:t>The HITL wrapper adds a safety layer on top of the bandit.</w:t>
+        <w:t>[Point to the left feature list.]</w:t>
       </w:r>
     </w:p>
     <w:p>
@@ -1620,7 +1488,7 @@
         <w:rPr>
           <w:sz w:val="22"/>
         </w:rPr>
-        <w:t>Step 1: the bandit selects an arm as usual. Step 2: if the margin between the best and second-best arm score is below threshold kappa of 0.7 — the system is genuinely uncertain — the case is escalated to REFER. Step 3: a human actuary reviews the full context and makes the final call. Step 4: the system performs a dual update — updating both the selected arm on the human label, and penalising the REFER arm to prevent over-selection.</w:t>
+        <w:t>`age_std=0.3, bmi_std=−0.1, smoker=0, hypertension=1, kampong_cham=1, agriculture=1` — and twenty-eight more standardised features. This 34-dimensional vector is the bandit's complete and only view of Sophea. No underwriter notes. No prior history.</w:t>
       </w:r>
     </w:p>
     <w:p>
@@ -1631,7 +1499,7 @@
         <w:rPr>
           <w:sz w:val="22"/>
         </w:rPr>
-        <w:t>[Point to the gotcha card on the right.]</w:t>
+        <w:t>[Point to the LinUCB formula on the right.]</w:t>
       </w:r>
     </w:p>
     <w:p>
@@ -1642,7 +1510,7 @@
         <w:rPr>
           <w:sz w:val="22"/>
         </w:rPr>
-        <w:t>The dual update is critical. Without it, REFER accumulates reward without cost, creating an over-selection spiral. This was an implementation gotcha discovered during EXP-008 development.</w:t>
+        <w:t>The LinUCB arm score formula: theta-hat transposed Sophea's vector, plus alpha times the square root of her vector transposed A-inverse her vector. The second term is the exploration bonus — large early in training when A is sparse, shrinking as the gram matrix fills in.</w:t>
       </w:r>
     </w:p>
     <w:p>
@@ -1653,7 +1521,7 @@
         <w:rPr>
           <w:sz w:val="22"/>
         </w:rPr>
-        <w:t>The headline result: plus 6.5 percent reward gain over vanilla bandit, at a review rate of only 1.5 percent. 75 applications reviewed out of 5,000. That is the value of targeted human judgment.</w:t>
+        <w:t>The bandit computes this score for each of the four arms — RATED, STANDARD, DECLINE, REFER — and takes the argmax.</w:t>
       </w:r>
     </w:p>
     <w:p/>
@@ -1665,7 +1533,7 @@
         <w:rPr>
           <w:color w:val="2E74B5"/>
         </w:rPr>
-        <w:t>SLIDE 20  ·  EXPERIMENTAL DESIGN</w:t>
+        <w:t>SLIDE 20  ·  POLICY LADDER: CUMULATIVE REWARD OVER 5,000 ROUNDS</w:t>
       </w:r>
     </w:p>
     <w:p>
@@ -1678,7 +1546,7 @@
           <w:color w:val="707070"/>
           <w:sz w:val="18"/>
         </w:rPr>
-        <w:t>Timing: ~1.5 min</w:t>
+        <w:t>Timing: ~2 min</w:t>
       </w:r>
     </w:p>
     <w:p>
@@ -1689,7 +1557,7 @@
         <w:rPr>
           <w:sz w:val="22"/>
         </w:rPr>
-        <w:t>[Point to the statistics protocol banner.]</w:t>
+        <w:t>[Point to the argmax banner at the top.]</w:t>
       </w:r>
     </w:p>
     <w:p>
@@ -1700,7 +1568,7 @@
         <w:rPr>
           <w:sz w:val="22"/>
         </w:rPr>
-        <w:t>Every experiment follows the same rigorous protocol: 20 independent seeds, bootstrap 95 percent confidence intervals, paired Wilcoxon signed-rank tests, Bonferroni correction for multiple comparisons, and Cohen's d effect sizes.</w:t>
+        <w:t>ArgMax = STANDARD (0.52). The bandit gives Sophea the right answer.</w:t>
       </w:r>
     </w:p>
     <w:p>
@@ -1711,7 +1579,7 @@
         <w:rPr>
           <w:sz w:val="22"/>
         </w:rPr>
-        <w:t>[Point to the experiment table.]</w:t>
+        <w:t>After sufficient training, the computed arm values for Sophea are: RATED 0.31, STANDARD 0.52, DECLINE 0.10, REFER 0.28. The STANDARD arm wins by a clear margin. The system issues coverage at the correct actuarial price.</w:t>
       </w:r>
     </w:p>
     <w:p>
@@ -1722,7 +1590,7 @@
         <w:rPr>
           <w:sz w:val="22"/>
         </w:rPr>
-        <w:t>Nine experiments in total.</w:t>
+        <w:t>[Point to the policy ladder table.]</w:t>
       </w:r>
     </w:p>
     <w:p>
@@ -1733,7 +1601,7 @@
         <w:rPr>
           <w:sz w:val="22"/>
         </w:rPr>
-        <w:t>EXP-005 is the primary pre-registered test — LinUCB versus Static XGB over 5,000 rounds, 20 seeds. This is the experiment that answers RQ1.</w:t>
+        <w:t>Here is the full policy ladder across 5,000 rounds. Oracle — the theoretically perfect policy — earns $126,804. That is the ceiling.</w:t>
       </w:r>
     </w:p>
     <w:p>
@@ -1744,7 +1612,7 @@
         <w:rPr>
           <w:sz w:val="22"/>
         </w:rPr>
-        <w:t>EXP-006 runs the six fairness criteria — PSI plus EEOC four-fifths rule — answering RQ2.</w:t>
+        <w:t>LinTS earns $93,723 at plus 29.8 percent over Static XGB. LinUCB earns $91,864 at plus 27.2 percent. Epsilon-Greedy earns $76,441. Static XGB — the system that declined Sophea — earns $72,206.</w:t>
       </w:r>
     </w:p>
     <w:p>
@@ -1755,7 +1623,7 @@
         <w:rPr>
           <w:sz w:val="22"/>
         </w:rPr>
-        <w:t>EXP-007 is the full benchmark ladder using Common Random Numbers for variance reduction.</w:t>
+        <w:t>[Point to the note at the bottom.]</w:t>
       </w:r>
     </w:p>
     <w:p>
@@ -1766,7 +1634,7 @@
         <w:rPr>
           <w:sz w:val="22"/>
         </w:rPr>
-        <w:t>EXP-008 to EXP-015 cover HITL, drift adaptation, cold start, ablation, regret bound validation, and drift rescue — progressively interrogating the system's boundaries.</w:t>
+        <w:t>AlwaysRATED earns $122,287 — between Oracle and LinTS. This is reported honestly in the note: commercially and regulatorily inadmissible. It cannot be deployed. The admissible comparison is LinUCB versus Static XGB.</w:t>
       </w:r>
     </w:p>
     <w:p/>
@@ -1778,7 +1646,7 @@
         <w:rPr>
           <w:color w:val="2E74B5"/>
         </w:rPr>
-        <w:t>SLIDE 21  ·  SECTION DIVIDER — Results &amp; Evaluation</w:t>
+        <w:t>SLIDE 21  ·  ZOOM-IN: FAIRNESS GUARDRAIL &amp; HITL</w:t>
       </w:r>
     </w:p>
     <w:p>
@@ -1791,7 +1659,7 @@
           <w:color w:val="707070"/>
           <w:sz w:val="18"/>
         </w:rPr>
-        <w:t>Timing: ~5 sec</w:t>
+        <w:t>Timing: ~15 sec</w:t>
       </w:r>
     </w:p>
     <w:p>
@@ -1802,7 +1670,29 @@
         <w:rPr>
           <w:sz w:val="22"/>
         </w:rPr>
-        <w:t>Let me now tell you what the system actually did — including what it got right, what it got wrong, and what I reported honestly either way.</w:t>
+        <w:t>We have seen how the bandit selects actions and receives rewards. We now zoom in to the guardrails.</w:t>
+      </w:r>
+    </w:p>
+    <w:p>
+      <w:pPr>
+        <w:spacing w:before="80" w:after="80"/>
+      </w:pPr>
+      <w:r>
+        <w:rPr>
+          <w:sz w:val="22"/>
+        </w:rPr>
+        <w:t>[Point to the highlighted PSI and HITL blocks.]</w:t>
+      </w:r>
+    </w:p>
+    <w:p>
+      <w:pPr>
+        <w:spacing w:before="80" w:after="80"/>
+      </w:pPr>
+      <w:r>
+        <w:rPr>
+          <w:sz w:val="22"/>
+        </w:rPr>
+        <w:t>The PSI monitor checks demographic parity on a 500-round sliding window. The HITL wrapper catches decisions where the bandit is uncertain. Together these two layers ensure the system remains fair, auditable, and safe to deploy.</w:t>
       </w:r>
     </w:p>
     <w:p/>
@@ -1814,7 +1704,7 @@
         <w:rPr>
           <w:color w:val="2E74B5"/>
         </w:rPr>
-        <w:t>SLIDE 22  ·  THE BASELINE LADDER</w:t>
+        <w:t>SLIDE 22  ·  PSI FAIRNESS GUARDRAIL</w:t>
       </w:r>
     </w:p>
     <w:p>
@@ -1827,7 +1717,7 @@
           <w:color w:val="707070"/>
           <w:sz w:val="18"/>
         </w:rPr>
-        <w:t>Timing: ~2 min</w:t>
+        <w:t>Timing: ~1.5 min</w:t>
       </w:r>
     </w:p>
     <w:p>
@@ -1838,7 +1728,7 @@
         <w:rPr>
           <w:sz w:val="22"/>
         </w:rPr>
-        <w:t>[Point to the full ladder table.]</w:t>
+        <w:t>[Point to the traffic-light zones.]</w:t>
       </w:r>
     </w:p>
     <w:p>
@@ -1849,7 +1739,7 @@
         <w:rPr>
           <w:sz w:val="22"/>
         </w:rPr>
-        <w:t>This is the complete baseline ladder across 20 seeds. Oracle sits at $126,804 — the theoretical ceiling. LinTS at $93,723. LinUCB at $91,864. Both are highlighted in green as our proposed admissible policies.</w:t>
+        <w:t>The PSI guardrail monitors the approved-portfolio distribution against the applicant population on a rolling 500-round window — separately for region and occupation.</w:t>
       </w:r>
     </w:p>
     <w:p>
@@ -1860,7 +1750,7 @@
         <w:rPr>
           <w:sz w:val="22"/>
         </w:rPr>
-        <w:t>[Point to the AlwaysRATED row.]</w:t>
+        <w:t>PSI equals the sum over each segment of: actual approval percentage minus expected percentage, times the natural log of actual over expected. This follows Siddiqi 2006, validated by Yurdakul and Naranjo 2020.</w:t>
       </w:r>
     </w:p>
     <w:p>
@@ -1871,7 +1761,7 @@
         <w:rPr>
           <w:sz w:val="22"/>
         </w:rPr>
-        <w:t>I want to be direct about this number — $122,287. AlwaysRATED beats both bandits. I report this honestly. AlwaysRATED is inadmissible: no Cambodian insurer can apply a blanket 25% surcharge to every applicant regardless of risk. Our claim is scoped to admissible policies. Among those, bandits rank first and second.</w:t>
+        <w:t>GREEN below 0.10 — no significant shift, policy is stable.</w:t>
       </w:r>
     </w:p>
     <w:p>
@@ -1882,7 +1772,7 @@
         <w:rPr>
           <w:sz w:val="22"/>
         </w:rPr>
-        <w:t>That +25.2% is the gap between 2023 Sophea and 2026 Sophea — between the static system that declined her and the bandit that learned to see her correctly.</w:t>
+        <w:t>AMBER 0.10 to 0.25 — moderate shift, monitor closely, flag for review.</w:t>
       </w:r>
     </w:p>
     <w:p>
@@ -1893,7 +1783,7 @@
         <w:rPr>
           <w:sz w:val="22"/>
         </w:rPr>
-        <w:t>Two additional points of transparency:</w:t>
+        <w:t>RED above 0.25 — major shift, halt or recalibrate the bandit, escalate to compliance.</w:t>
       </w:r>
     </w:p>
     <w:p>
@@ -1904,18 +1794,7 @@
         <w:rPr>
           <w:sz w:val="22"/>
         </w:rPr>
-        <w:t>LinTS versus LinUCB: p equals 0.87. They are statistically tied at the top of the admissible set. I do not claim one beats the other.</w:t>
-      </w:r>
-    </w:p>
-    <w:p>
-      <w:pPr>
-        <w:spacing w:before="80" w:after="80"/>
-      </w:pPr>
-      <w:r>
-        <w:rPr>
-          <w:sz w:val="22"/>
-        </w:rPr>
-        <w:t>AlwaysSTANDARD earns only $34,684 — well below Static XGB. A naive all-approve policy is not the answer.</w:t>
+        <w:t>The EXP-006 result: LinUCB sits GREEN on all 8 regions and 7 occupations across 20 seeds. Mean PSI 0.042 for region and 0.037 for occupation. Sophea's Kampong Cham region PSI: 0.082 — GREEN. Her occupation category PSI max: 0.123 — AMBER, in the monitor zone, below RED.</w:t>
       </w:r>
     </w:p>
     <w:p/>
@@ -1927,7 +1806,7 @@
         <w:rPr>
           <w:color w:val="2E74B5"/>
         </w:rPr>
-        <w:t>SLIDE 23  ·  EXP-005: CONVERGENCE VALIDATION</w:t>
+        <w:t>SLIDE 23  ·  HUMAN-IN-THE-LOOP (HITL) WRAPPER</w:t>
       </w:r>
     </w:p>
     <w:p>
@@ -1951,7 +1830,7 @@
         <w:rPr>
           <w:sz w:val="22"/>
         </w:rPr>
-        <w:t>[Point to the metrics on the left.]</w:t>
+        <w:t>[Point to the four-step loop on the left.]</w:t>
       </w:r>
     </w:p>
     <w:p>
@@ -1962,7 +1841,7 @@
         <w:rPr>
           <w:sz w:val="22"/>
         </w:rPr>
-        <w:t>EXP-005 is the pre-registered primary experiment. Paired Wilcoxon test across 20 independent seeds, LinUCB versus Static XGB.</w:t>
+        <w:t>The HITL wrapper adds a safety layer on top of the bandit.</w:t>
       </w:r>
     </w:p>
     <w:p>
@@ -1973,7 +1852,7 @@
         <w:rPr>
           <w:sz w:val="22"/>
         </w:rPr>
-        <w:t>LinUCB cumulative reward: $90,540 plus-or-minus $5,382, 95 percent CI [88,287 – 92,886]. Static XGB: $72,292 plus-or-minus $4,120, CI [70,646 – 74,136].</w:t>
+        <w:t>Step 1: the bandit selects an arm as usual. Step 2: if the margin between the best and second-best arm score is below threshold kappa of 0.7 — the system is genuinely uncertain — the case is escalated to REFER. Step 3: a human actuary reviews the full context and makes the final call. Step 4: the system performs a dual update — updating both the selected arm on the human label, and penalising the REFER arm to prevent over-selection.</w:t>
       </w:r>
     </w:p>
     <w:p>
@@ -1984,7 +1863,7 @@
         <w:rPr>
           <w:sz w:val="22"/>
         </w:rPr>
-        <w:t>Improvement: plus $18,248 — that is +25.2%. Cohen's d equals 2.98. P less than 0.001.</w:t>
+        <w:t>[Point to the gotcha card on the right.]</w:t>
       </w:r>
     </w:p>
     <w:p>
@@ -1995,7 +1874,7 @@
         <w:rPr>
           <w:sz w:val="22"/>
         </w:rPr>
-        <w:t>[Point to the bottom banner.]</w:t>
+        <w:t>The dual update is critical. Without it, REFER accumulates reward without cost, creating an over-selection spiral. This was an implementation gotcha discovered during EXP-008 development.</w:t>
       </w:r>
     </w:p>
     <w:p>
@@ -2006,29 +1885,7 @@
         <w:rPr>
           <w:sz w:val="22"/>
         </w:rPr>
-        <w:t>+25.2% is the gap between 2023 Sophea and 2026 Sophea — between the system that declined her and the bandit that learned to price her correctly.</w:t>
-      </w:r>
-    </w:p>
-    <w:p>
-      <w:pPr>
-        <w:spacing w:before="80" w:after="80"/>
-      </w:pPr>
-      <w:r>
-        <w:rPr>
-          <w:sz w:val="22"/>
-        </w:rPr>
-        <w:t>[Point to the convergence panel on the right.]</w:t>
-      </w:r>
-    </w:p>
-    <w:p>
-      <w:pPr>
-        <w:spacing w:before="80" w:after="80"/>
-      </w:pPr>
-      <w:r>
-        <w:rPr>
-          <w:sz w:val="22"/>
-        </w:rPr>
-        <w:t>The convergence indicators confirm the learning is genuine. Action entropy drops from 1.314 to 1.105 nats — exploration giving way to exploitation. Oracle-agreement in the last 500 rounds reaches 37.8 percent. And the regret curve follows O of root-T — log-log slope 0.572, R-squared 0.9915. All five EXP-005 criteria: PASSED.</w:t>
+        <w:t>The headline result: plus 6.5 percent reward gain over vanilla bandit, at a review rate of only 1.5 percent. 75 applications reviewed out of 5,000. That is the value of targeted human judgment.</w:t>
       </w:r>
     </w:p>
     <w:p/>
@@ -2040,7 +1897,7 @@
         <w:rPr>
           <w:color w:val="2E74B5"/>
         </w:rPr>
-        <w:t>SLIDE 24  ·  EXP-006: FAIRNESS AUDIT</w:t>
+        <w:t>SLIDE 24  ·  EXPERIMENTAL DESIGN</w:t>
       </w:r>
     </w:p>
     <w:p>
@@ -2053,7 +1910,7 @@
           <w:color w:val="707070"/>
           <w:sz w:val="18"/>
         </w:rPr>
-        <w:t>Timing: ~2 min</w:t>
+        <w:t>Timing: ~1.5 min</w:t>
       </w:r>
     </w:p>
     <w:p>
@@ -2064,7 +1921,7 @@
         <w:rPr>
           <w:sz w:val="22"/>
         </w:rPr>
-        <w:t>The fairness audit evaluates six pre-registered criteria. Five passed. One failed — and I want to address that failure directly.</w:t>
+        <w:t>[Point to the statistics protocol banner.]</w:t>
       </w:r>
     </w:p>
     <w:p>
@@ -2075,7 +1932,7 @@
         <w:rPr>
           <w:sz w:val="22"/>
         </w:rPr>
-        <w:t>[Point to the six criterion cards.]</w:t>
+        <w:t>Every experiment follows the same rigorous protocol: 20 independent seeds, bootstrap 95 percent confidence intervals, paired Wilcoxon signed-rank tests, Bonferroni correction for multiple comparisons, and Cohen's d effect sizes.</w:t>
       </w:r>
     </w:p>
     <w:p>
@@ -2086,7 +1943,7 @@
         <w:rPr>
           <w:sz w:val="22"/>
         </w:rPr>
-        <w:t>Region PSI: 0.082 — GREEN. Occupation PSI: 0.123 — AMBER, in the monitor zone but below RED. Region parity at 85.72 percent — above the 80 percent four-fifths threshold. Occupation parity at 90.12 percent — also above 80 percent. Region permutation test: p equals 0.132 — no significant association.</w:t>
+        <w:t>[Point to the experiment table.]</w:t>
       </w:r>
     </w:p>
     <w:p>
@@ -2097,7 +1954,7 @@
         <w:rPr>
           <w:sz w:val="22"/>
         </w:rPr>
-        <w:t>[Point to the amber Criterion 6 card.]</w:t>
+        <w:t>Nine experiments in total.</w:t>
       </w:r>
     </w:p>
     <w:p>
@@ -2108,7 +1965,7 @@
         <w:rPr>
           <w:sz w:val="22"/>
         </w:rPr>
-        <w:t>Criterion 6 — occupation-to-action independence — FAILED, p less than 0.001. The system's decisions are statistically associated with occupation.</w:t>
+        <w:t>EXP-005 is the primary pre-registered test — LinUCB versus Static XGB over 5,000 rounds, 20 seeds. This is the experiment that answers RQ1.</w:t>
       </w:r>
     </w:p>
     <w:p>
@@ -2119,7 +1976,29 @@
         <w:rPr>
           <w:sz w:val="22"/>
         </w:rPr>
-        <w:t>My interpretation: occupation is an actuarially valid risk factor. Rice farmers, garment workers, and office workers carry genuinely different health risk profiles. The association is statistically significant but practically small — no regulatory threshold is breached. I call this FAILED-with-interpretation. I stand by that verdict. PSI is a monitor, not an enforcer — constrained-action guardrails are future work.</w:t>
+        <w:t>EXP-006 runs the six fairness criteria — PSI plus EEOC four-fifths rule — answering RQ2.</w:t>
+      </w:r>
+    </w:p>
+    <w:p>
+      <w:pPr>
+        <w:spacing w:before="80" w:after="80"/>
+      </w:pPr>
+      <w:r>
+        <w:rPr>
+          <w:sz w:val="22"/>
+        </w:rPr>
+        <w:t>EXP-007 is the full benchmark ladder using Common Random Numbers for variance reduction.</w:t>
+      </w:r>
+    </w:p>
+    <w:p>
+      <w:pPr>
+        <w:spacing w:before="80" w:after="80"/>
+      </w:pPr>
+      <w:r>
+        <w:rPr>
+          <w:sz w:val="22"/>
+        </w:rPr>
+        <w:t>EXP-008 to EXP-015 cover HITL, drift adaptation, cold start, ablation, regret bound validation, and drift rescue — progressively interrogating the system's boundaries.</w:t>
       </w:r>
     </w:p>
     <w:p/>
@@ -2131,7 +2010,7 @@
         <w:rPr>
           <w:color w:val="2E74B5"/>
         </w:rPr>
-        <w:t>SLIDE 25  ·  EXP-007: BENCHMARK COMPARISON (CRN)</w:t>
+        <w:t>SLIDE 25  ·  SECTION DIVIDER — Results &amp; Evaluation</w:t>
       </w:r>
     </w:p>
     <w:p>
@@ -2144,7 +2023,7 @@
           <w:color w:val="707070"/>
           <w:sz w:val="18"/>
         </w:rPr>
-        <w:t>Timing: ~1.5 min</w:t>
+        <w:t>Timing: ~5 sec</w:t>
       </w:r>
     </w:p>
     <w:p>
@@ -2155,84 +2034,7 @@
         <w:rPr>
           <w:sz w:val="22"/>
         </w:rPr>
-        <w:t>EXP-007 uses the CRN — Common Random Numbers — harness for variance reduction. All policies run on the same sequence of applicant draws, making comparisons sharper.</w:t>
-      </w:r>
-    </w:p>
-    <w:p>
-      <w:pPr>
-        <w:spacing w:before="80" w:after="80"/>
-      </w:pPr>
-      <w:r>
-        <w:rPr>
-          <w:sz w:val="22"/>
-        </w:rPr>
-        <w:t>[Point to the left table.]</w:t>
-      </w:r>
-    </w:p>
-    <w:p>
-      <w:pPr>
-        <w:spacing w:before="80" w:after="80"/>
-      </w:pPr>
-      <w:r>
-        <w:rPr>
-          <w:sz w:val="22"/>
-        </w:rPr>
-        <w:t>AlwaysRATED leads at $122,287 — as expected and reported honestly. LinTS at $93,723. LinUCB at $91,864. Epsilon-Greedy at $76,441. Static XGB at $72,206.</w:t>
-      </w:r>
-    </w:p>
-    <w:p>
-      <w:pPr>
-        <w:spacing w:before="80" w:after="80"/>
-      </w:pPr>
-      <w:r>
-        <w:rPr>
-          <w:sz w:val="22"/>
-        </w:rPr>
-        <w:t>[Point to the pairwise comparison cards on the right.]</w:t>
-      </w:r>
-    </w:p>
-    <w:p>
-      <w:pPr>
-        <w:spacing w:before="80" w:after="80"/>
-      </w:pPr>
-      <w:r>
-        <w:rPr>
-          <w:sz w:val="22"/>
-        </w:rPr>
-        <w:t>LinTS versus LinUCB: p equals 0.87, d equals 0.26 — TIED. They are statistically indistinguishable at the top of the admissible set.</w:t>
-      </w:r>
-    </w:p>
-    <w:p>
-      <w:pPr>
-        <w:spacing w:before="80" w:after="80"/>
-      </w:pPr>
-      <w:r>
-        <w:rPr>
-          <w:sz w:val="22"/>
-        </w:rPr>
-        <w:t>LinUCB versus Static XGB: minus $19,774 regret, p less than 0.001, d equals negative 3.41 — WIN.</w:t>
-      </w:r>
-    </w:p>
-    <w:p>
-      <w:pPr>
-        <w:spacing w:before="80" w:after="80"/>
-      </w:pPr>
-      <w:r>
-        <w:rPr>
-          <w:sz w:val="22"/>
-        </w:rPr>
-        <w:t>LinTS versus Static XGB: minus $21,400 regret, p less than 0.001, d equals negative 3.89 — WIN.</w:t>
-      </w:r>
-    </w:p>
-    <w:p>
-      <w:pPr>
-        <w:spacing w:before="80" w:after="80"/>
-      </w:pPr>
-      <w:r>
-        <w:rPr>
-          <w:sz w:val="22"/>
-        </w:rPr>
-        <w:t>Two coexisting findings: adaptive bandits decisively beat the frozen static rule. And the trivial constant AlwaysRATED still beats all bandits — honestly reported.</w:t>
+        <w:t>Let me now tell you what the system actually did — including what it got right, what it got wrong, and what I reported honestly either way.</w:t>
       </w:r>
     </w:p>
     <w:p/>
@@ -2244,7 +2046,7 @@
         <w:rPr>
           <w:color w:val="2E74B5"/>
         </w:rPr>
-        <w:t>SLIDE 26  ·  EXP-008: HUMAN-IN-THE-LOOP</w:t>
+        <w:t>SLIDE 26  ·  THE BASELINE LADDER</w:t>
       </w:r>
     </w:p>
     <w:p>
@@ -2257,7 +2059,7 @@
           <w:color w:val="707070"/>
           <w:sz w:val="18"/>
         </w:rPr>
-        <w:t>Timing: ~1.5 min</w:t>
+        <w:t>Timing: ~2 min</w:t>
       </w:r>
     </w:p>
     <w:p>
@@ -2268,7 +2070,7 @@
         <w:rPr>
           <w:sz w:val="22"/>
         </w:rPr>
-        <w:t>[Point to the key metrics.]</w:t>
+        <w:t>[Point to the full ladder table.]</w:t>
       </w:r>
     </w:p>
     <w:p>
@@ -2279,7 +2081,7 @@
         <w:rPr>
           <w:sz w:val="22"/>
         </w:rPr>
-        <w:t>EXP-008 evaluates the HITL wrapper with kappa of 0.7 — the headline setting.</w:t>
+        <w:t>This is the complete baseline ladder across 20 seeds. Oracle sits at $126,804 — the theoretical ceiling. LinTS at $93,723. LinUCB at $91,864. Both are highlighted in green as our proposed admissible policies.</w:t>
       </w:r>
     </w:p>
     <w:p>
@@ -2290,7 +2092,7 @@
         <w:rPr>
           <w:sz w:val="22"/>
         </w:rPr>
-        <w:t>HITL reward: $102,100. Vanilla bandit: $95,872. Improvement: plus $6,228 — that is plus 6.5 percent. Review cost: $2,625 — about 2.6 percent of reward. Human overrides: 75 out of 5,000 applications. A review rate of 1.5 percent. Alignment score between human expert and bandit: 60 percent.</w:t>
+        <w:t>[Point to the AlwaysRATED row.]</w:t>
       </w:r>
     </w:p>
     <w:p>
@@ -2301,7 +2103,7 @@
         <w:rPr>
           <w:sz w:val="22"/>
         </w:rPr>
-        <w:t>[Point to the note at the bottom.]</w:t>
+        <w:t>I want to be direct about this number — $122,287. AlwaysRATED beats both bandits. I report this honestly. AlwaysRATED is inadmissible: no Cambodian insurer can apply a blanket 25% surcharge to every applicant regardless of risk. Our claim is scoped to admissible policies. Among those, bandits rank first and second.</w:t>
       </w:r>
     </w:p>
     <w:p>
@@ -2312,7 +2114,7 @@
         <w:rPr>
           <w:sz w:val="22"/>
         </w:rPr>
-        <w:t>Important scope note: plus 6.5 percent is versus the vanilla bandit — not versus AlwaysRATED, not versus Static XGB. This measures the incremental value of targeted human oversight on top of the bandit baseline.</w:t>
+        <w:t>That +25.2% is the gap between 2023 Sophea and 2026 Sophea — between the static system that declined her and the bandit that learned to see her correctly.</w:t>
       </w:r>
     </w:p>
     <w:p>
@@ -2323,7 +2125,29 @@
         <w:rPr>
           <w:sz w:val="22"/>
         </w:rPr>
-        <w:t>Thirteen applicants reviewed per thousand. The actuary's judgment on those thirteen cases is worth a 6.5 percent gain on the whole portfolio. That is the value of the HITL layer.</w:t>
+        <w:t>Two additional points of transparency:</w:t>
+      </w:r>
+    </w:p>
+    <w:p>
+      <w:pPr>
+        <w:spacing w:before="80" w:after="80"/>
+      </w:pPr>
+      <w:r>
+        <w:rPr>
+          <w:sz w:val="22"/>
+        </w:rPr>
+        <w:t>LinTS versus LinUCB: p equals 0.87. They are statistically tied at the top of the admissible set. I do not claim one beats the other.</w:t>
+      </w:r>
+    </w:p>
+    <w:p>
+      <w:pPr>
+        <w:spacing w:before="80" w:after="80"/>
+      </w:pPr>
+      <w:r>
+        <w:rPr>
+          <w:sz w:val="22"/>
+        </w:rPr>
+        <w:t>AlwaysSTANDARD earns only $34,684 — well below Static XGB. A naive all-approve policy is not the answer.</w:t>
       </w:r>
     </w:p>
     <w:p/>
@@ -2335,7 +2159,7 @@
         <w:rPr>
           <w:color w:val="2E74B5"/>
         </w:rPr>
-        <w:t>SLIDE 27  ·  WHAT DRIVES THE VALUE? (EXP-011 + EXP-015)</w:t>
+        <w:t>SLIDE 27  ·  EXP-005: CONVERGENCE VALIDATION</w:t>
       </w:r>
     </w:p>
     <w:p>
@@ -2348,7 +2172,7 @@
           <w:color w:val="707070"/>
           <w:sz w:val="18"/>
         </w:rPr>
-        <w:t>Timing: ~2 min</w:t>
+        <w:t>Timing: ~1.5 min</w:t>
       </w:r>
     </w:p>
     <w:p>
@@ -2359,7 +2183,7 @@
         <w:rPr>
           <w:sz w:val="22"/>
         </w:rPr>
-        <w:t>[Point to the left ablation panel.]</w:t>
+        <w:t>[Point to the metrics on the left.]</w:t>
       </w:r>
     </w:p>
     <w:p>
@@ -2370,7 +2194,7 @@
         <w:rPr>
           <w:sz w:val="22"/>
         </w:rPr>
-        <w:t>EXP-011 tells us the exploration bonus is not what drives the value — Greedy-only ties full LinUCB. The value comes from online ridge updating. EXP-015 tells us that even under drift, the constant beats us. These two findings together define the boundary of what this thesis can and cannot claim.</w:t>
+        <w:t>EXP-005 is the pre-registered primary experiment. Paired Wilcoxon test across 20 independent seeds, LinUCB versus Static XGB.</w:t>
       </w:r>
     </w:p>
     <w:p>
@@ -2381,7 +2205,7 @@
         <w:rPr>
           <w:sz w:val="22"/>
         </w:rPr>
-        <w:t>On the left: EXP-011. Full LinUCB versus Greedy-only with alpha equals zero. p equals 0.580, d equals 0.13 — statistically tied. Exploration is not load-bearing.</w:t>
+        <w:t>LinUCB cumulative reward: $90,540 plus-or-minus $5,382, 95 percent CI [88,287 – 92,886]. Static XGB: $72,292 plus-or-minus $4,120, CI [70,646 – 74,136].</w:t>
       </w:r>
     </w:p>
     <w:p>
@@ -2392,7 +2216,7 @@
         <w:rPr>
           <w:sz w:val="22"/>
         </w:rPr>
-        <w:t>But Greedy-only versus Static XGB: plus $18,969, p less than 0.001, d equals 3.01. Online ridge updating IS the mechanism. The bandit beats Static XGB not because of its UCB exploration bonus but because it updates its ridge estimator from every new applicant.</w:t>
+        <w:t>Improvement: plus $18,248 — that is +25.2%. Cohen's d equals 2.98. P less than 0.001.</w:t>
       </w:r>
     </w:p>
     <w:p>
@@ -2403,7 +2227,7 @@
         <w:rPr>
           <w:sz w:val="22"/>
         </w:rPr>
-        <w:t>[Point to the right drift panel.]</w:t>
+        <w:t>[Point to the bottom banner.]</w:t>
       </w:r>
     </w:p>
     <w:p>
@@ -2414,7 +2238,7 @@
         <w:rPr>
           <w:sz w:val="22"/>
         </w:rPr>
-        <w:t>On the right: EXP-015. Under a realistic drift shock, AlwaysRATED earns $99,321. LinTS earns $71,429 — minus 39 percent. LinUCB earns $71,373 — minus 39.2 percent. The discounted LinUCB with gamma of 0.999 earns $70,995 — no meaningful improvement.</w:t>
+        <w:t>+25.2% is the gap between 2023 Sophea and 2026 Sophea — between the system that declined her and the bandit that learned to price her correctly.</w:t>
       </w:r>
     </w:p>
     <w:p>
@@ -2425,7 +2249,18 @@
         <w:rPr>
           <w:sz w:val="22"/>
         </w:rPr>
-        <w:t>Non-stationarity does not rescue the bandit. We honestly report this as a boundary of the current framework.</w:t>
+        <w:t>[Point to the convergence panel on the right.]</w:t>
+      </w:r>
+    </w:p>
+    <w:p>
+      <w:pPr>
+        <w:spacing w:before="80" w:after="80"/>
+      </w:pPr>
+      <w:r>
+        <w:rPr>
+          <w:sz w:val="22"/>
+        </w:rPr>
+        <w:t>The convergence indicators confirm the learning is genuine. Action entropy drops from 1.314 to 1.105 nats — exploration giving way to exploitation. Oracle-agreement in the last 500 rounds reaches 37.8 percent. And the regret curve follows O of root-T — log-log slope 0.572, R-squared 0.9915. All five EXP-005 criteria: PASSED.</w:t>
       </w:r>
     </w:p>
     <w:p/>
@@ -2437,7 +2272,7 @@
         <w:rPr>
           <w:color w:val="2E74B5"/>
         </w:rPr>
-        <w:t>SLIDE 28  ·  COLD START &amp; REGRET BOUND (EXP-010 + EXP-013)</w:t>
+        <w:t>SLIDE 28  ·  EXP-006: FAIRNESS AUDIT</w:t>
       </w:r>
     </w:p>
     <w:p>
@@ -2450,7 +2285,7 @@
           <w:color w:val="707070"/>
           <w:sz w:val="18"/>
         </w:rPr>
-        <w:t>Timing: ~1.5 min</w:t>
+        <w:t>Timing: ~2 min</w:t>
       </w:r>
     </w:p>
     <w:p>
@@ -2461,7 +2296,7 @@
         <w:rPr>
           <w:sz w:val="22"/>
         </w:rPr>
-        <w:t>[Point to the cold start table on the left.]</w:t>
+        <w:t>The fairness audit evaluates six pre-registered criteria. Five passed. One failed — and I want to address that failure directly.</w:t>
       </w:r>
     </w:p>
     <w:p>
@@ -2472,7 +2307,7 @@
         <w:rPr>
           <w:sz w:val="22"/>
         </w:rPr>
-        <w:t>EXP-010 asks: at what horizon does the bandit certify its superiority? This matters because a real insurer cannot wait 5,000 applicants before trusting the system.</w:t>
+        <w:t>[Point to the six criterion cards.]</w:t>
       </w:r>
     </w:p>
     <w:p>
@@ -2483,7 +2318,7 @@
         <w:rPr>
           <w:sz w:val="22"/>
         </w:rPr>
-        <w:t>At T equals 200, FreshXGB leads bandits by 2.1 times. At T equals 500, still 1.26 times. At T equals 1,000, the systems tie. At T equals 2,000, bandits cross over and take the lead.</w:t>
+        <w:t>Region PSI: 0.082 — GREEN. Occupation PSI: 0.123 — AMBER, in the monitor zone but below RED. Region parity at 85.72 percent — above the 80 percent four-fifths threshold. Occupation parity at 90.12 percent — also above 80 percent. Region permutation test: p equals 0.132 — no significant association.</w:t>
       </w:r>
     </w:p>
     <w:p>
@@ -2494,7 +2329,7 @@
         <w:rPr>
           <w:sz w:val="22"/>
         </w:rPr>
-        <w:t>Operational implication: warm-start required for the first 1,000 to 2,000 applications. A hybrid deployment — XGBoost until crossover, bandit thereafter — is the practical path.</w:t>
+        <w:t>[Point to the amber Criterion 6 card.]</w:t>
       </w:r>
     </w:p>
     <w:p>
@@ -2505,7 +2340,7 @@
         <w:rPr>
           <w:sz w:val="22"/>
         </w:rPr>
-        <w:t>LinTS passes the T equals 2,000 Wilcoxon test with p equals 0.0039. LinUCB draws level but is not certified — p equals 0.0840. I report LinUCB honestly as draws-level, not a proven win at 2,000.</w:t>
+        <w:t>Criterion 6 — occupation-to-action independence — FAILED, p less than 0.001. The system's decisions are statistically associated with occupation.</w:t>
       </w:r>
     </w:p>
     <w:p>
@@ -2516,18 +2351,7 @@
         <w:rPr>
           <w:sz w:val="22"/>
         </w:rPr>
-        <w:t>[Point to the regret bound panel on the right.]</w:t>
-      </w:r>
-    </w:p>
-    <w:p>
-      <w:pPr>
-        <w:spacing w:before="80" w:after="80"/>
-      </w:pPr>
-      <w:r>
-        <w:rPr>
-          <w:sz w:val="22"/>
-        </w:rPr>
-        <w:t>EXP-013: log-log slope 0.572, theory 0.5 — near-optimal. R-squared 0.9915. Sublinear regret confirmed empirically.</w:t>
+        <w:t>My interpretation: occupation is an actuarially valid risk factor. Rice farmers, garment workers, and office workers carry genuinely different health risk profiles. The association is statistically significant but practically small — no regulatory threshold is breached. I call this FAILED-with-interpretation. I stand by that verdict. PSI is a monitor, not an enforcer — constrained-action guardrails are future work.</w:t>
       </w:r>
     </w:p>
     <w:p/>
@@ -2539,7 +2363,7 @@
         <w:rPr>
           <w:color w:val="2E74B5"/>
         </w:rPr>
-        <w:t>SLIDE 29  ·  LIVE DEMONSTRATION</w:t>
+        <w:t>SLIDE 29  ·  EXP-007: BENCHMARK COMPARISON (CRN)</w:t>
       </w:r>
     </w:p>
     <w:p>
@@ -2552,7 +2376,7 @@
           <w:color w:val="707070"/>
           <w:sz w:val="18"/>
         </w:rPr>
-        <w:t>Timing: ~3 min</w:t>
+        <w:t>Timing: ~1.5 min</w:t>
       </w:r>
     </w:p>
     <w:p>
@@ -2563,7 +2387,7 @@
         <w:rPr>
           <w:sz w:val="22"/>
         </w:rPr>
-        <w:t>[Open browser at localhost:8000 before this slide.]</w:t>
+        <w:t>EXP-007 uses the CRN — Common Random Numbers — harness for variance reduction. All policies run on the same sequence of applicant draws, making comparisons sharper.</w:t>
       </w:r>
     </w:p>
     <w:p>
@@ -2574,7 +2398,7 @@
         <w:rPr>
           <w:sz w:val="22"/>
         </w:rPr>
-        <w:t>I will now show you Sophea's application — not as a number in a table, but as a live interaction with the prototype dashboard.</w:t>
+        <w:t>[Point to the left table.]</w:t>
       </w:r>
     </w:p>
     <w:p>
@@ -2585,7 +2409,7 @@
         <w:rPr>
           <w:sz w:val="22"/>
         </w:rPr>
-        <w:t>[Enter Sophea's profile: age 42, female, BMI 24.1, smoker: no, hypertension: yes, Kampong Cham, agriculture.]</w:t>
+        <w:t>AlwaysRATED leads at $122,287 — as expected and reported honestly. LinTS at $93,723. LinUCB at $91,864. Epsilon-Greedy at $76,441. Static XGB at $72,206.</w:t>
       </w:r>
     </w:p>
     <w:p>
@@ -2596,7 +2420,7 @@
         <w:rPr>
           <w:sz w:val="22"/>
         </w:rPr>
-        <w:t>Enter Sophea's profile live — show STANDARD decision. Age 42, female, BMI 24.1, non-smoker, hypertension managed, Kampong Cham, agriculture. The bandit sees her 34 features, computes the arm scores, and issues its decision.</w:t>
+        <w:t>[Point to the pairwise comparison cards on the right.]</w:t>
       </w:r>
     </w:p>
     <w:p>
@@ -2607,7 +2431,7 @@
         <w:rPr>
           <w:sz w:val="22"/>
         </w:rPr>
-        <w:t>[Show the STANDARD decision.]</w:t>
+        <w:t>LinTS versus LinUCB: p equals 0.87, d equals 0.26 — TIED. They are statistically indistinguishable at the top of the admissible set.</w:t>
       </w:r>
     </w:p>
     <w:p>
@@ -2618,7 +2442,7 @@
         <w:rPr>
           <w:sz w:val="22"/>
         </w:rPr>
-        <w:t>STANDARD premium. The correct actuarial answer. The one she was denied in 2023.</w:t>
+        <w:t>LinUCB versus Static XGB: minus $19,774 regret, p less than 0.001, d equals negative 3.41 — WIN.</w:t>
       </w:r>
     </w:p>
     <w:p>
@@ -2629,7 +2453,7 @@
         <w:rPr>
           <w:sz w:val="22"/>
         </w:rPr>
-        <w:t>[Submit a high-risk applicant — older, smoker, high BMI, multiple flags.]</w:t>
+        <w:t>LinTS versus Static XGB: minus $21,400 regret, p less than 0.001, d equals negative 3.89 — WIN.</w:t>
       </w:r>
     </w:p>
     <w:p>
@@ -2640,29 +2464,7 @@
         <w:rPr>
           <w:sz w:val="22"/>
         </w:rPr>
-        <w:t>Now a higher-risk applicant. The system selects REFER — escalating to the HITL queue. Switch to the HITL tab to show the running referral rate and cumulative review cost.</w:t>
-      </w:r>
-    </w:p>
-    <w:p>
-      <w:pPr>
-        <w:spacing w:before="80" w:after="80"/>
-      </w:pPr>
-      <w:r>
-        <w:rPr>
-          <w:sz w:val="22"/>
-        </w:rPr>
-        <w:t>[This is the FastAPI prototype deployed on Render — not a mockup.]</w:t>
-      </w:r>
-    </w:p>
-    <w:p>
-      <w:pPr>
-        <w:spacing w:before="80" w:after="80"/>
-      </w:pPr>
-      <w:r>
-        <w:rPr>
-          <w:sz w:val="22"/>
-        </w:rPr>
-        <w:t>This is not a simulation. This is the same FastAPI stack described in the thesis, deployed on Render, running in real time.</w:t>
+        <w:t>Two coexisting findings: adaptive bandits decisively beat the frozen static rule. And the trivial constant AlwaysRATED still beats all bandits — honestly reported.</w:t>
       </w:r>
     </w:p>
     <w:p/>
@@ -2674,7 +2476,7 @@
         <w:rPr>
           <w:color w:val="2E74B5"/>
         </w:rPr>
-        <w:t>SLIDE 30  ·  SECTION DIVIDER — Conclusion &amp; Future Work</w:t>
+        <w:t>SLIDE 30  ·  EXP-008: HUMAN-IN-THE-LOOP</w:t>
       </w:r>
     </w:p>
     <w:p>
@@ -2687,7 +2489,7 @@
           <w:color w:val="707070"/>
           <w:sz w:val="18"/>
         </w:rPr>
-        <w:t>Timing: ~5 sec</w:t>
+        <w:t>Timing: ~1.5 min</w:t>
       </w:r>
     </w:p>
     <w:p>
@@ -2698,7 +2500,62 @@
         <w:rPr>
           <w:sz w:val="22"/>
         </w:rPr>
-        <w:t>Let me bring this back to Sophea — and to the four key findings.</w:t>
+        <w:t>[Point to the key metrics.]</w:t>
+      </w:r>
+    </w:p>
+    <w:p>
+      <w:pPr>
+        <w:spacing w:before="80" w:after="80"/>
+      </w:pPr>
+      <w:r>
+        <w:rPr>
+          <w:sz w:val="22"/>
+        </w:rPr>
+        <w:t>EXP-008 evaluates the HITL wrapper with kappa of 0.7 — the headline setting.</w:t>
+      </w:r>
+    </w:p>
+    <w:p>
+      <w:pPr>
+        <w:spacing w:before="80" w:after="80"/>
+      </w:pPr>
+      <w:r>
+        <w:rPr>
+          <w:sz w:val="22"/>
+        </w:rPr>
+        <w:t>HITL reward: $102,100. Vanilla bandit: $95,872. Improvement: plus $6,228 — that is plus 6.5 percent. Review cost: $2,625 — about 2.6 percent of reward. Human overrides: 75 out of 5,000 applications. A review rate of 1.5 percent. Alignment score between human expert and bandit: 60 percent.</w:t>
+      </w:r>
+    </w:p>
+    <w:p>
+      <w:pPr>
+        <w:spacing w:before="80" w:after="80"/>
+      </w:pPr>
+      <w:r>
+        <w:rPr>
+          <w:sz w:val="22"/>
+        </w:rPr>
+        <w:t>[Point to the note at the bottom.]</w:t>
+      </w:r>
+    </w:p>
+    <w:p>
+      <w:pPr>
+        <w:spacing w:before="80" w:after="80"/>
+      </w:pPr>
+      <w:r>
+        <w:rPr>
+          <w:sz w:val="22"/>
+        </w:rPr>
+        <w:t>Important scope note: plus 6.5 percent is versus the vanilla bandit — not versus AlwaysRATED, not versus Static XGB. This measures the incremental value of targeted human oversight on top of the bandit baseline.</w:t>
+      </w:r>
+    </w:p>
+    <w:p>
+      <w:pPr>
+        <w:spacing w:before="80" w:after="80"/>
+      </w:pPr>
+      <w:r>
+        <w:rPr>
+          <w:sz w:val="22"/>
+        </w:rPr>
+        <w:t>Thirteen applicants reviewed per thousand. The actuary's judgment on those thirteen cases is worth a 6.5 percent gain on the whole portfolio. That is the value of the HITL layer.</w:t>
       </w:r>
     </w:p>
     <w:p/>
@@ -2710,7 +2567,7 @@
         <w:rPr>
           <w:color w:val="2E74B5"/>
         </w:rPr>
-        <w:t>SLIDE 31  ·  4 KEY FINDINGS</w:t>
+        <w:t>SLIDE 31  ·  WHAT DRIVES THE VALUE? (EXP-011 + EXP-015)</w:t>
       </w:r>
     </w:p>
     <w:p>
@@ -2723,7 +2580,7 @@
           <w:color w:val="707070"/>
           <w:sz w:val="18"/>
         </w:rPr>
-        <w:t>Timing: ~2.5 min</w:t>
+        <w:t>Timing: ~2 min</w:t>
       </w:r>
     </w:p>
     <w:p>
@@ -2734,7 +2591,7 @@
         <w:rPr>
           <w:sz w:val="22"/>
         </w:rPr>
-        <w:t>[Point to Finding 1.]</w:t>
+        <w:t>[Point to the left ablation panel.]</w:t>
       </w:r>
     </w:p>
     <w:p>
@@ -2745,7 +2602,7 @@
         <w:rPr>
           <w:sz w:val="22"/>
         </w:rPr>
-        <w:t>Finding 1 — EXP-005: Online adaptation beats static rules. Plus 25.2 percent, p less than 0.001, d equals 2.98. LinUCB earns plus $18,248 over Static XGB across 20 seeds.</w:t>
+        <w:t>EXP-011 tells us the exploration bonus is not what drives the value — Greedy-only ties full LinUCB. The value comes from online ridge updating. EXP-015 tells us that even under drift, the constant beats us. These two findings together define the boundary of what this thesis can and cannot claim.</w:t>
       </w:r>
     </w:p>
     <w:p>
@@ -2756,7 +2613,7 @@
         <w:rPr>
           <w:sz w:val="22"/>
         </w:rPr>
-        <w:t>[Point to Finding 2.]</w:t>
+        <w:t>On the left: EXP-011. Full LinUCB versus Greedy-only with alpha equals zero. p equals 0.580, d equals 0.13 — statistically tied. Exploration is not load-bearing.</w:t>
       </w:r>
     </w:p>
     <w:p>
@@ -2767,7 +2624,7 @@
         <w:rPr>
           <w:sz w:val="22"/>
         </w:rPr>
-        <w:t>Finding 2 — EXP-006: No demographic bias introduced. 85.72 and 90.12 percent parity for region and occupation. PSI GREEN-AMBER throughout. Criterion 6 FAILED-with-interpretation — occupation is an actuarially valid signal, not a bias.</w:t>
+        <w:t>But Greedy-only versus Static XGB: plus $18,969, p less than 0.001, d equals 3.01. Online ridge updating IS the mechanism. The bandit beats Static XGB not because of its UCB exploration bonus but because it updates its ridge estimator from every new applicant.</w:t>
       </w:r>
     </w:p>
     <w:p>
@@ -2778,7 +2635,7 @@
         <w:rPr>
           <w:sz w:val="22"/>
         </w:rPr>
-        <w:t>[Point to Finding 3.]</w:t>
+        <w:t>[Point to the right drift panel.]</w:t>
       </w:r>
     </w:p>
     <w:p>
@@ -2789,7 +2646,7 @@
         <w:rPr>
           <w:sz w:val="22"/>
         </w:rPr>
-        <w:t>Finding 3 — EXP-011: The mechanism is online ridge updating, not exploration. Greedy-only ties full LinUCB. The value comes from learning, not from exploration bonuses.</w:t>
+        <w:t>On the right: EXP-015. Under a realistic drift shock, AlwaysRATED earns $99,321. LinTS earns $71,429 — minus 39 percent. LinUCB earns $71,373 — minus 39.2 percent. The discounted LinUCB with gamma of 0.999 earns $70,995 — no meaningful improvement.</w:t>
       </w:r>
     </w:p>
     <w:p>
@@ -2800,29 +2657,7 @@
         <w:rPr>
           <w:sz w:val="22"/>
         </w:rPr>
-        <w:t>[Point to Finding 4.]</w:t>
-      </w:r>
-    </w:p>
-    <w:p>
-      <w:pPr>
-        <w:spacing w:before="80" w:after="80"/>
-      </w:pPr>
-      <w:r>
-        <w:rPr>
-          <w:sz w:val="22"/>
-        </w:rPr>
-        <w:t>Finding 4 — EXP-008: HITL adds value at low cost. Plus 6.5 percent at 1.5 percent review rate. Alignment score 60 percent — human oversight is meaningful.</w:t>
-      </w:r>
-    </w:p>
-    <w:p>
-      <w:pPr>
-        <w:spacing w:before="80" w:after="80"/>
-      </w:pPr>
-      <w:r>
-        <w:rPr>
-          <w:sz w:val="22"/>
-        </w:rPr>
-        <w:t>In 2023, the static system issued DECLINE. Sophea left without coverage. In 2026, the bandit issues STANDARD premium — the correct actuarial answer. That is the 25.2%. It is not everything — a trivial constant earns more. But it is a principled, fair, auditable step forward for an insurance market that needs one.</w:t>
+        <w:t>Non-stationarity does not rescue the bandit. We honestly report this as a boundary of the current framework.</w:t>
       </w:r>
     </w:p>
     <w:p/>
@@ -2834,7 +2669,7 @@
         <w:rPr>
           <w:color w:val="2E74B5"/>
         </w:rPr>
-        <w:t>SLIDE 32  ·  LIMITATIONS</w:t>
+        <w:t>SLIDE 32  ·  COLD START &amp; REGRET BOUND (EXP-010 + EXP-013)</w:t>
       </w:r>
     </w:p>
     <w:p>
@@ -2858,7 +2693,7 @@
         <w:rPr>
           <w:sz w:val="22"/>
         </w:rPr>
-        <w:t>I want to be transparent about the boundaries of this work.</w:t>
+        <w:t>[Point to the cold start table on the left.]</w:t>
       </w:r>
     </w:p>
     <w:p>
@@ -2869,7 +2704,7 @@
         <w:rPr>
           <w:sz w:val="22"/>
         </w:rPr>
-        <w:t>[Point to the four limitation cards.]</w:t>
+        <w:t>EXP-010 asks: at what horizon does the bandit certify its superiority? This matters because a real insurer cannot wait 5,000 applicants before trusting the system.</w:t>
       </w:r>
     </w:p>
     <w:p>
@@ -2880,7 +2715,7 @@
         <w:rPr>
           <w:sz w:val="22"/>
         </w:rPr>
-        <w:t>First: synthetic data. 2,000 records cannot capture rare comorbidities, fraud patterns, or the full complexity of real Cambodian claims. The dataset is CDHS-anchored but not real insurance claims.</w:t>
+        <w:t>At T equals 200, FreshXGB leads bandits by 2.1 times. At T equals 500, still 1.26 times. At T equals 1,000, the systems tie. At T equals 2,000, bandits cross over and take the lead.</w:t>
       </w:r>
     </w:p>
     <w:p>
@@ -2891,7 +2726,7 @@
         <w:rPr>
           <w:sz w:val="22"/>
         </w:rPr>
-        <w:t>Second: single-period rewards. The reward function is a one-shot proxy for profitability. It does not capture multi-year claims, customer retention, or renewal cycles.</w:t>
+        <w:t>Operational implication: warm-start required for the first 1,000 to 2,000 applications. A hybrid deployment — XGBoost until crossover, bandit thereafter — is the practical path.</w:t>
       </w:r>
     </w:p>
     <w:p>
@@ -2902,7 +2737,7 @@
         <w:rPr>
           <w:sz w:val="22"/>
         </w:rPr>
-        <w:t>Third: stationarity assumption. EXP-009 and EXP-015 partially address this, but DiscountedLinUCB helps only marginally under a shock. Non-stationarity remains a meaningful limit of the current design.</w:t>
+        <w:t>LinTS passes the T equals 2,000 Wilcoxon test with p equals 0.0039. LinUCB draws level but is not certified — p equals 0.0840. I report LinUCB honestly as draws-level, not a proven win at 2,000.</w:t>
       </w:r>
     </w:p>
     <w:p>
@@ -2913,7 +2748,18 @@
         <w:rPr>
           <w:sz w:val="22"/>
         </w:rPr>
-        <w:t>Fourth: the constant-policy ceiling. AlwaysRATED beats bandits by roughly 30 percent. Bandits lead every admissible deployable alternative — but the headroom to Oracle remains large. This is honestly reported and defines the next phase of work.</w:t>
+        <w:t>[Point to the regret bound panel on the right.]</w:t>
+      </w:r>
+    </w:p>
+    <w:p>
+      <w:pPr>
+        <w:spacing w:before="80" w:after="80"/>
+      </w:pPr>
+      <w:r>
+        <w:rPr>
+          <w:sz w:val="22"/>
+        </w:rPr>
+        <w:t>EXP-013: log-log slope 0.572, theory 0.5 — near-optimal. R-squared 0.9915. Sublinear regret confirmed empirically.</w:t>
       </w:r>
     </w:p>
     <w:p/>
@@ -2925,7 +2771,7 @@
         <w:rPr>
           <w:color w:val="2E74B5"/>
         </w:rPr>
-        <w:t>SLIDE 33  ·  FUTURE WORK</w:t>
+        <w:t>SLIDE 33  ·  LIVE DEMONSTRATION</w:t>
       </w:r>
     </w:p>
     <w:p>
@@ -2938,6 +2784,392 @@
           <w:color w:val="707070"/>
           <w:sz w:val="18"/>
         </w:rPr>
+        <w:t>Timing: ~3 min</w:t>
+      </w:r>
+    </w:p>
+    <w:p>
+      <w:pPr>
+        <w:spacing w:before="80" w:after="80"/>
+      </w:pPr>
+      <w:r>
+        <w:rPr>
+          <w:sz w:val="22"/>
+        </w:rPr>
+        <w:t>[Open browser at localhost:8000 before this slide.]</w:t>
+      </w:r>
+    </w:p>
+    <w:p>
+      <w:pPr>
+        <w:spacing w:before="80" w:after="80"/>
+      </w:pPr>
+      <w:r>
+        <w:rPr>
+          <w:sz w:val="22"/>
+        </w:rPr>
+        <w:t>I will now show you Sophea's application — not as a number in a table, but as a live interaction with the prototype dashboard.</w:t>
+      </w:r>
+    </w:p>
+    <w:p>
+      <w:pPr>
+        <w:spacing w:before="80" w:after="80"/>
+      </w:pPr>
+      <w:r>
+        <w:rPr>
+          <w:sz w:val="22"/>
+        </w:rPr>
+        <w:t>[Enter Sophea's profile: age 42, female, BMI 24.1, smoker: no, hypertension: yes, Kampong Cham, agriculture.]</w:t>
+      </w:r>
+    </w:p>
+    <w:p>
+      <w:pPr>
+        <w:spacing w:before="80" w:after="80"/>
+      </w:pPr>
+      <w:r>
+        <w:rPr>
+          <w:sz w:val="22"/>
+        </w:rPr>
+        <w:t>Enter Sophea's profile live — show STANDARD decision. Age 42, female, BMI 24.1, non-smoker, hypertension managed, Kampong Cham, agriculture. The bandit sees her 34 features, computes the arm scores, and issues its decision.</w:t>
+      </w:r>
+    </w:p>
+    <w:p>
+      <w:pPr>
+        <w:spacing w:before="80" w:after="80"/>
+      </w:pPr>
+      <w:r>
+        <w:rPr>
+          <w:sz w:val="22"/>
+        </w:rPr>
+        <w:t>[Show the STANDARD decision.]</w:t>
+      </w:r>
+    </w:p>
+    <w:p>
+      <w:pPr>
+        <w:spacing w:before="80" w:after="80"/>
+      </w:pPr>
+      <w:r>
+        <w:rPr>
+          <w:sz w:val="22"/>
+        </w:rPr>
+        <w:t>STANDARD premium. The correct actuarial answer. The one she was denied in 2023.</w:t>
+      </w:r>
+    </w:p>
+    <w:p>
+      <w:pPr>
+        <w:spacing w:before="80" w:after="80"/>
+      </w:pPr>
+      <w:r>
+        <w:rPr>
+          <w:sz w:val="22"/>
+        </w:rPr>
+        <w:t>[Submit a high-risk applicant — older, smoker, high BMI, multiple flags.]</w:t>
+      </w:r>
+    </w:p>
+    <w:p>
+      <w:pPr>
+        <w:spacing w:before="80" w:after="80"/>
+      </w:pPr>
+      <w:r>
+        <w:rPr>
+          <w:sz w:val="22"/>
+        </w:rPr>
+        <w:t>Now a higher-risk applicant. The system selects REFER — escalating to the HITL queue. Switch to the HITL tab to show the running referral rate and cumulative review cost.</w:t>
+      </w:r>
+    </w:p>
+    <w:p>
+      <w:pPr>
+        <w:spacing w:before="80" w:after="80"/>
+      </w:pPr>
+      <w:r>
+        <w:rPr>
+          <w:sz w:val="22"/>
+        </w:rPr>
+        <w:t>[This is the FastAPI prototype deployed on Render — not a mockup.]</w:t>
+      </w:r>
+    </w:p>
+    <w:p>
+      <w:pPr>
+        <w:spacing w:before="80" w:after="80"/>
+      </w:pPr>
+      <w:r>
+        <w:rPr>
+          <w:sz w:val="22"/>
+        </w:rPr>
+        <w:t>This is not a simulation. This is the same FastAPI stack described in the thesis, deployed on Render, running in real time.</w:t>
+      </w:r>
+    </w:p>
+    <w:p/>
+    <w:p>
+      <w:pPr>
+        <w:pStyle w:val="Heading2"/>
+      </w:pPr>
+      <w:r>
+        <w:rPr>
+          <w:color w:val="2E74B5"/>
+        </w:rPr>
+        <w:t>SLIDE 34  ·  SECTION DIVIDER — Conclusion &amp; Future Work</w:t>
+      </w:r>
+    </w:p>
+    <w:p>
+      <w:pPr>
+        <w:spacing w:before="0" w:after="80"/>
+      </w:pPr>
+      <w:r>
+        <w:rPr>
+          <w:i/>
+          <w:color w:val="707070"/>
+          <w:sz w:val="18"/>
+        </w:rPr>
+        <w:t>Timing: ~5 sec</w:t>
+      </w:r>
+    </w:p>
+    <w:p>
+      <w:pPr>
+        <w:spacing w:before="80" w:after="80"/>
+      </w:pPr>
+      <w:r>
+        <w:rPr>
+          <w:sz w:val="22"/>
+        </w:rPr>
+        <w:t>Let me bring this back to Sophea — and to the four key findings.</w:t>
+      </w:r>
+    </w:p>
+    <w:p/>
+    <w:p>
+      <w:pPr>
+        <w:pStyle w:val="Heading2"/>
+      </w:pPr>
+      <w:r>
+        <w:rPr>
+          <w:color w:val="2E74B5"/>
+        </w:rPr>
+        <w:t>SLIDE 35  ·  4 KEY FINDINGS</w:t>
+      </w:r>
+    </w:p>
+    <w:p>
+      <w:pPr>
+        <w:spacing w:before="0" w:after="80"/>
+      </w:pPr>
+      <w:r>
+        <w:rPr>
+          <w:i/>
+          <w:color w:val="707070"/>
+          <w:sz w:val="18"/>
+        </w:rPr>
+        <w:t>Timing: ~2.5 min</w:t>
+      </w:r>
+    </w:p>
+    <w:p>
+      <w:pPr>
+        <w:spacing w:before="80" w:after="80"/>
+      </w:pPr>
+      <w:r>
+        <w:rPr>
+          <w:sz w:val="22"/>
+        </w:rPr>
+        <w:t>[Point to Finding 1.]</w:t>
+      </w:r>
+    </w:p>
+    <w:p>
+      <w:pPr>
+        <w:spacing w:before="80" w:after="80"/>
+      </w:pPr>
+      <w:r>
+        <w:rPr>
+          <w:sz w:val="22"/>
+        </w:rPr>
+        <w:t>Finding 1 — EXP-005: Online adaptation beats static rules. Plus 25.2 percent, p less than 0.001, d equals 2.98. LinUCB earns plus $18,248 over Static XGB across 20 seeds.</w:t>
+      </w:r>
+    </w:p>
+    <w:p>
+      <w:pPr>
+        <w:spacing w:before="80" w:after="80"/>
+      </w:pPr>
+      <w:r>
+        <w:rPr>
+          <w:sz w:val="22"/>
+        </w:rPr>
+        <w:t>[Point to Finding 2.]</w:t>
+      </w:r>
+    </w:p>
+    <w:p>
+      <w:pPr>
+        <w:spacing w:before="80" w:after="80"/>
+      </w:pPr>
+      <w:r>
+        <w:rPr>
+          <w:sz w:val="22"/>
+        </w:rPr>
+        <w:t>Finding 2 — EXP-006: No demographic bias introduced. 85.72 and 90.12 percent parity for region and occupation. PSI GREEN-AMBER throughout. Criterion 6 FAILED-with-interpretation — occupation is an actuarially valid signal, not a bias.</w:t>
+      </w:r>
+    </w:p>
+    <w:p>
+      <w:pPr>
+        <w:spacing w:before="80" w:after="80"/>
+      </w:pPr>
+      <w:r>
+        <w:rPr>
+          <w:sz w:val="22"/>
+        </w:rPr>
+        <w:t>[Point to Finding 3.]</w:t>
+      </w:r>
+    </w:p>
+    <w:p>
+      <w:pPr>
+        <w:spacing w:before="80" w:after="80"/>
+      </w:pPr>
+      <w:r>
+        <w:rPr>
+          <w:sz w:val="22"/>
+        </w:rPr>
+        <w:t>Finding 3 — EXP-011: The mechanism is online ridge updating, not exploration. Greedy-only ties full LinUCB. The value comes from learning, not from exploration bonuses.</w:t>
+      </w:r>
+    </w:p>
+    <w:p>
+      <w:pPr>
+        <w:spacing w:before="80" w:after="80"/>
+      </w:pPr>
+      <w:r>
+        <w:rPr>
+          <w:sz w:val="22"/>
+        </w:rPr>
+        <w:t>[Point to Finding 4.]</w:t>
+      </w:r>
+    </w:p>
+    <w:p>
+      <w:pPr>
+        <w:spacing w:before="80" w:after="80"/>
+      </w:pPr>
+      <w:r>
+        <w:rPr>
+          <w:sz w:val="22"/>
+        </w:rPr>
+        <w:t>Finding 4 — EXP-008: HITL adds value at low cost. Plus 6.5 percent at 1.5 percent review rate. Alignment score 60 percent — human oversight is meaningful.</w:t>
+      </w:r>
+    </w:p>
+    <w:p>
+      <w:pPr>
+        <w:spacing w:before="80" w:after="80"/>
+      </w:pPr>
+      <w:r>
+        <w:rPr>
+          <w:sz w:val="22"/>
+        </w:rPr>
+        <w:t>In 2023, the static system issued DECLINE. Sophea left without coverage. In 2026, the bandit issues STANDARD premium — the correct actuarial answer. That is the 25.2%. It is not everything — a trivial constant earns more. But it is a principled, fair, auditable step forward for an insurance market that needs one.</w:t>
+      </w:r>
+    </w:p>
+    <w:p/>
+    <w:p>
+      <w:pPr>
+        <w:pStyle w:val="Heading2"/>
+      </w:pPr>
+      <w:r>
+        <w:rPr>
+          <w:color w:val="2E74B5"/>
+        </w:rPr>
+        <w:t>SLIDE 36  ·  LIMITATIONS</w:t>
+      </w:r>
+    </w:p>
+    <w:p>
+      <w:pPr>
+        <w:spacing w:before="0" w:after="80"/>
+      </w:pPr>
+      <w:r>
+        <w:rPr>
+          <w:i/>
+          <w:color w:val="707070"/>
+          <w:sz w:val="18"/>
+        </w:rPr>
+        <w:t>Timing: ~1.5 min</w:t>
+      </w:r>
+    </w:p>
+    <w:p>
+      <w:pPr>
+        <w:spacing w:before="80" w:after="80"/>
+      </w:pPr>
+      <w:r>
+        <w:rPr>
+          <w:sz w:val="22"/>
+        </w:rPr>
+        <w:t>I want to be transparent about the boundaries of this work.</w:t>
+      </w:r>
+    </w:p>
+    <w:p>
+      <w:pPr>
+        <w:spacing w:before="80" w:after="80"/>
+      </w:pPr>
+      <w:r>
+        <w:rPr>
+          <w:sz w:val="22"/>
+        </w:rPr>
+        <w:t>[Point to the four limitation cards.]</w:t>
+      </w:r>
+    </w:p>
+    <w:p>
+      <w:pPr>
+        <w:spacing w:before="80" w:after="80"/>
+      </w:pPr>
+      <w:r>
+        <w:rPr>
+          <w:sz w:val="22"/>
+        </w:rPr>
+        <w:t>First: synthetic data. 2,000 records cannot capture rare comorbidities, fraud patterns, or the full complexity of real Cambodian claims. The dataset is CDHS-anchored but not real insurance claims.</w:t>
+      </w:r>
+    </w:p>
+    <w:p>
+      <w:pPr>
+        <w:spacing w:before="80" w:after="80"/>
+      </w:pPr>
+      <w:r>
+        <w:rPr>
+          <w:sz w:val="22"/>
+        </w:rPr>
+        <w:t>Second: single-period rewards. The reward function is a one-shot proxy for profitability. It does not capture multi-year claims, customer retention, or renewal cycles.</w:t>
+      </w:r>
+    </w:p>
+    <w:p>
+      <w:pPr>
+        <w:spacing w:before="80" w:after="80"/>
+      </w:pPr>
+      <w:r>
+        <w:rPr>
+          <w:sz w:val="22"/>
+        </w:rPr>
+        <w:t>Third: stationarity assumption. EXP-009 and EXP-015 partially address this, but DiscountedLinUCB helps only marginally under a shock. Non-stationarity remains a meaningful limit of the current design.</w:t>
+      </w:r>
+    </w:p>
+    <w:p>
+      <w:pPr>
+        <w:spacing w:before="80" w:after="80"/>
+      </w:pPr>
+      <w:r>
+        <w:rPr>
+          <w:sz w:val="22"/>
+        </w:rPr>
+        <w:t>Fourth: the constant-policy ceiling. AlwaysRATED beats bandits by roughly 30 percent. Bandits lead every admissible deployable alternative — but the headroom to Oracle remains large. This is honestly reported and defines the next phase of work.</w:t>
+      </w:r>
+    </w:p>
+    <w:p/>
+    <w:p>
+      <w:pPr>
+        <w:pStyle w:val="Heading2"/>
+      </w:pPr>
+      <w:r>
+        <w:rPr>
+          <w:color w:val="2E74B5"/>
+        </w:rPr>
+        <w:t>SLIDE 37  ·  FUTURE WORK</w:t>
+      </w:r>
+    </w:p>
+    <w:p>
+      <w:pPr>
+        <w:spacing w:before="0" w:after="80"/>
+      </w:pPr>
+      <w:r>
+        <w:rPr>
+          <w:i/>
+          <w:color w:val="707070"/>
+          <w:sz w:val="18"/>
+        </w:rPr>
         <w:t>Timing: ~1 min</w:t>
       </w:r>
     </w:p>
@@ -3005,7 +3237,7 @@
         <w:rPr>
           <w:color w:val="2E74B5"/>
         </w:rPr>
-        <w:t>SLIDE 34  ·  THANK YOU / Q&amp;A</w:t>
+        <w:t>SLIDE 38  ·  THANK YOU / Q&amp;A</w:t>
       </w:r>
     </w:p>
     <w:p>

</xml_diff>

<commit_message>
feat(defense): re-sync 44-slide index + Sophea narrative tone polish
Carries forward prior uncommitted transition-sentence rewrite and
Appendix A6 (train/test-split explainer) already in the working tree.
Adds sharper narrative hooks/closers to slides 1, 3, 5, 6, 13, 20, 28,
35, 38 while preserving every stat, p-value, PSI value, and honesty
caveat verbatim. Regenerates Poly_defense_script_v2.docx and injects
updated speaker notes into Poly_defense_presentation_v3.pptx.

Co-Authored-By: Claude Sonnet 5 <noreply@anthropic.com>
</commit_message>
<xml_diff>
--- a/thesis/health_rl/Poly_defense_script_v2.docx
+++ b/thesis/health_rl/Poly_defense_script_v2.docx
@@ -41,7 +41,7 @@
         </w:rPr>
         <w:t>HOW TO USE THIS SCRIPT</w:t>
         <w:br/>
-        <w:t>Read aloud naturally — do not recite word-for-word if it feels unnatural. Bracketed notes [like this] are stage directions, not spoken text. The Sophea narrative beats are highlighted throughout — these are the emotional anchors of the presentation. Appendix slides A1–A5 are on standby; only advance to them if the Committee asks a question that slide addresses.</w:t>
+        <w:t>Read aloud naturally — do not recite word-for-word if it feels unnatural. Bracketed notes [like this] are stage directions, not spoken text. The Sophea narrative beats are highlighted throughout — these are the emotional anchors of the presentation. Appendix slides A1–A6 are on standby; only advance to them if the Committee asks a question that slide addresses.</w:t>
       </w:r>
     </w:p>
     <w:p>
@@ -75,13 +75,52 @@
     </w:p>
     <w:p>
       <w:pPr>
+        <w:jc w:val="center"/>
+      </w:pPr>
+      <w:r>
+        <w:drawing>
+          <wp:inline xmlns:a="http://schemas.openxmlformats.org/drawingml/2006/main" xmlns:pic="http://schemas.openxmlformats.org/drawingml/2006/picture">
+            <wp:extent cx="5040000" cy="2835000"/>
+            <wp:docPr id="1" name="Picture 1"/>
+            <wp:cNvGraphicFramePr>
+              <a:graphicFrameLocks noChangeAspect="1"/>
+            </wp:cNvGraphicFramePr>
+            <a:graphic>
+              <a:graphicData uri="http://schemas.openxmlformats.org/drawingml/2006/picture">
+                <pic:pic>
+                  <pic:nvPicPr>
+                    <pic:cNvPr id="0" name="slide_001.png"/>
+                    <pic:cNvPicPr/>
+                  </pic:nvPicPr>
+                  <pic:blipFill>
+                    <a:blip r:embed="rId9"/>
+                    <a:stretch>
+                      <a:fillRect/>
+                    </a:stretch>
+                  </pic:blipFill>
+                  <pic:spPr>
+                    <a:xfrm>
+                      <a:off x="0" y="0"/>
+                      <a:ext cx="5040000" cy="2835000"/>
+                    </a:xfrm>
+                    <a:prstGeom prst="rect"/>
+                  </pic:spPr>
+                </pic:pic>
+              </a:graphicData>
+            </a:graphic>
+          </wp:inline>
+        </w:drawing>
+      </w:r>
+    </w:p>
+    <w:p>
+      <w:pPr>
         <w:spacing w:before="80" w:after="80"/>
       </w:pPr>
       <w:r>
         <w:rPr>
           <w:sz w:val="22"/>
         </w:rPr>
-        <w:t>Good morning, Distinguished Committee. I am Lun Chanpoly, and I am here to defend my master's thesis — Adaptive Health Insurance Underwriting via Contextual Bandits: A Reinforcement Learning Approach for Cambodia.</w:t>
+        <w:t>Good morning, Distinguished Committee. I am Lun Chanpoly, and I am here to defend my master's thesis — Adaptive Health Insurance Underwriting via Contextual Bandits: A Reinforcement Learning Approach for Cambodia — a project born from my internship at Decent Actuarial Consultants in Phnom Penh, from March to June 2026, under the supervision of Dr. Has Sothea and the guidance of Mr. ON Radet at DAC.</w:t>
       </w:r>
     </w:p>
     <w:p>
@@ -92,7 +131,7 @@
         <w:rPr>
           <w:sz w:val="22"/>
         </w:rPr>
-        <w:t>This work was carried out during my internship at Decent Actuarial Consultants in Phnom Penh, from March to June 2026, under the supervision of Dr. Has Sothea and the guidance of Mr. ON Radet at DAC.</w:t>
+        <w:t>This research was driven by a single, urgent question: how do we make underwriting in Cambodia not just faster, but fundamentally smarter and more inclusive? By the end of this presentation, I hope to show you that we have a rigorous, honest, and practically useful answer.</w:t>
       </w:r>
     </w:p>
     <w:p>
@@ -103,7 +142,7 @@
         <w:rPr>
           <w:sz w:val="22"/>
         </w:rPr>
-        <w:t>I hope by the end of this presentation, I can convince you that the question I was given — how do we make underwriting smarter for Cambodia — has a rigorous, honest, and practically useful answer.</w:t>
+        <w:t>But first, let me tell you about a person named Sophea.</w:t>
       </w:r>
     </w:p>
     <w:p/>
@@ -133,6 +172,45 @@
     </w:p>
     <w:p>
       <w:pPr>
+        <w:jc w:val="center"/>
+      </w:pPr>
+      <w:r>
+        <w:drawing>
+          <wp:inline xmlns:a="http://schemas.openxmlformats.org/drawingml/2006/main" xmlns:pic="http://schemas.openxmlformats.org/drawingml/2006/picture">
+            <wp:extent cx="5040000" cy="2835000"/>
+            <wp:docPr id="2" name="Picture 2"/>
+            <wp:cNvGraphicFramePr>
+              <a:graphicFrameLocks noChangeAspect="1"/>
+            </wp:cNvGraphicFramePr>
+            <a:graphic>
+              <a:graphicData uri="http://schemas.openxmlformats.org/drawingml/2006/picture">
+                <pic:pic>
+                  <pic:nvPicPr>
+                    <pic:cNvPr id="0" name="slide_002.png"/>
+                    <pic:cNvPicPr/>
+                  </pic:nvPicPr>
+                  <pic:blipFill>
+                    <a:blip r:embed="rId10"/>
+                    <a:stretch>
+                      <a:fillRect/>
+                    </a:stretch>
+                  </pic:blipFill>
+                  <pic:spPr>
+                    <a:xfrm>
+                      <a:off x="0" y="0"/>
+                      <a:ext cx="5040000" cy="2835000"/>
+                    </a:xfrm>
+                    <a:prstGeom prst="rect"/>
+                  </pic:spPr>
+                </pic:pic>
+              </a:graphicData>
+            </a:graphic>
+          </wp:inline>
+        </w:drawing>
+      </w:r>
+    </w:p>
+    <w:p>
+      <w:pPr>
         <w:spacing w:before="80" w:after="80"/>
       </w:pPr>
       <w:r>
@@ -151,6 +229,17 @@
           <w:sz w:val="22"/>
         </w:rPr>
         <w:t>I also have five technical appendix slides available if the Committee wishes to go deeper on any specific point.</w:t>
+      </w:r>
+    </w:p>
+    <w:p>
+      <w:pPr>
+        <w:spacing w:before="80" w:after="80"/>
+      </w:pPr>
+      <w:r>
+        <w:rPr>
+          <w:sz w:val="22"/>
+        </w:rPr>
+        <w:t>Let me start with the person at the center of this problem.</w:t>
       </w:r>
     </w:p>
     <w:p/>
@@ -180,6 +269,45 @@
     </w:p>
     <w:p>
       <w:pPr>
+        <w:jc w:val="center"/>
+      </w:pPr>
+      <w:r>
+        <w:drawing>
+          <wp:inline xmlns:a="http://schemas.openxmlformats.org/drawingml/2006/main" xmlns:pic="http://schemas.openxmlformats.org/drawingml/2006/picture">
+            <wp:extent cx="5040000" cy="2835000"/>
+            <wp:docPr id="3" name="Picture 3"/>
+            <wp:cNvGraphicFramePr>
+              <a:graphicFrameLocks noChangeAspect="1"/>
+            </wp:cNvGraphicFramePr>
+            <a:graphic>
+              <a:graphicData uri="http://schemas.openxmlformats.org/drawingml/2006/picture">
+                <pic:pic>
+                  <pic:nvPicPr>
+                    <pic:cNvPr id="0" name="slide_003.png"/>
+                    <pic:cNvPicPr/>
+                  </pic:nvPicPr>
+                  <pic:blipFill>
+                    <a:blip r:embed="rId11"/>
+                    <a:stretch>
+                      <a:fillRect/>
+                    </a:stretch>
+                  </pic:blipFill>
+                  <pic:spPr>
+                    <a:xfrm>
+                      <a:off x="0" y="0"/>
+                      <a:ext cx="5040000" cy="2835000"/>
+                    </a:xfrm>
+                    <a:prstGeom prst="rect"/>
+                  </pic:spPr>
+                </pic:pic>
+              </a:graphicData>
+            </a:graphic>
+          </wp:inline>
+        </w:drawing>
+      </w:r>
+    </w:p>
+    <w:p>
+      <w:pPr>
         <w:spacing w:before="80" w:after="80"/>
       </w:pPr>
       <w:r>
@@ -197,7 +325,7 @@
         <w:rPr>
           <w:sz w:val="22"/>
         </w:rPr>
-        <w:t>I would like to introduce you to Sophea. You can see her profile here on the left: 42 years old, rice farmer from Kampong Cham Province. BMI 24.1 — normal range. Non-smoker. High physical activity from field farming. One clinical flag: managed hypertension.</w:t>
+        <w:t>This is Sophea. You can see her profile here on the left: 42 years old, a rice farmer from Kampong Cham Province. She is active — high physical activity from field farming — a non-smoker, with a BMI of 24.1, well within the normal range. Her only health flag: managed hypertension.</w:t>
       </w:r>
     </w:p>
     <w:p>
@@ -252,7 +380,7 @@
         <w:rPr>
           <w:sz w:val="22"/>
         </w:rPr>
-        <w:t>Was that the right answer? This research begins with that question.</w:t>
+        <w:t>But I have to ask: was that the right answer? This research is my attempt to answer that question — not with intuition, but with a system that learns. To pursue it rigorously, I joined the organization that works with decisions like this every day.</w:t>
       </w:r>
     </w:p>
     <w:p/>
@@ -282,6 +410,45 @@
     </w:p>
     <w:p>
       <w:pPr>
+        <w:jc w:val="center"/>
+      </w:pPr>
+      <w:r>
+        <w:drawing>
+          <wp:inline xmlns:a="http://schemas.openxmlformats.org/drawingml/2006/main" xmlns:pic="http://schemas.openxmlformats.org/drawingml/2006/picture">
+            <wp:extent cx="5040000" cy="2835000"/>
+            <wp:docPr id="4" name="Picture 4"/>
+            <wp:cNvGraphicFramePr>
+              <a:graphicFrameLocks noChangeAspect="1"/>
+            </wp:cNvGraphicFramePr>
+            <a:graphic>
+              <a:graphicData uri="http://schemas.openxmlformats.org/drawingml/2006/picture">
+                <pic:pic>
+                  <pic:nvPicPr>
+                    <pic:cNvPr id="0" name="slide_004.png"/>
+                    <pic:cNvPicPr/>
+                  </pic:nvPicPr>
+                  <pic:blipFill>
+                    <a:blip r:embed="rId12"/>
+                    <a:stretch>
+                      <a:fillRect/>
+                    </a:stretch>
+                  </pic:blipFill>
+                  <pic:spPr>
+                    <a:xfrm>
+                      <a:off x="0" y="0"/>
+                      <a:ext cx="5040000" cy="2835000"/>
+                    </a:xfrm>
+                    <a:prstGeom prst="rect"/>
+                  </pic:spPr>
+                </pic:pic>
+              </a:graphicData>
+            </a:graphic>
+          </wp:inline>
+        </w:drawing>
+      </w:r>
+    </w:p>
+    <w:p>
+      <w:pPr>
         <w:spacing w:before="80" w:after="80"/>
       </w:pPr>
       <w:r>
@@ -311,6 +478,17 @@
           <w:sz w:val="22"/>
         </w:rPr>
         <w:t>Their clients include some of the insurers who work with applicants like Sophea every day. Supervised by Mr. ON Radet, my task was to design and validate an adaptive underwriting system — and build a working prototype. The thesis and demonstration you will see today are the outputs of that internship.</w:t>
+      </w:r>
+    </w:p>
+    <w:p>
+      <w:pPr>
+        <w:spacing w:before="80" w:after="80"/>
+      </w:pPr>
+      <w:r>
+        <w:rPr>
+          <w:sz w:val="22"/>
+        </w:rPr>
+        <w:t>With that institutional context established, let me show you the market Sophea lives in — and why her situation is not exceptional.</w:t>
       </w:r>
     </w:p>
     <w:p/>
@@ -340,6 +518,45 @@
     </w:p>
     <w:p>
       <w:pPr>
+        <w:jc w:val="center"/>
+      </w:pPr>
+      <w:r>
+        <w:drawing>
+          <wp:inline xmlns:a="http://schemas.openxmlformats.org/drawingml/2006/main" xmlns:pic="http://schemas.openxmlformats.org/drawingml/2006/picture">
+            <wp:extent cx="5040000" cy="2835000"/>
+            <wp:docPr id="5" name="Picture 5"/>
+            <wp:cNvGraphicFramePr>
+              <a:graphicFrameLocks noChangeAspect="1"/>
+            </wp:cNvGraphicFramePr>
+            <a:graphic>
+              <a:graphicData uri="http://schemas.openxmlformats.org/drawingml/2006/picture">
+                <pic:pic>
+                  <pic:nvPicPr>
+                    <pic:cNvPr id="0" name="slide_005.png"/>
+                    <pic:cNvPicPr/>
+                  </pic:nvPicPr>
+                  <pic:blipFill>
+                    <a:blip r:embed="rId13"/>
+                    <a:stretch>
+                      <a:fillRect/>
+                    </a:stretch>
+                  </pic:blipFill>
+                  <pic:spPr>
+                    <a:xfrm>
+                      <a:off x="0" y="0"/>
+                      <a:ext cx="5040000" cy="2835000"/>
+                    </a:xfrm>
+                    <a:prstGeom prst="rect"/>
+                  </pic:spPr>
+                </pic:pic>
+              </a:graphicData>
+            </a:graphic>
+          </wp:inline>
+        </w:drawing>
+      </w:r>
+    </w:p>
+    <w:p>
+      <w:pPr>
         <w:spacing w:before="80" w:after="80"/>
       </w:pPr>
       <w:r>
@@ -357,7 +574,7 @@
         <w:rPr>
           <w:sz w:val="22"/>
         </w:rPr>
-        <w:t>This number — under two percent — is the estimated health insurance penetration in Cambodia in 2023. Not 10 percent. Not 20 percent. Under two percent of the population with private voluntary health coverage.</w:t>
+        <w:t>To understand why Sophea's case is the norm and not the exception, we have to look at the market she lives in. This number — under two percent — is the estimated health insurance penetration in Cambodia in 2023. Not 10 percent. Not 20 percent. Under two percent of the population with private voluntary health coverage.</w:t>
       </w:r>
     </w:p>
     <w:p>
@@ -368,7 +585,7 @@
         <w:rPr>
           <w:sz w:val="22"/>
         </w:rPr>
-        <w:t>The NSSF provides mandatory coverage, but only to formal-sector workers — roughly 16 percent of the population. Private underwriting is manual and rule-based. Agent networks consume 15 to 30 percent of premium revenue. And there is no demographic-parity monitoring in practice.</w:t>
+        <w:t>The NSSF provides mandatory coverage, but only to formal-sector workers — roughly 16 percent of the population. For the remaining majority — the 98 percent Sophea represents — the current system is not just inefficient, it is effectively invisible: manual and rule-based, with agent networks consuming 15 to 30 percent of premium revenue, and no demographic-parity monitoring in practice.</w:t>
       </w:r>
     </w:p>
     <w:p>
@@ -402,6 +619,17 @@
           <w:sz w:val="22"/>
         </w:rPr>
         <w:t>Sophea's situation is not an edge case — she is one of the 98 percent the current market was not built for.</w:t>
+      </w:r>
+    </w:p>
+    <w:p>
+      <w:pPr>
+        <w:spacing w:before="80" w:after="80"/>
+      </w:pPr>
+      <w:r>
+        <w:rPr>
+          <w:sz w:val="22"/>
+        </w:rPr>
+        <w:t>That gap points to four precise failure modes in the current system.</w:t>
       </w:r>
     </w:p>
     <w:p/>
@@ -431,13 +659,52 @@
     </w:p>
     <w:p>
       <w:pPr>
+        <w:jc w:val="center"/>
+      </w:pPr>
+      <w:r>
+        <w:drawing>
+          <wp:inline xmlns:a="http://schemas.openxmlformats.org/drawingml/2006/main" xmlns:pic="http://schemas.openxmlformats.org/drawingml/2006/picture">
+            <wp:extent cx="5040000" cy="2835000"/>
+            <wp:docPr id="6" name="Picture 6"/>
+            <wp:cNvGraphicFramePr>
+              <a:graphicFrameLocks noChangeAspect="1"/>
+            </wp:cNvGraphicFramePr>
+            <a:graphic>
+              <a:graphicData uri="http://schemas.openxmlformats.org/drawingml/2006/picture">
+                <pic:pic>
+                  <pic:nvPicPr>
+                    <pic:cNvPr id="0" name="slide_006.png"/>
+                    <pic:cNvPicPr/>
+                  </pic:nvPicPr>
+                  <pic:blipFill>
+                    <a:blip r:embed="rId14"/>
+                    <a:stretch>
+                      <a:fillRect/>
+                    </a:stretch>
+                  </pic:blipFill>
+                  <pic:spPr>
+                    <a:xfrm>
+                      <a:off x="0" y="0"/>
+                      <a:ext cx="5040000" cy="2835000"/>
+                    </a:xfrm>
+                    <a:prstGeom prst="rect"/>
+                  </pic:spPr>
+                </pic:pic>
+              </a:graphicData>
+            </a:graphic>
+          </wp:inline>
+        </w:drawing>
+      </w:r>
+    </w:p>
+    <w:p>
+      <w:pPr>
         <w:spacing w:before="80" w:after="80"/>
       </w:pPr>
       <w:r>
         <w:rPr>
           <w:sz w:val="22"/>
         </w:rPr>
-        <w:t>The static system that declined Sophea has four specific failure modes — each one visible in her case.</w:t>
+        <w:t>The static system that declined Sophea has four specific blind spots — each one visible in her case.</w:t>
       </w:r>
     </w:p>
     <w:p>
@@ -492,7 +759,18 @@
         <w:rPr>
           <w:sz w:val="22"/>
         </w:rPr>
-        <w:t>Each failure costs Sophea. Together, they define the problem.</w:t>
+        <w:t>Each blind spot costs Sophea something. Together, they define the problem this thesis sets out to solve.</w:t>
+      </w:r>
+    </w:p>
+    <w:p>
+      <w:pPr>
+        <w:spacing w:before="80" w:after="80"/>
+      </w:pPr>
+      <w:r>
+        <w:rPr>
+          <w:sz w:val="22"/>
+        </w:rPr>
+        <w:t>With the problem clearly stated, I formulated four research questions to guide exactly what I would measure.</w:t>
       </w:r>
     </w:p>
     <w:p/>
@@ -522,6 +800,45 @@
     </w:p>
     <w:p>
       <w:pPr>
+        <w:jc w:val="center"/>
+      </w:pPr>
+      <w:r>
+        <w:drawing>
+          <wp:inline xmlns:a="http://schemas.openxmlformats.org/drawingml/2006/main" xmlns:pic="http://schemas.openxmlformats.org/drawingml/2006/picture">
+            <wp:extent cx="5040000" cy="2835000"/>
+            <wp:docPr id="7" name="Picture 7"/>
+            <wp:cNvGraphicFramePr>
+              <a:graphicFrameLocks noChangeAspect="1"/>
+            </wp:cNvGraphicFramePr>
+            <a:graphic>
+              <a:graphicData uri="http://schemas.openxmlformats.org/drawingml/2006/picture">
+                <pic:pic>
+                  <pic:nvPicPr>
+                    <pic:cNvPr id="0" name="slide_007.png"/>
+                    <pic:cNvPicPr/>
+                  </pic:nvPicPr>
+                  <pic:blipFill>
+                    <a:blip r:embed="rId15"/>
+                    <a:stretch>
+                      <a:fillRect/>
+                    </a:stretch>
+                  </pic:blipFill>
+                  <pic:spPr>
+                    <a:xfrm>
+                      <a:off x="0" y="0"/>
+                      <a:ext cx="5040000" cy="2835000"/>
+                    </a:xfrm>
+                    <a:prstGeom prst="rect"/>
+                  </pic:spPr>
+                </pic:pic>
+              </a:graphicData>
+            </a:graphic>
+          </wp:inline>
+        </w:drawing>
+      </w:r>
+    </w:p>
+    <w:p>
+      <w:pPr>
         <w:spacing w:before="80" w:after="80"/>
       </w:pPr>
       <w:r>
@@ -584,6 +901,17 @@
           <w:sz w:val="22"/>
         </w:rPr>
         <w:t>All four questions have empirical answers in the results section. I will tell you which ones came back exactly as expected — and which ones did not.</w:t>
+      </w:r>
+    </w:p>
+    <w:p>
+      <w:pPr>
+        <w:spacing w:before="80" w:after="80"/>
+      </w:pPr>
+      <w:r>
+        <w:rPr>
+          <w:sz w:val="22"/>
+        </w:rPr>
+        <w:t>These questions translate directly into four deliverables and five measurable objectives.</w:t>
       </w:r>
     </w:p>
     <w:p/>
@@ -613,6 +941,45 @@
     </w:p>
     <w:p>
       <w:pPr>
+        <w:jc w:val="center"/>
+      </w:pPr>
+      <w:r>
+        <w:drawing>
+          <wp:inline xmlns:a="http://schemas.openxmlformats.org/drawingml/2006/main" xmlns:pic="http://schemas.openxmlformats.org/drawingml/2006/picture">
+            <wp:extent cx="5040000" cy="2835000"/>
+            <wp:docPr id="8" name="Picture 8"/>
+            <wp:cNvGraphicFramePr>
+              <a:graphicFrameLocks noChangeAspect="1"/>
+            </wp:cNvGraphicFramePr>
+            <a:graphic>
+              <a:graphicData uri="http://schemas.openxmlformats.org/drawingml/2006/picture">
+                <pic:pic>
+                  <pic:nvPicPr>
+                    <pic:cNvPr id="0" name="slide_008.png"/>
+                    <pic:cNvPicPr/>
+                  </pic:nvPicPr>
+                  <pic:blipFill>
+                    <a:blip r:embed="rId16"/>
+                    <a:stretch>
+                      <a:fillRect/>
+                    </a:stretch>
+                  </pic:blipFill>
+                  <pic:spPr>
+                    <a:xfrm>
+                      <a:off x="0" y="0"/>
+                      <a:ext cx="5040000" cy="2835000"/>
+                    </a:xfrm>
+                    <a:prstGeom prst="rect"/>
+                  </pic:spPr>
+                </pic:pic>
+              </a:graphicData>
+            </a:graphic>
+          </wp:inline>
+        </w:drawing>
+      </w:r>
+    </w:p>
+    <w:p>
+      <w:pPr>
         <w:spacing w:before="80" w:after="80"/>
       </w:pPr>
       <w:r>
@@ -686,6 +1053,17 @@
           <w:sz w:val="22"/>
         </w:rPr>
         <w:t>On the right — the five secondary objectives that map directly to the experiments I will describe in the results section.</w:t>
+      </w:r>
+    </w:p>
+    <w:p>
+      <w:pPr>
+        <w:spacing w:before="80" w:after="80"/>
+      </w:pPr>
+      <w:r>
+        <w:rPr>
+          <w:sz w:val="22"/>
+        </w:rPr>
+        <w:t>Before I describe what I built, let me briefly survey the research literature that shaped how I built it.</w:t>
       </w:r>
     </w:p>
     <w:p/>
@@ -715,6 +1093,45 @@
     </w:p>
     <w:p>
       <w:pPr>
+        <w:jc w:val="center"/>
+      </w:pPr>
+      <w:r>
+        <w:drawing>
+          <wp:inline xmlns:a="http://schemas.openxmlformats.org/drawingml/2006/main" xmlns:pic="http://schemas.openxmlformats.org/drawingml/2006/picture">
+            <wp:extent cx="5040000" cy="2835000"/>
+            <wp:docPr id="9" name="Picture 9"/>
+            <wp:cNvGraphicFramePr>
+              <a:graphicFrameLocks noChangeAspect="1"/>
+            </wp:cNvGraphicFramePr>
+            <a:graphic>
+              <a:graphicData uri="http://schemas.openxmlformats.org/drawingml/2006/picture">
+                <pic:pic>
+                  <pic:nvPicPr>
+                    <pic:cNvPr id="0" name="slide_009.png"/>
+                    <pic:cNvPicPr/>
+                  </pic:nvPicPr>
+                  <pic:blipFill>
+                    <a:blip r:embed="rId17"/>
+                    <a:stretch>
+                      <a:fillRect/>
+                    </a:stretch>
+                  </pic:blipFill>
+                  <pic:spPr>
+                    <a:xfrm>
+                      <a:off x="0" y="0"/>
+                      <a:ext cx="5040000" cy="2835000"/>
+                    </a:xfrm>
+                    <a:prstGeom prst="rect"/>
+                  </pic:spPr>
+                </pic:pic>
+              </a:graphicData>
+            </a:graphic>
+          </wp:inline>
+        </w:drawing>
+      </w:r>
+    </w:p>
+    <w:p>
+      <w:pPr>
         <w:spacing w:before="80" w:after="80"/>
       </w:pPr>
       <w:r>
@@ -751,6 +1168,45 @@
     </w:p>
     <w:p>
       <w:pPr>
+        <w:jc w:val="center"/>
+      </w:pPr>
+      <w:r>
+        <w:drawing>
+          <wp:inline xmlns:a="http://schemas.openxmlformats.org/drawingml/2006/main" xmlns:pic="http://schemas.openxmlformats.org/drawingml/2006/picture">
+            <wp:extent cx="5040000" cy="2835000"/>
+            <wp:docPr id="10" name="Picture 10"/>
+            <wp:cNvGraphicFramePr>
+              <a:graphicFrameLocks noChangeAspect="1"/>
+            </wp:cNvGraphicFramePr>
+            <a:graphic>
+              <a:graphicData uri="http://schemas.openxmlformats.org/drawingml/2006/picture">
+                <pic:pic>
+                  <pic:nvPicPr>
+                    <pic:cNvPr id="0" name="slide_010.png"/>
+                    <pic:cNvPicPr/>
+                  </pic:nvPicPr>
+                  <pic:blipFill>
+                    <a:blip r:embed="rId18"/>
+                    <a:stretch>
+                      <a:fillRect/>
+                    </a:stretch>
+                  </pic:blipFill>
+                  <pic:spPr>
+                    <a:xfrm>
+                      <a:off x="0" y="0"/>
+                      <a:ext cx="5040000" cy="2835000"/>
+                    </a:xfrm>
+                    <a:prstGeom prst="rect"/>
+                  </pic:spPr>
+                </pic:pic>
+              </a:graphicData>
+            </a:graphic>
+          </wp:inline>
+        </w:drawing>
+      </w:r>
+    </w:p>
+    <w:p>
+      <w:pPr>
         <w:spacing w:before="80" w:after="80"/>
       </w:pPr>
       <w:r>
@@ -813,6 +1269,17 @@
           <w:sz w:val="22"/>
         </w:rPr>
         <w:t>Fifth: Population Stability Index. PSI gives us three interpretable zones: GREEN below 0.10, AMBER 0.10 to 0.25, RED above 0.25. The full review cites 25 sources in APA format.</w:t>
+      </w:r>
+    </w:p>
+    <w:p>
+      <w:pPr>
+        <w:spacing w:before="80" w:after="80"/>
+      </w:pPr>
+      <w:r>
+        <w:rPr>
+          <w:sz w:val="22"/>
+        </w:rPr>
+        <w:t>Two of these areas — linear bandits and algorithm selection — deserve a direct comparison before we proceed to the system design.</w:t>
       </w:r>
     </w:p>
     <w:p/>
@@ -842,6 +1309,45 @@
     </w:p>
     <w:p>
       <w:pPr>
+        <w:jc w:val="center"/>
+      </w:pPr>
+      <w:r>
+        <w:drawing>
+          <wp:inline xmlns:a="http://schemas.openxmlformats.org/drawingml/2006/main" xmlns:pic="http://schemas.openxmlformats.org/drawingml/2006/picture">
+            <wp:extent cx="5040000" cy="2835000"/>
+            <wp:docPr id="11" name="Picture 11"/>
+            <wp:cNvGraphicFramePr>
+              <a:graphicFrameLocks noChangeAspect="1"/>
+            </wp:cNvGraphicFramePr>
+            <a:graphic>
+              <a:graphicData uri="http://schemas.openxmlformats.org/drawingml/2006/picture">
+                <pic:pic>
+                  <pic:nvPicPr>
+                    <pic:cNvPr id="0" name="slide_011.png"/>
+                    <pic:cNvPicPr/>
+                  </pic:nvPicPr>
+                  <pic:blipFill>
+                    <a:blip r:embed="rId19"/>
+                    <a:stretch>
+                      <a:fillRect/>
+                    </a:stretch>
+                  </pic:blipFill>
+                  <pic:spPr>
+                    <a:xfrm>
+                      <a:off x="0" y="0"/>
+                      <a:ext cx="5040000" cy="2835000"/>
+                    </a:xfrm>
+                    <a:prstGeom prst="rect"/>
+                  </pic:spPr>
+                </pic:pic>
+              </a:graphicData>
+            </a:graphic>
+          </wp:inline>
+        </w:drawing>
+      </w:r>
+    </w:p>
+    <w:p>
+      <w:pPr>
         <w:spacing w:before="80" w:after="80"/>
       </w:pPr>
       <w:r>
@@ -904,6 +1410,17 @@
           <w:sz w:val="22"/>
         </w:rPr>
         <w:t>Epsilon-Greedy is included as a weaker admissible baseline — it achieves only O of T to the two-thirds regret in the worst case.</w:t>
+      </w:r>
+    </w:p>
+    <w:p>
+      <w:pPr>
+        <w:spacing w:before="80" w:after="80"/>
+      </w:pPr>
+      <w:r>
+        <w:rPr>
+          <w:sz w:val="22"/>
+        </w:rPr>
+        <w:t>With LinUCB and LinTS selected as the proposed policies, let me now show you the system I designed around them.</w:t>
       </w:r>
     </w:p>
     <w:p/>
@@ -933,6 +1450,45 @@
     </w:p>
     <w:p>
       <w:pPr>
+        <w:jc w:val="center"/>
+      </w:pPr>
+      <w:r>
+        <w:drawing>
+          <wp:inline xmlns:a="http://schemas.openxmlformats.org/drawingml/2006/main" xmlns:pic="http://schemas.openxmlformats.org/drawingml/2006/picture">
+            <wp:extent cx="5040000" cy="2835000"/>
+            <wp:docPr id="12" name="Picture 12"/>
+            <wp:cNvGraphicFramePr>
+              <a:graphicFrameLocks noChangeAspect="1"/>
+            </wp:cNvGraphicFramePr>
+            <a:graphic>
+              <a:graphicData uri="http://schemas.openxmlformats.org/drawingml/2006/picture">
+                <pic:pic>
+                  <pic:nvPicPr>
+                    <pic:cNvPr id="0" name="slide_012.png"/>
+                    <pic:cNvPicPr/>
+                  </pic:nvPicPr>
+                  <pic:blipFill>
+                    <a:blip r:embed="rId20"/>
+                    <a:stretch>
+                      <a:fillRect/>
+                    </a:stretch>
+                  </pic:blipFill>
+                  <pic:spPr>
+                    <a:xfrm>
+                      <a:off x="0" y="0"/>
+                      <a:ext cx="5040000" cy="2835000"/>
+                    </a:xfrm>
+                    <a:prstGeom prst="rect"/>
+                  </pic:spPr>
+                </pic:pic>
+              </a:graphicData>
+            </a:graphic>
+          </wp:inline>
+        </w:drawing>
+      </w:r>
+    </w:p>
+    <w:p>
+      <w:pPr>
         <w:spacing w:before="80" w:after="80"/>
       </w:pPr>
       <w:r>
@@ -969,6 +1525,45 @@
     </w:p>
     <w:p>
       <w:pPr>
+        <w:jc w:val="center"/>
+      </w:pPr>
+      <w:r>
+        <w:drawing>
+          <wp:inline xmlns:a="http://schemas.openxmlformats.org/drawingml/2006/main" xmlns:pic="http://schemas.openxmlformats.org/drawingml/2006/picture">
+            <wp:extent cx="5040000" cy="2835000"/>
+            <wp:docPr id="13" name="Picture 13"/>
+            <wp:cNvGraphicFramePr>
+              <a:graphicFrameLocks noChangeAspect="1"/>
+            </wp:cNvGraphicFramePr>
+            <a:graphic>
+              <a:graphicData uri="http://schemas.openxmlformats.org/drawingml/2006/picture">
+                <pic:pic>
+                  <pic:nvPicPr>
+                    <pic:cNvPr id="0" name="slide_013.png"/>
+                    <pic:cNvPicPr/>
+                  </pic:nvPicPr>
+                  <pic:blipFill>
+                    <a:blip r:embed="rId21"/>
+                    <a:stretch>
+                      <a:fillRect/>
+                    </a:stretch>
+                  </pic:blipFill>
+                  <pic:spPr>
+                    <a:xfrm>
+                      <a:off x="0" y="0"/>
+                      <a:ext cx="5040000" cy="2835000"/>
+                    </a:xfrm>
+                    <a:prstGeom prst="rect"/>
+                  </pic:spPr>
+                </pic:pic>
+              </a:graphicData>
+            </a:graphic>
+          </wp:inline>
+        </w:drawing>
+      </w:r>
+    </w:p>
+    <w:p>
+      <w:pPr>
         <w:spacing w:before="80" w:after="80"/>
       </w:pPr>
       <w:r>
@@ -986,7 +1581,7 @@
         <w:rPr>
           <w:sz w:val="22"/>
         </w:rPr>
-        <w:t>The system is a closed-loop pipeline. An applicant's context vector enters on the left. A bandit policy selects one of four underwriting arms. An actuarial reward simulator returns a profit signal. PSI and HITL guardrails monitor the decision. The final decision goes out on the right — and the reward loops back to update the bandit.</w:t>
+        <w:t>How do we replace the rigidity that failed Sophea? I built a closed-loop pipeline. An applicant's context vector enters on the left. A bandit policy selects one of four underwriting arms. An actuarial reward simulator returns a profit signal. PSI and HITL guardrails monitor the decision. The final decision goes out on the right — and the reward loops back to update the bandit.</w:t>
       </w:r>
     </w:p>
     <w:p>
@@ -1063,7 +1658,18 @@
         <w:rPr>
           <w:sz w:val="22"/>
         </w:rPr>
-        <w:t>Every decision feeds back into making the next decision sharper. That is the fundamental difference from the static system.</w:t>
+        <w:t>Every decision feeds back into making the next decision sharper — a system that evolves with every single applicant, not one frozen at deployment. That is the fundamental difference from the static system.</w:t>
+      </w:r>
+    </w:p>
+    <w:p>
+      <w:pPr>
+        <w:spacing w:before="80" w:after="80"/>
+      </w:pPr>
+      <w:r>
+        <w:rPr>
+          <w:sz w:val="22"/>
+        </w:rPr>
+        <w:t>To make this pipeline concrete, I will zoom in to each component in turn — beginning with how the system sees Sophea.</w:t>
       </w:r>
     </w:p>
     <w:p/>
@@ -1093,13 +1699,52 @@
     </w:p>
     <w:p>
       <w:pPr>
+        <w:jc w:val="center"/>
+      </w:pPr>
+      <w:r>
+        <w:drawing>
+          <wp:inline xmlns:a="http://schemas.openxmlformats.org/drawingml/2006/main" xmlns:pic="http://schemas.openxmlformats.org/drawingml/2006/picture">
+            <wp:extent cx="5040000" cy="2835000"/>
+            <wp:docPr id="14" name="Picture 14"/>
+            <wp:cNvGraphicFramePr>
+              <a:graphicFrameLocks noChangeAspect="1"/>
+            </wp:cNvGraphicFramePr>
+            <a:graphic>
+              <a:graphicData uri="http://schemas.openxmlformats.org/drawingml/2006/picture">
+                <pic:pic>
+                  <pic:nvPicPr>
+                    <pic:cNvPr id="0" name="slide_014.png"/>
+                    <pic:cNvPicPr/>
+                  </pic:nvPicPr>
+                  <pic:blipFill>
+                    <a:blip r:embed="rId22"/>
+                    <a:stretch>
+                      <a:fillRect/>
+                    </a:stretch>
+                  </pic:blipFill>
+                  <pic:spPr>
+                    <a:xfrm>
+                      <a:off x="0" y="0"/>
+                      <a:ext cx="5040000" cy="2835000"/>
+                    </a:xfrm>
+                    <a:prstGeom prst="rect"/>
+                  </pic:spPr>
+                </pic:pic>
+              </a:graphicData>
+            </a:graphic>
+          </wp:inline>
+        </w:drawing>
+      </w:r>
+    </w:p>
+    <w:p>
+      <w:pPr>
         <w:spacing w:before="80" w:after="80"/>
       </w:pPr>
       <w:r>
         <w:rPr>
           <w:sz w:val="22"/>
         </w:rPr>
-        <w:t>We have seen the architecture pipeline from left to right. We now zoom in to the first stage — applicant context.</w:t>
+        <w:t>Having traced the full architecture pipeline from left to right, we now zoom in to the first stage — applicant context.</w:t>
       </w:r>
     </w:p>
     <w:p>
@@ -1122,6 +1767,17 @@
           <w:sz w:val="22"/>
         </w:rPr>
         <w:t>Each applicant is encoded as a 34-dimensional vector drawn from CDHS-anchored features. That vector is the bandit's sole input to every underwriting decision.</w:t>
+      </w:r>
+    </w:p>
+    <w:p>
+      <w:pPr>
+        <w:spacing w:before="80" w:after="80"/>
+      </w:pPr>
+      <w:r>
+        <w:rPr>
+          <w:sz w:val="22"/>
+        </w:rPr>
+        <w:t>This is what the system sees. Let me show you exactly what those 34 dimensions look like.</w:t>
       </w:r>
     </w:p>
     <w:p/>
@@ -1151,6 +1807,45 @@
     </w:p>
     <w:p>
       <w:pPr>
+        <w:jc w:val="center"/>
+      </w:pPr>
+      <w:r>
+        <w:drawing>
+          <wp:inline xmlns:a="http://schemas.openxmlformats.org/drawingml/2006/main" xmlns:pic="http://schemas.openxmlformats.org/drawingml/2006/picture">
+            <wp:extent cx="5040000" cy="2835000"/>
+            <wp:docPr id="15" name="Picture 15"/>
+            <wp:cNvGraphicFramePr>
+              <a:graphicFrameLocks noChangeAspect="1"/>
+            </wp:cNvGraphicFramePr>
+            <a:graphic>
+              <a:graphicData uri="http://schemas.openxmlformats.org/drawingml/2006/picture">
+                <pic:pic>
+                  <pic:nvPicPr>
+                    <pic:cNvPr id="0" name="slide_015.png"/>
+                    <pic:cNvPicPr/>
+                  </pic:nvPicPr>
+                  <pic:blipFill>
+                    <a:blip r:embed="rId23"/>
+                    <a:stretch>
+                      <a:fillRect/>
+                    </a:stretch>
+                  </pic:blipFill>
+                  <pic:spPr>
+                    <a:xfrm>
+                      <a:off x="0" y="0"/>
+                      <a:ext cx="5040000" cy="2835000"/>
+                    </a:xfrm>
+                    <a:prstGeom prst="rect"/>
+                  </pic:spPr>
+                </pic:pic>
+              </a:graphicData>
+            </a:graphic>
+          </wp:inline>
+        </w:drawing>
+      </w:r>
+    </w:p>
+    <w:p>
+      <w:pPr>
         <w:spacing w:before="80" w:after="80"/>
       </w:pPr>
       <w:r>
@@ -1213,6 +1908,17 @@
           <w:sz w:val="22"/>
         </w:rPr>
         <w:t>Sophea is represented in this dataset as a vector: age 42, female, BMI 24.1, non-smoker, hypertension flag on, Kampong Cham indicator on, agriculture indicator on, and twenty-seven more features. The static system saw two of those features. The bandit sees all 34.</w:t>
+      </w:r>
+    </w:p>
+    <w:p>
+      <w:pPr>
+        <w:spacing w:before="80" w:after="80"/>
+      </w:pPr>
+      <w:r>
+        <w:rPr>
+          <w:sz w:val="22"/>
+        </w:rPr>
+        <w:t>Building on this, the bandit must now select an action — and it needs a reward signal to learn from. Let me zoom in to show how that reward is constructed.</w:t>
       </w:r>
     </w:p>
     <w:p/>
@@ -1242,13 +1948,52 @@
     </w:p>
     <w:p>
       <w:pPr>
+        <w:jc w:val="center"/>
+      </w:pPr>
+      <w:r>
+        <w:drawing>
+          <wp:inline xmlns:a="http://schemas.openxmlformats.org/drawingml/2006/main" xmlns:pic="http://schemas.openxmlformats.org/drawingml/2006/picture">
+            <wp:extent cx="5040000" cy="2835000"/>
+            <wp:docPr id="16" name="Picture 16"/>
+            <wp:cNvGraphicFramePr>
+              <a:graphicFrameLocks noChangeAspect="1"/>
+            </wp:cNvGraphicFramePr>
+            <a:graphic>
+              <a:graphicData uri="http://schemas.openxmlformats.org/drawingml/2006/picture">
+                <pic:pic>
+                  <pic:nvPicPr>
+                    <pic:cNvPr id="0" name="slide_016.png"/>
+                    <pic:cNvPicPr/>
+                  </pic:nvPicPr>
+                  <pic:blipFill>
+                    <a:blip r:embed="rId24"/>
+                    <a:stretch>
+                      <a:fillRect/>
+                    </a:stretch>
+                  </pic:blipFill>
+                  <pic:spPr>
+                    <a:xfrm>
+                      <a:off x="0" y="0"/>
+                      <a:ext cx="5040000" cy="2835000"/>
+                    </a:xfrm>
+                    <a:prstGeom prst="rect"/>
+                  </pic:spPr>
+                </pic:pic>
+              </a:graphicData>
+            </a:graphic>
+          </wp:inline>
+        </w:drawing>
+      </w:r>
+    </w:p>
+    <w:p>
+      <w:pPr>
         <w:spacing w:before="80" w:after="80"/>
       </w:pPr>
       <w:r>
         <w:rPr>
           <w:sz w:val="22"/>
         </w:rPr>
-        <w:t>We have seen how the context enters the pipeline. We now zoom in to the reward stage.</w:t>
+        <w:t>With Sophea's context encoded as a 34-dimensional vector, the bandit selects an action and receives a reward signal. We now zoom in to that reward stage.</w:t>
       </w:r>
     </w:p>
     <w:p>
@@ -1271,6 +2016,17 @@
           <w:sz w:val="22"/>
         </w:rPr>
         <w:t>After the bandit selects an arm, the actuarial simulator scores that decision — premium revenue minus expected claims, with an adverse-selection penalty and noise of plus-or-minus 8 percent. That number is the signal that drives learning.</w:t>
+      </w:r>
+    </w:p>
+    <w:p>
+      <w:pPr>
+        <w:spacing w:before="80" w:after="80"/>
+      </w:pPr>
+      <w:r>
+        <w:rPr>
+          <w:sz w:val="22"/>
+        </w:rPr>
+        <w:t>Let me show you how that signal is calculated in detail.</w:t>
       </w:r>
     </w:p>
     <w:p/>
@@ -1300,6 +2056,45 @@
     </w:p>
     <w:p>
       <w:pPr>
+        <w:jc w:val="center"/>
+      </w:pPr>
+      <w:r>
+        <w:drawing>
+          <wp:inline xmlns:a="http://schemas.openxmlformats.org/drawingml/2006/main" xmlns:pic="http://schemas.openxmlformats.org/drawingml/2006/picture">
+            <wp:extent cx="5040000" cy="2835000"/>
+            <wp:docPr id="17" name="Picture 17"/>
+            <wp:cNvGraphicFramePr>
+              <a:graphicFrameLocks noChangeAspect="1"/>
+            </wp:cNvGraphicFramePr>
+            <a:graphic>
+              <a:graphicData uri="http://schemas.openxmlformats.org/drawingml/2006/picture">
+                <pic:pic>
+                  <pic:nvPicPr>
+                    <pic:cNvPr id="0" name="slide_017.png"/>
+                    <pic:cNvPicPr/>
+                  </pic:nvPicPr>
+                  <pic:blipFill>
+                    <a:blip r:embed="rId25"/>
+                    <a:stretch>
+                      <a:fillRect/>
+                    </a:stretch>
+                  </pic:blipFill>
+                  <pic:spPr>
+                    <a:xfrm>
+                      <a:off x="0" y="0"/>
+                      <a:ext cx="5040000" cy="2835000"/>
+                    </a:xfrm>
+                    <a:prstGeom prst="rect"/>
+                  </pic:spPr>
+                </pic:pic>
+              </a:graphicData>
+            </a:graphic>
+          </wp:inline>
+        </w:drawing>
+      </w:r>
+    </w:p>
+    <w:p>
+      <w:pPr>
         <w:spacing w:before="80" w:after="80"/>
       </w:pPr>
       <w:r>
@@ -1373,6 +2168,17 @@
           <w:sz w:val="22"/>
         </w:rPr>
         <w:t>REFER: escalate to human. Deferred reward — 70 percent of the best available arm, minus $35 review cost. This incentivises selective escalation, not blanket referral.</w:t>
+      </w:r>
+    </w:p>
+    <w:p>
+      <w:pPr>
+        <w:spacing w:before="80" w:after="80"/>
+      </w:pPr>
+      <w:r>
+        <w:rPr>
+          <w:sz w:val="22"/>
+        </w:rPr>
+        <w:t>With the reward structure defined, the next question is: how does the bandit use these signals to choose between the four arms?</w:t>
       </w:r>
     </w:p>
     <w:p/>
@@ -1402,13 +2208,52 @@
     </w:p>
     <w:p>
       <w:pPr>
+        <w:jc w:val="center"/>
+      </w:pPr>
+      <w:r>
+        <w:drawing>
+          <wp:inline xmlns:a="http://schemas.openxmlformats.org/drawingml/2006/main" xmlns:pic="http://schemas.openxmlformats.org/drawingml/2006/picture">
+            <wp:extent cx="5040000" cy="2835000"/>
+            <wp:docPr id="18" name="Picture 18"/>
+            <wp:cNvGraphicFramePr>
+              <a:graphicFrameLocks noChangeAspect="1"/>
+            </wp:cNvGraphicFramePr>
+            <a:graphic>
+              <a:graphicData uri="http://schemas.openxmlformats.org/drawingml/2006/picture">
+                <pic:pic>
+                  <pic:nvPicPr>
+                    <pic:cNvPr id="0" name="slide_018.png"/>
+                    <pic:cNvPicPr/>
+                  </pic:nvPicPr>
+                  <pic:blipFill>
+                    <a:blip r:embed="rId26"/>
+                    <a:stretch>
+                      <a:fillRect/>
+                    </a:stretch>
+                  </pic:blipFill>
+                  <pic:spPr>
+                    <a:xfrm>
+                      <a:off x="0" y="0"/>
+                      <a:ext cx="5040000" cy="2835000"/>
+                    </a:xfrm>
+                    <a:prstGeom prst="rect"/>
+                  </pic:spPr>
+                </pic:pic>
+              </a:graphicData>
+            </a:graphic>
+          </wp:inline>
+        </w:drawing>
+      </w:r>
+    </w:p>
+    <w:p>
+      <w:pPr>
         <w:spacing w:before="80" w:after="80"/>
       </w:pPr>
       <w:r>
         <w:rPr>
           <w:sz w:val="22"/>
         </w:rPr>
-        <w:t>We have seen how the reward is constructed. We now zoom in to the decision stage.</w:t>
+        <w:t>Building on the reward structure we just examined, we now zoom in to the decision stage — how the bandit translates that reward signal into an underwriting action.</w:t>
       </w:r>
     </w:p>
     <w:p>
@@ -1431,6 +2276,17 @@
           <w:sz w:val="22"/>
         </w:rPr>
         <w:t>The bandit computes a UCB score for each of the four arms — STANDARD, RATED, DECLINE, REFER — and selects the argmax. This is the step where the exploration-exploitation trade-off meets the actuarial judgment.</w:t>
+      </w:r>
+    </w:p>
+    <w:p>
+      <w:pPr>
+        <w:spacing w:before="80" w:after="80"/>
+      </w:pPr>
+      <w:r>
+        <w:rPr>
+          <w:sz w:val="22"/>
+        </w:rPr>
+        <w:t>To better understand this decision, let me show it working on Sophea's actual application.</w:t>
       </w:r>
     </w:p>
     <w:p/>
@@ -1460,6 +2316,45 @@
     </w:p>
     <w:p>
       <w:pPr>
+        <w:jc w:val="center"/>
+      </w:pPr>
+      <w:r>
+        <w:drawing>
+          <wp:inline xmlns:a="http://schemas.openxmlformats.org/drawingml/2006/main" xmlns:pic="http://schemas.openxmlformats.org/drawingml/2006/picture">
+            <wp:extent cx="5040000" cy="2835000"/>
+            <wp:docPr id="19" name="Picture 19"/>
+            <wp:cNvGraphicFramePr>
+              <a:graphicFrameLocks noChangeAspect="1"/>
+            </wp:cNvGraphicFramePr>
+            <a:graphic>
+              <a:graphicData uri="http://schemas.openxmlformats.org/drawingml/2006/picture">
+                <pic:pic>
+                  <pic:nvPicPr>
+                    <pic:cNvPr id="0" name="slide_019.png"/>
+                    <pic:cNvPicPr/>
+                  </pic:nvPicPr>
+                  <pic:blipFill>
+                    <a:blip r:embed="rId27"/>
+                    <a:stretch>
+                      <a:fillRect/>
+                    </a:stretch>
+                  </pic:blipFill>
+                  <pic:spPr>
+                    <a:xfrm>
+                      <a:off x="0" y="0"/>
+                      <a:ext cx="5040000" cy="2835000"/>
+                    </a:xfrm>
+                    <a:prstGeom prst="rect"/>
+                  </pic:spPr>
+                </pic:pic>
+              </a:graphicData>
+            </a:graphic>
+          </wp:inline>
+        </w:drawing>
+      </w:r>
+    </w:p>
+    <w:p>
+      <w:pPr>
         <w:spacing w:before="80" w:after="80"/>
       </w:pPr>
       <w:r>
@@ -1522,6 +2417,17 @@
           <w:sz w:val="22"/>
         </w:rPr>
         <w:t>The bandit computes this score for each of the four arms — RATED, STANDARD, DECLINE, REFER — and takes the argmax.</w:t>
+      </w:r>
+    </w:p>
+    <w:p>
+      <w:pPr>
+        <w:spacing w:before="80" w:after="80"/>
+      </w:pPr>
+      <w:r>
+        <w:rPr>
+          <w:sz w:val="22"/>
+        </w:rPr>
+        <w:t>Across 5,000 rounds, those individual decisions accumulate into a full performance picture — the policy ladder.</w:t>
       </w:r>
     </w:p>
     <w:p/>
@@ -1551,6 +2457,45 @@
     </w:p>
     <w:p>
       <w:pPr>
+        <w:jc w:val="center"/>
+      </w:pPr>
+      <w:r>
+        <w:drawing>
+          <wp:inline xmlns:a="http://schemas.openxmlformats.org/drawingml/2006/main" xmlns:pic="http://schemas.openxmlformats.org/drawingml/2006/picture">
+            <wp:extent cx="5040000" cy="2835000"/>
+            <wp:docPr id="20" name="Picture 20"/>
+            <wp:cNvGraphicFramePr>
+              <a:graphicFrameLocks noChangeAspect="1"/>
+            </wp:cNvGraphicFramePr>
+            <a:graphic>
+              <a:graphicData uri="http://schemas.openxmlformats.org/drawingml/2006/picture">
+                <pic:pic>
+                  <pic:nvPicPr>
+                    <pic:cNvPr id="0" name="slide_020.png"/>
+                    <pic:cNvPicPr/>
+                  </pic:nvPicPr>
+                  <pic:blipFill>
+                    <a:blip r:embed="rId28"/>
+                    <a:stretch>
+                      <a:fillRect/>
+                    </a:stretch>
+                  </pic:blipFill>
+                  <pic:spPr>
+                    <a:xfrm>
+                      <a:off x="0" y="0"/>
+                      <a:ext cx="5040000" cy="2835000"/>
+                    </a:xfrm>
+                    <a:prstGeom prst="rect"/>
+                  </pic:spPr>
+                </pic:pic>
+              </a:graphicData>
+            </a:graphic>
+          </wp:inline>
+        </w:drawing>
+      </w:r>
+    </w:p>
+    <w:p>
+      <w:pPr>
         <w:spacing w:before="80" w:after="80"/>
       </w:pPr>
       <w:r>
@@ -1590,6 +2535,17 @@
         <w:rPr>
           <w:sz w:val="22"/>
         </w:rPr>
+        <w:t>We did not just optimize for profit here — we optimized for access. A DECLINE became a STANDARD.</w:t>
+      </w:r>
+    </w:p>
+    <w:p>
+      <w:pPr>
+        <w:spacing w:before="80" w:after="80"/>
+      </w:pPr>
+      <w:r>
+        <w:rPr>
+          <w:sz w:val="22"/>
+        </w:rPr>
         <w:t>[Point to the policy ladder table.]</w:t>
       </w:r>
     </w:p>
@@ -1635,6 +2591,17 @@
           <w:sz w:val="22"/>
         </w:rPr>
         <w:t>AlwaysRATED earns $122,287 — between Oracle and LinTS. This is reported honestly in the note: commercially and regulatorily inadmissible. It cannot be deployed. The admissible comparison is LinUCB versus Static XGB.</w:t>
+      </w:r>
+    </w:p>
+    <w:p>
+      <w:pPr>
+        <w:spacing w:before="80" w:after="80"/>
+      </w:pPr>
+      <w:r>
+        <w:rPr>
+          <w:sz w:val="22"/>
+        </w:rPr>
+        <w:t>A system that performs well is only half the story. It must also be fair. This naturally leads to the guardrails — let me zoom in.</w:t>
       </w:r>
     </w:p>
     <w:p/>
@@ -1664,13 +2631,52 @@
     </w:p>
     <w:p>
       <w:pPr>
+        <w:jc w:val="center"/>
+      </w:pPr>
+      <w:r>
+        <w:drawing>
+          <wp:inline xmlns:a="http://schemas.openxmlformats.org/drawingml/2006/main" xmlns:pic="http://schemas.openxmlformats.org/drawingml/2006/picture">
+            <wp:extent cx="5040000" cy="2835000"/>
+            <wp:docPr id="21" name="Picture 21"/>
+            <wp:cNvGraphicFramePr>
+              <a:graphicFrameLocks noChangeAspect="1"/>
+            </wp:cNvGraphicFramePr>
+            <a:graphic>
+              <a:graphicData uri="http://schemas.openxmlformats.org/drawingml/2006/picture">
+                <pic:pic>
+                  <pic:nvPicPr>
+                    <pic:cNvPr id="0" name="slide_021.png"/>
+                    <pic:cNvPicPr/>
+                  </pic:nvPicPr>
+                  <pic:blipFill>
+                    <a:blip r:embed="rId29"/>
+                    <a:stretch>
+                      <a:fillRect/>
+                    </a:stretch>
+                  </pic:blipFill>
+                  <pic:spPr>
+                    <a:xfrm>
+                      <a:off x="0" y="0"/>
+                      <a:ext cx="5040000" cy="2835000"/>
+                    </a:xfrm>
+                    <a:prstGeom prst="rect"/>
+                  </pic:spPr>
+                </pic:pic>
+              </a:graphicData>
+            </a:graphic>
+          </wp:inline>
+        </w:drawing>
+      </w:r>
+    </w:p>
+    <w:p>
+      <w:pPr>
         <w:spacing w:before="80" w:after="80"/>
       </w:pPr>
       <w:r>
         <w:rPr>
           <w:sz w:val="22"/>
         </w:rPr>
-        <w:t>We have seen how the bandit selects actions and receives rewards. We now zoom in to the guardrails.</w:t>
+        <w:t>Having established how the bandit selects actions and earns rewards, we now zoom in to the guardrails — the layers that ensure the system remains trustworthy in practice.</w:t>
       </w:r>
     </w:p>
     <w:p>
@@ -1693,6 +2699,17 @@
           <w:sz w:val="22"/>
         </w:rPr>
         <w:t>The PSI monitor checks demographic parity on a 500-round sliding window. The HITL wrapper catches decisions where the bandit is uncertain. Together these two layers ensure the system remains fair, auditable, and safe to deploy.</w:t>
+      </w:r>
+    </w:p>
+    <w:p>
+      <w:pPr>
+        <w:spacing w:before="80" w:after="80"/>
+      </w:pPr>
+      <w:r>
+        <w:rPr>
+          <w:sz w:val="22"/>
+        </w:rPr>
+        <w:t>Let me take you through each layer in detail — starting with the PSI monitor.</w:t>
       </w:r>
     </w:p>
     <w:p/>
@@ -1722,6 +2739,45 @@
     </w:p>
     <w:p>
       <w:pPr>
+        <w:jc w:val="center"/>
+      </w:pPr>
+      <w:r>
+        <w:drawing>
+          <wp:inline xmlns:a="http://schemas.openxmlformats.org/drawingml/2006/main" xmlns:pic="http://schemas.openxmlformats.org/drawingml/2006/picture">
+            <wp:extent cx="5040000" cy="2835000"/>
+            <wp:docPr id="22" name="Picture 22"/>
+            <wp:cNvGraphicFramePr>
+              <a:graphicFrameLocks noChangeAspect="1"/>
+            </wp:cNvGraphicFramePr>
+            <a:graphic>
+              <a:graphicData uri="http://schemas.openxmlformats.org/drawingml/2006/picture">
+                <pic:pic>
+                  <pic:nvPicPr>
+                    <pic:cNvPr id="0" name="slide_022.png"/>
+                    <pic:cNvPicPr/>
+                  </pic:nvPicPr>
+                  <pic:blipFill>
+                    <a:blip r:embed="rId30"/>
+                    <a:stretch>
+                      <a:fillRect/>
+                    </a:stretch>
+                  </pic:blipFill>
+                  <pic:spPr>
+                    <a:xfrm>
+                      <a:off x="0" y="0"/>
+                      <a:ext cx="5040000" cy="2835000"/>
+                    </a:xfrm>
+                    <a:prstGeom prst="rect"/>
+                  </pic:spPr>
+                </pic:pic>
+              </a:graphicData>
+            </a:graphic>
+          </wp:inline>
+        </w:drawing>
+      </w:r>
+    </w:p>
+    <w:p>
+      <w:pPr>
         <w:spacing w:before="80" w:after="80"/>
       </w:pPr>
       <w:r>
@@ -1795,6 +2851,17 @@
           <w:sz w:val="22"/>
         </w:rPr>
         <w:t>The EXP-006 result: LinUCB sits GREEN on all 8 regions and 7 occupations across 20 seeds. Mean PSI 0.042 for region and 0.037 for occupation. Sophea's Kampong Cham region PSI: 0.082 — GREEN. Her occupation category PSI max: 0.123 — AMBER, in the monitor zone, below RED.</w:t>
+      </w:r>
+    </w:p>
+    <w:p>
+      <w:pPr>
+        <w:spacing w:before="80" w:after="80"/>
+      </w:pPr>
+      <w:r>
+        <w:rPr>
+          <w:sz w:val="22"/>
+        </w:rPr>
+        <w:t>Turning now to the second guardrail: the HITL wrapper.</w:t>
       </w:r>
     </w:p>
     <w:p/>
@@ -1824,6 +2891,45 @@
     </w:p>
     <w:p>
       <w:pPr>
+        <w:jc w:val="center"/>
+      </w:pPr>
+      <w:r>
+        <w:drawing>
+          <wp:inline xmlns:a="http://schemas.openxmlformats.org/drawingml/2006/main" xmlns:pic="http://schemas.openxmlformats.org/drawingml/2006/picture">
+            <wp:extent cx="5040000" cy="2835000"/>
+            <wp:docPr id="23" name="Picture 23"/>
+            <wp:cNvGraphicFramePr>
+              <a:graphicFrameLocks noChangeAspect="1"/>
+            </wp:cNvGraphicFramePr>
+            <a:graphic>
+              <a:graphicData uri="http://schemas.openxmlformats.org/drawingml/2006/picture">
+                <pic:pic>
+                  <pic:nvPicPr>
+                    <pic:cNvPr id="0" name="slide_023.png"/>
+                    <pic:cNvPicPr/>
+                  </pic:nvPicPr>
+                  <pic:blipFill>
+                    <a:blip r:embed="rId31"/>
+                    <a:stretch>
+                      <a:fillRect/>
+                    </a:stretch>
+                  </pic:blipFill>
+                  <pic:spPr>
+                    <a:xfrm>
+                      <a:off x="0" y="0"/>
+                      <a:ext cx="5040000" cy="2835000"/>
+                    </a:xfrm>
+                    <a:prstGeom prst="rect"/>
+                  </pic:spPr>
+                </pic:pic>
+              </a:graphicData>
+            </a:graphic>
+          </wp:inline>
+        </w:drawing>
+      </w:r>
+    </w:p>
+    <w:p>
+      <w:pPr>
         <w:spacing w:before="80" w:after="80"/>
       </w:pPr>
       <w:r>
@@ -1886,6 +2992,17 @@
           <w:sz w:val="22"/>
         </w:rPr>
         <w:t>The headline result: plus 6.5 percent reward gain over vanilla bandit, at a review rate of only 1.5 percent. 75 applications reviewed out of 5,000. That is the value of targeted human judgment.</w:t>
+      </w:r>
+    </w:p>
+    <w:p>
+      <w:pPr>
+        <w:spacing w:before="80" w:after="80"/>
+      </w:pPr>
+      <w:r>
+        <w:rPr>
+          <w:sz w:val="22"/>
+        </w:rPr>
+        <w:t>Having described the full system design, let me now show you the experimental framework I used to evaluate it.</w:t>
       </w:r>
     </w:p>
     <w:p/>
@@ -1915,6 +3032,45 @@
     </w:p>
     <w:p>
       <w:pPr>
+        <w:jc w:val="center"/>
+      </w:pPr>
+      <w:r>
+        <w:drawing>
+          <wp:inline xmlns:a="http://schemas.openxmlformats.org/drawingml/2006/main" xmlns:pic="http://schemas.openxmlformats.org/drawingml/2006/picture">
+            <wp:extent cx="5040000" cy="2835000"/>
+            <wp:docPr id="24" name="Picture 24"/>
+            <wp:cNvGraphicFramePr>
+              <a:graphicFrameLocks noChangeAspect="1"/>
+            </wp:cNvGraphicFramePr>
+            <a:graphic>
+              <a:graphicData uri="http://schemas.openxmlformats.org/drawingml/2006/picture">
+                <pic:pic>
+                  <pic:nvPicPr>
+                    <pic:cNvPr id="0" name="slide_024.png"/>
+                    <pic:cNvPicPr/>
+                  </pic:nvPicPr>
+                  <pic:blipFill>
+                    <a:blip r:embed="rId32"/>
+                    <a:stretch>
+                      <a:fillRect/>
+                    </a:stretch>
+                  </pic:blipFill>
+                  <pic:spPr>
+                    <a:xfrm>
+                      <a:off x="0" y="0"/>
+                      <a:ext cx="5040000" cy="2835000"/>
+                    </a:xfrm>
+                    <a:prstGeom prst="rect"/>
+                  </pic:spPr>
+                </pic:pic>
+              </a:graphicData>
+            </a:graphic>
+          </wp:inline>
+        </w:drawing>
+      </w:r>
+    </w:p>
+    <w:p>
+      <w:pPr>
         <w:spacing w:before="80" w:after="80"/>
       </w:pPr>
       <w:r>
@@ -1999,6 +3155,17 @@
           <w:sz w:val="22"/>
         </w:rPr>
         <w:t>EXP-008 to EXP-015 cover HITL, drift adaptation, cold start, ablation, regret bound validation, and drift rescue — progressively interrogating the system's boundaries.</w:t>
+      </w:r>
+    </w:p>
+    <w:p>
+      <w:pPr>
+        <w:spacing w:before="80" w:after="80"/>
+      </w:pPr>
+      <w:r>
+        <w:rPr>
+          <w:sz w:val="22"/>
+        </w:rPr>
+        <w:t>Nine pre-registered experiments. Let me now tell you what they found.</w:t>
       </w:r>
     </w:p>
     <w:p/>
@@ -2028,6 +3195,45 @@
     </w:p>
     <w:p>
       <w:pPr>
+        <w:jc w:val="center"/>
+      </w:pPr>
+      <w:r>
+        <w:drawing>
+          <wp:inline xmlns:a="http://schemas.openxmlformats.org/drawingml/2006/main" xmlns:pic="http://schemas.openxmlformats.org/drawingml/2006/picture">
+            <wp:extent cx="5040000" cy="2835000"/>
+            <wp:docPr id="25" name="Picture 25"/>
+            <wp:cNvGraphicFramePr>
+              <a:graphicFrameLocks noChangeAspect="1"/>
+            </wp:cNvGraphicFramePr>
+            <a:graphic>
+              <a:graphicData uri="http://schemas.openxmlformats.org/drawingml/2006/picture">
+                <pic:pic>
+                  <pic:nvPicPr>
+                    <pic:cNvPr id="0" name="slide_025.png"/>
+                    <pic:cNvPicPr/>
+                  </pic:nvPicPr>
+                  <pic:blipFill>
+                    <a:blip r:embed="rId33"/>
+                    <a:stretch>
+                      <a:fillRect/>
+                    </a:stretch>
+                  </pic:blipFill>
+                  <pic:spPr>
+                    <a:xfrm>
+                      <a:off x="0" y="0"/>
+                      <a:ext cx="5040000" cy="2835000"/>
+                    </a:xfrm>
+                    <a:prstGeom prst="rect"/>
+                  </pic:spPr>
+                </pic:pic>
+              </a:graphicData>
+            </a:graphic>
+          </wp:inline>
+        </w:drawing>
+      </w:r>
+    </w:p>
+    <w:p>
+      <w:pPr>
         <w:spacing w:before="80" w:after="80"/>
       </w:pPr>
       <w:r>
@@ -2064,6 +3270,45 @@
     </w:p>
     <w:p>
       <w:pPr>
+        <w:jc w:val="center"/>
+      </w:pPr>
+      <w:r>
+        <w:drawing>
+          <wp:inline xmlns:a="http://schemas.openxmlformats.org/drawingml/2006/main" xmlns:pic="http://schemas.openxmlformats.org/drawingml/2006/picture">
+            <wp:extent cx="5040000" cy="2835000"/>
+            <wp:docPr id="26" name="Picture 26"/>
+            <wp:cNvGraphicFramePr>
+              <a:graphicFrameLocks noChangeAspect="1"/>
+            </wp:cNvGraphicFramePr>
+            <a:graphic>
+              <a:graphicData uri="http://schemas.openxmlformats.org/drawingml/2006/picture">
+                <pic:pic>
+                  <pic:nvPicPr>
+                    <pic:cNvPr id="0" name="slide_026.png"/>
+                    <pic:cNvPicPr/>
+                  </pic:nvPicPr>
+                  <pic:blipFill>
+                    <a:blip r:embed="rId34"/>
+                    <a:stretch>
+                      <a:fillRect/>
+                    </a:stretch>
+                  </pic:blipFill>
+                  <pic:spPr>
+                    <a:xfrm>
+                      <a:off x="0" y="0"/>
+                      <a:ext cx="5040000" cy="2835000"/>
+                    </a:xfrm>
+                    <a:prstGeom prst="rect"/>
+                  </pic:spPr>
+                </pic:pic>
+              </a:graphicData>
+            </a:graphic>
+          </wp:inline>
+        </w:drawing>
+      </w:r>
+    </w:p>
+    <w:p>
+      <w:pPr>
         <w:spacing w:before="80" w:after="80"/>
       </w:pPr>
       <w:r>
@@ -2148,6 +3393,17 @@
           <w:sz w:val="22"/>
         </w:rPr>
         <w:t>AlwaysSTANDARD earns only $34,684 — well below Static XGB. A naive all-approve policy is not the answer.</w:t>
+      </w:r>
+    </w:p>
+    <w:p>
+      <w:pPr>
+        <w:spacing w:before="80" w:after="80"/>
+      </w:pPr>
+      <w:r>
+        <w:rPr>
+          <w:sz w:val="22"/>
+        </w:rPr>
+        <w:t>That is the summary picture. Let me now walk you through the primary pre-registered experiment that underpins it.</w:t>
       </w:r>
     </w:p>
     <w:p/>
@@ -2177,6 +3433,45 @@
     </w:p>
     <w:p>
       <w:pPr>
+        <w:jc w:val="center"/>
+      </w:pPr>
+      <w:r>
+        <w:drawing>
+          <wp:inline xmlns:a="http://schemas.openxmlformats.org/drawingml/2006/main" xmlns:pic="http://schemas.openxmlformats.org/drawingml/2006/picture">
+            <wp:extent cx="5040000" cy="2835000"/>
+            <wp:docPr id="27" name="Picture 27"/>
+            <wp:cNvGraphicFramePr>
+              <a:graphicFrameLocks noChangeAspect="1"/>
+            </wp:cNvGraphicFramePr>
+            <a:graphic>
+              <a:graphicData uri="http://schemas.openxmlformats.org/drawingml/2006/picture">
+                <pic:pic>
+                  <pic:nvPicPr>
+                    <pic:cNvPr id="0" name="slide_027.png"/>
+                    <pic:cNvPicPr/>
+                  </pic:nvPicPr>
+                  <pic:blipFill>
+                    <a:blip r:embed="rId35"/>
+                    <a:stretch>
+                      <a:fillRect/>
+                    </a:stretch>
+                  </pic:blipFill>
+                  <pic:spPr>
+                    <a:xfrm>
+                      <a:off x="0" y="0"/>
+                      <a:ext cx="5040000" cy="2835000"/>
+                    </a:xfrm>
+                    <a:prstGeom prst="rect"/>
+                  </pic:spPr>
+                </pic:pic>
+              </a:graphicData>
+            </a:graphic>
+          </wp:inline>
+        </w:drawing>
+      </w:r>
+    </w:p>
+    <w:p>
+      <w:pPr>
         <w:spacing w:before="80" w:after="80"/>
       </w:pPr>
       <w:r>
@@ -2261,6 +3556,17 @@
           <w:sz w:val="22"/>
         </w:rPr>
         <w:t>The convergence indicators confirm the learning is genuine. Action entropy drops from 1.314 to 1.105 nats — exploration giving way to exploitation. Oracle-agreement in the last 500 rounds reaches 37.8 percent. And the regret curve follows O of root-T — log-log slope 0.572, R-squared 0.9915. All five EXP-005 criteria: PASSED.</w:t>
+      </w:r>
+    </w:p>
+    <w:p>
+      <w:pPr>
+        <w:spacing w:before="80" w:after="80"/>
+      </w:pPr>
+      <w:r>
+        <w:rPr>
+          <w:sz w:val="22"/>
+        </w:rPr>
+        <w:t>Performance confirmed. The next question is fairness — did the bandit introduce any demographic bias in its decisions?</w:t>
       </w:r>
     </w:p>
     <w:p/>
@@ -2290,13 +3596,52 @@
     </w:p>
     <w:p>
       <w:pPr>
+        <w:jc w:val="center"/>
+      </w:pPr>
+      <w:r>
+        <w:drawing>
+          <wp:inline xmlns:a="http://schemas.openxmlformats.org/drawingml/2006/main" xmlns:pic="http://schemas.openxmlformats.org/drawingml/2006/picture">
+            <wp:extent cx="5040000" cy="2835000"/>
+            <wp:docPr id="28" name="Picture 28"/>
+            <wp:cNvGraphicFramePr>
+              <a:graphicFrameLocks noChangeAspect="1"/>
+            </wp:cNvGraphicFramePr>
+            <a:graphic>
+              <a:graphicData uri="http://schemas.openxmlformats.org/drawingml/2006/picture">
+                <pic:pic>
+                  <pic:nvPicPr>
+                    <pic:cNvPr id="0" name="slide_028.png"/>
+                    <pic:cNvPicPr/>
+                  </pic:nvPicPr>
+                  <pic:blipFill>
+                    <a:blip r:embed="rId36"/>
+                    <a:stretch>
+                      <a:fillRect/>
+                    </a:stretch>
+                  </pic:blipFill>
+                  <pic:spPr>
+                    <a:xfrm>
+                      <a:off x="0" y="0"/>
+                      <a:ext cx="5040000" cy="2835000"/>
+                    </a:xfrm>
+                    <a:prstGeom prst="rect"/>
+                  </pic:spPr>
+                </pic:pic>
+              </a:graphicData>
+            </a:graphic>
+          </wp:inline>
+        </w:drawing>
+      </w:r>
+    </w:p>
+    <w:p>
+      <w:pPr>
         <w:spacing w:before="80" w:after="80"/>
       </w:pPr>
       <w:r>
         <w:rPr>
           <w:sz w:val="22"/>
         </w:rPr>
-        <w:t>The fairness audit evaluates six pre-registered criteria. Five passed. One failed — and I want to address that failure directly.</w:t>
+        <w:t>A smart system that is unfair is a failure — so this audit was non-negotiable. The fairness audit evaluates six pre-registered criteria. Five passed. One failed — and I want to address that failure directly.</w:t>
       </w:r>
     </w:p>
     <w:p>
@@ -2351,7 +3696,18 @@
         <w:rPr>
           <w:sz w:val="22"/>
         </w:rPr>
-        <w:t>My interpretation: occupation is an actuarially valid risk factor. Rice farmers, garment workers, and office workers carry genuinely different health risk profiles. The association is statistically significant but practically small — no regulatory threshold is breached. I call this FAILED-with-interpretation. I stand by that verdict. PSI is a monitor, not an enforcer — constrained-action guardrails are future work.</w:t>
+        <w:t>My interpretation: occupation is an actuarially valid risk factor. Rice farmers, garment workers, and office workers carry genuinely different health risk profiles. The association is statistically significant but practically small — no regulatory threshold is breached. The system is learning those profiles, not mimicking human bias — a distinction that makes it more transparent, not less. I call this FAILED-with-interpretation. I stand by that verdict. PSI is a monitor, not an enforcer — constrained-action guardrails are future work.</w:t>
+      </w:r>
+    </w:p>
+    <w:p>
+      <w:pPr>
+        <w:spacing w:before="80" w:after="80"/>
+      </w:pPr>
+      <w:r>
+        <w:rPr>
+          <w:sz w:val="22"/>
+        </w:rPr>
+        <w:t>With fairness addressed, let me show you the full benchmark comparison across all policies.</w:t>
       </w:r>
     </w:p>
     <w:p/>
@@ -2381,6 +3737,45 @@
     </w:p>
     <w:p>
       <w:pPr>
+        <w:jc w:val="center"/>
+      </w:pPr>
+      <w:r>
+        <w:drawing>
+          <wp:inline xmlns:a="http://schemas.openxmlformats.org/drawingml/2006/main" xmlns:pic="http://schemas.openxmlformats.org/drawingml/2006/picture">
+            <wp:extent cx="5040000" cy="2835000"/>
+            <wp:docPr id="29" name="Picture 29"/>
+            <wp:cNvGraphicFramePr>
+              <a:graphicFrameLocks noChangeAspect="1"/>
+            </wp:cNvGraphicFramePr>
+            <a:graphic>
+              <a:graphicData uri="http://schemas.openxmlformats.org/drawingml/2006/picture">
+                <pic:pic>
+                  <pic:nvPicPr>
+                    <pic:cNvPr id="0" name="slide_029.png"/>
+                    <pic:cNvPicPr/>
+                  </pic:nvPicPr>
+                  <pic:blipFill>
+                    <a:blip r:embed="rId37"/>
+                    <a:stretch>
+                      <a:fillRect/>
+                    </a:stretch>
+                  </pic:blipFill>
+                  <pic:spPr>
+                    <a:xfrm>
+                      <a:off x="0" y="0"/>
+                      <a:ext cx="5040000" cy="2835000"/>
+                    </a:xfrm>
+                    <a:prstGeom prst="rect"/>
+                  </pic:spPr>
+                </pic:pic>
+              </a:graphicData>
+            </a:graphic>
+          </wp:inline>
+        </w:drawing>
+      </w:r>
+    </w:p>
+    <w:p>
+      <w:pPr>
         <w:spacing w:before="80" w:after="80"/>
       </w:pPr>
       <w:r>
@@ -2465,6 +3860,17 @@
           <w:sz w:val="22"/>
         </w:rPr>
         <w:t>Two coexisting findings: adaptive bandits decisively beat the frozen static rule. And the trivial constant AlwaysRATED still beats all bandits — honestly reported.</w:t>
+      </w:r>
+    </w:p>
+    <w:p>
+      <w:pPr>
+        <w:spacing w:before="80" w:after="80"/>
+      </w:pPr>
+      <w:r>
+        <w:rPr>
+          <w:sz w:val="22"/>
+        </w:rPr>
+        <w:t>Building on this benchmark, the HITL layer adds targeted human judgment on top of the bandit baseline.</w:t>
       </w:r>
     </w:p>
     <w:p/>
@@ -2494,6 +3900,45 @@
     </w:p>
     <w:p>
       <w:pPr>
+        <w:jc w:val="center"/>
+      </w:pPr>
+      <w:r>
+        <w:drawing>
+          <wp:inline xmlns:a="http://schemas.openxmlformats.org/drawingml/2006/main" xmlns:pic="http://schemas.openxmlformats.org/drawingml/2006/picture">
+            <wp:extent cx="5040000" cy="2835000"/>
+            <wp:docPr id="30" name="Picture 30"/>
+            <wp:cNvGraphicFramePr>
+              <a:graphicFrameLocks noChangeAspect="1"/>
+            </wp:cNvGraphicFramePr>
+            <a:graphic>
+              <a:graphicData uri="http://schemas.openxmlformats.org/drawingml/2006/picture">
+                <pic:pic>
+                  <pic:nvPicPr>
+                    <pic:cNvPr id="0" name="slide_030.png"/>
+                    <pic:cNvPicPr/>
+                  </pic:nvPicPr>
+                  <pic:blipFill>
+                    <a:blip r:embed="rId38"/>
+                    <a:stretch>
+                      <a:fillRect/>
+                    </a:stretch>
+                  </pic:blipFill>
+                  <pic:spPr>
+                    <a:xfrm>
+                      <a:off x="0" y="0"/>
+                      <a:ext cx="5040000" cy="2835000"/>
+                    </a:xfrm>
+                    <a:prstGeom prst="rect"/>
+                  </pic:spPr>
+                </pic:pic>
+              </a:graphicData>
+            </a:graphic>
+          </wp:inline>
+        </w:drawing>
+      </w:r>
+    </w:p>
+    <w:p>
+      <w:pPr>
         <w:spacing w:before="80" w:after="80"/>
       </w:pPr>
       <w:r>
@@ -2556,6 +4001,17 @@
           <w:sz w:val="22"/>
         </w:rPr>
         <w:t>Thirteen applicants reviewed per thousand. The actuary's judgment on those thirteen cases is worth a 6.5 percent gain on the whole portfolio. That is the value of the HITL layer.</w:t>
+      </w:r>
+    </w:p>
+    <w:p>
+      <w:pPr>
+        <w:spacing w:before="80" w:after="80"/>
+      </w:pPr>
+      <w:r>
+        <w:rPr>
+          <w:sz w:val="22"/>
+        </w:rPr>
+        <w:t>These findings motivate a deeper question: what exactly drives the bandit's value — and where does it fall short?</w:t>
       </w:r>
     </w:p>
     <w:p/>
@@ -2585,6 +4041,45 @@
     </w:p>
     <w:p>
       <w:pPr>
+        <w:jc w:val="center"/>
+      </w:pPr>
+      <w:r>
+        <w:drawing>
+          <wp:inline xmlns:a="http://schemas.openxmlformats.org/drawingml/2006/main" xmlns:pic="http://schemas.openxmlformats.org/drawingml/2006/picture">
+            <wp:extent cx="5040000" cy="2835000"/>
+            <wp:docPr id="31" name="Picture 31"/>
+            <wp:cNvGraphicFramePr>
+              <a:graphicFrameLocks noChangeAspect="1"/>
+            </wp:cNvGraphicFramePr>
+            <a:graphic>
+              <a:graphicData uri="http://schemas.openxmlformats.org/drawingml/2006/picture">
+                <pic:pic>
+                  <pic:nvPicPr>
+                    <pic:cNvPr id="0" name="slide_031.png"/>
+                    <pic:cNvPicPr/>
+                  </pic:nvPicPr>
+                  <pic:blipFill>
+                    <a:blip r:embed="rId39"/>
+                    <a:stretch>
+                      <a:fillRect/>
+                    </a:stretch>
+                  </pic:blipFill>
+                  <pic:spPr>
+                    <a:xfrm>
+                      <a:off x="0" y="0"/>
+                      <a:ext cx="5040000" cy="2835000"/>
+                    </a:xfrm>
+                    <a:prstGeom prst="rect"/>
+                  </pic:spPr>
+                </pic:pic>
+              </a:graphicData>
+            </a:graphic>
+          </wp:inline>
+        </w:drawing>
+      </w:r>
+    </w:p>
+    <w:p>
+      <w:pPr>
         <w:spacing w:before="80" w:after="80"/>
       </w:pPr>
       <w:r>
@@ -2658,6 +4153,17 @@
           <w:sz w:val="22"/>
         </w:rPr>
         <w:t>Non-stationarity does not rescue the bandit. We honestly report this as a boundary of the current framework.</w:t>
+      </w:r>
+    </w:p>
+    <w:p>
+      <w:pPr>
+        <w:spacing w:before="80" w:after="80"/>
+      </w:pPr>
+      <w:r>
+        <w:rPr>
+          <w:sz w:val="22"/>
+        </w:rPr>
+        <w:t>Two further questions matter for real deployment: when does the bandit become trustworthy, and does its regret decay as theory predicts?</w:t>
       </w:r>
     </w:p>
     <w:p/>
@@ -2687,6 +4193,45 @@
     </w:p>
     <w:p>
       <w:pPr>
+        <w:jc w:val="center"/>
+      </w:pPr>
+      <w:r>
+        <w:drawing>
+          <wp:inline xmlns:a="http://schemas.openxmlformats.org/drawingml/2006/main" xmlns:pic="http://schemas.openxmlformats.org/drawingml/2006/picture">
+            <wp:extent cx="5040000" cy="2835000"/>
+            <wp:docPr id="32" name="Picture 32"/>
+            <wp:cNvGraphicFramePr>
+              <a:graphicFrameLocks noChangeAspect="1"/>
+            </wp:cNvGraphicFramePr>
+            <a:graphic>
+              <a:graphicData uri="http://schemas.openxmlformats.org/drawingml/2006/picture">
+                <pic:pic>
+                  <pic:nvPicPr>
+                    <pic:cNvPr id="0" name="slide_032.png"/>
+                    <pic:cNvPicPr/>
+                  </pic:nvPicPr>
+                  <pic:blipFill>
+                    <a:blip r:embed="rId40"/>
+                    <a:stretch>
+                      <a:fillRect/>
+                    </a:stretch>
+                  </pic:blipFill>
+                  <pic:spPr>
+                    <a:xfrm>
+                      <a:off x="0" y="0"/>
+                      <a:ext cx="5040000" cy="2835000"/>
+                    </a:xfrm>
+                    <a:prstGeom prst="rect"/>
+                  </pic:spPr>
+                </pic:pic>
+              </a:graphicData>
+            </a:graphic>
+          </wp:inline>
+        </w:drawing>
+      </w:r>
+    </w:p>
+    <w:p>
+      <w:pPr>
         <w:spacing w:before="80" w:after="80"/>
       </w:pPr>
       <w:r>
@@ -2760,6 +4305,17 @@
           <w:sz w:val="22"/>
         </w:rPr>
         <w:t>EXP-013: log-log slope 0.572, theory 0.5 — near-optimal. R-squared 0.9915. Sublinear regret confirmed empirically.</w:t>
+      </w:r>
+    </w:p>
+    <w:p>
+      <w:pPr>
+        <w:spacing w:before="80" w:after="80"/>
+      </w:pPr>
+      <w:r>
+        <w:rPr>
+          <w:sz w:val="22"/>
+        </w:rPr>
+        <w:t>With the empirical evidence established, let me now show you the system working in practice.</w:t>
       </w:r>
     </w:p>
     <w:p/>
@@ -2789,6 +4345,45 @@
     </w:p>
     <w:p>
       <w:pPr>
+        <w:jc w:val="center"/>
+      </w:pPr>
+      <w:r>
+        <w:drawing>
+          <wp:inline xmlns:a="http://schemas.openxmlformats.org/drawingml/2006/main" xmlns:pic="http://schemas.openxmlformats.org/drawingml/2006/picture">
+            <wp:extent cx="5040000" cy="2835000"/>
+            <wp:docPr id="33" name="Picture 33"/>
+            <wp:cNvGraphicFramePr>
+              <a:graphicFrameLocks noChangeAspect="1"/>
+            </wp:cNvGraphicFramePr>
+            <a:graphic>
+              <a:graphicData uri="http://schemas.openxmlformats.org/drawingml/2006/picture">
+                <pic:pic>
+                  <pic:nvPicPr>
+                    <pic:cNvPr id="0" name="slide_033.png"/>
+                    <pic:cNvPicPr/>
+                  </pic:nvPicPr>
+                  <pic:blipFill>
+                    <a:blip r:embed="rId41"/>
+                    <a:stretch>
+                      <a:fillRect/>
+                    </a:stretch>
+                  </pic:blipFill>
+                  <pic:spPr>
+                    <a:xfrm>
+                      <a:off x="0" y="0"/>
+                      <a:ext cx="5040000" cy="2835000"/>
+                    </a:xfrm>
+                    <a:prstGeom prst="rect"/>
+                  </pic:spPr>
+                </pic:pic>
+              </a:graphicData>
+            </a:graphic>
+          </wp:inline>
+        </w:drawing>
+      </w:r>
+    </w:p>
+    <w:p>
+      <w:pPr>
         <w:spacing w:before="80" w:after="80"/>
       </w:pPr>
       <w:r>
@@ -2895,6 +4490,17 @@
           <w:sz w:val="22"/>
         </w:rPr>
         <w:t>This is not a simulation. This is the same FastAPI stack described in the thesis, deployed on Render, running in real time.</w:t>
+      </w:r>
+    </w:p>
+    <w:p>
+      <w:pPr>
+        <w:spacing w:before="80" w:after="80"/>
+      </w:pPr>
+      <w:r>
+        <w:rPr>
+          <w:sz w:val="22"/>
+        </w:rPr>
+        <w:t>Let me now bring together the key findings.</w:t>
       </w:r>
     </w:p>
     <w:p/>
@@ -2924,6 +4530,45 @@
     </w:p>
     <w:p>
       <w:pPr>
+        <w:jc w:val="center"/>
+      </w:pPr>
+      <w:r>
+        <w:drawing>
+          <wp:inline xmlns:a="http://schemas.openxmlformats.org/drawingml/2006/main" xmlns:pic="http://schemas.openxmlformats.org/drawingml/2006/picture">
+            <wp:extent cx="5040000" cy="2835000"/>
+            <wp:docPr id="34" name="Picture 34"/>
+            <wp:cNvGraphicFramePr>
+              <a:graphicFrameLocks noChangeAspect="1"/>
+            </wp:cNvGraphicFramePr>
+            <a:graphic>
+              <a:graphicData uri="http://schemas.openxmlformats.org/drawingml/2006/picture">
+                <pic:pic>
+                  <pic:nvPicPr>
+                    <pic:cNvPr id="0" name="slide_034.png"/>
+                    <pic:cNvPicPr/>
+                  </pic:nvPicPr>
+                  <pic:blipFill>
+                    <a:blip r:embed="rId42"/>
+                    <a:stretch>
+                      <a:fillRect/>
+                    </a:stretch>
+                  </pic:blipFill>
+                  <pic:spPr>
+                    <a:xfrm>
+                      <a:off x="0" y="0"/>
+                      <a:ext cx="5040000" cy="2835000"/>
+                    </a:xfrm>
+                    <a:prstGeom prst="rect"/>
+                  </pic:spPr>
+                </pic:pic>
+              </a:graphicData>
+            </a:graphic>
+          </wp:inline>
+        </w:drawing>
+      </w:r>
+    </w:p>
+    <w:p>
+      <w:pPr>
         <w:spacing w:before="80" w:after="80"/>
       </w:pPr>
       <w:r>
@@ -2960,12 +4605,62 @@
     </w:p>
     <w:p>
       <w:pPr>
+        <w:jc w:val="center"/>
+      </w:pPr>
+      <w:r>
+        <w:drawing>
+          <wp:inline xmlns:a="http://schemas.openxmlformats.org/drawingml/2006/main" xmlns:pic="http://schemas.openxmlformats.org/drawingml/2006/picture">
+            <wp:extent cx="5040000" cy="2835000"/>
+            <wp:docPr id="35" name="Picture 35"/>
+            <wp:cNvGraphicFramePr>
+              <a:graphicFrameLocks noChangeAspect="1"/>
+            </wp:cNvGraphicFramePr>
+            <a:graphic>
+              <a:graphicData uri="http://schemas.openxmlformats.org/drawingml/2006/picture">
+                <pic:pic>
+                  <pic:nvPicPr>
+                    <pic:cNvPr id="0" name="slide_035.png"/>
+                    <pic:cNvPicPr/>
+                  </pic:nvPicPr>
+                  <pic:blipFill>
+                    <a:blip r:embed="rId43"/>
+                    <a:stretch>
+                      <a:fillRect/>
+                    </a:stretch>
+                  </pic:blipFill>
+                  <pic:spPr>
+                    <a:xfrm>
+                      <a:off x="0" y="0"/>
+                      <a:ext cx="5040000" cy="2835000"/>
+                    </a:xfrm>
+                    <a:prstGeom prst="rect"/>
+                  </pic:spPr>
+                </pic:pic>
+              </a:graphicData>
+            </a:graphic>
+          </wp:inline>
+        </w:drawing>
+      </w:r>
+    </w:p>
+    <w:p>
+      <w:pPr>
         <w:spacing w:before="80" w:after="80"/>
       </w:pPr>
       <w:r>
         <w:rPr>
           <w:sz w:val="22"/>
         </w:rPr>
+        <w:t>To summarize, this project proves four things.</w:t>
+      </w:r>
+    </w:p>
+    <w:p>
+      <w:pPr>
+        <w:spacing w:before="80" w:after="80"/>
+      </w:pPr>
+      <w:r>
+        <w:rPr>
+          <w:sz w:val="22"/>
+        </w:rPr>
         <w:t>[Point to Finding 1.]</w:t>
       </w:r>
     </w:p>
@@ -3055,6 +4750,17 @@
           <w:sz w:val="22"/>
         </w:rPr>
         <w:t>In 2023, the static system issued DECLINE. Sophea left without coverage. In 2026, the bandit issues STANDARD premium — the correct actuarial answer. That is the 25.2%. It is not everything — a trivial constant earns more. But it is a principled, fair, auditable step forward for an insurance market that needs one.</w:t>
+      </w:r>
+    </w:p>
+    <w:p>
+      <w:pPr>
+        <w:spacing w:before="80" w:after="80"/>
+      </w:pPr>
+      <w:r>
+        <w:rPr>
+          <w:sz w:val="22"/>
+        </w:rPr>
+        <w:t>These findings come with limits I want to name directly.</w:t>
       </w:r>
     </w:p>
     <w:p/>
@@ -3084,6 +4790,45 @@
     </w:p>
     <w:p>
       <w:pPr>
+        <w:jc w:val="center"/>
+      </w:pPr>
+      <w:r>
+        <w:drawing>
+          <wp:inline xmlns:a="http://schemas.openxmlformats.org/drawingml/2006/main" xmlns:pic="http://schemas.openxmlformats.org/drawingml/2006/picture">
+            <wp:extent cx="5040000" cy="2835000"/>
+            <wp:docPr id="36" name="Picture 36"/>
+            <wp:cNvGraphicFramePr>
+              <a:graphicFrameLocks noChangeAspect="1"/>
+            </wp:cNvGraphicFramePr>
+            <a:graphic>
+              <a:graphicData uri="http://schemas.openxmlformats.org/drawingml/2006/picture">
+                <pic:pic>
+                  <pic:nvPicPr>
+                    <pic:cNvPr id="0" name="slide_036.png"/>
+                    <pic:cNvPicPr/>
+                  </pic:nvPicPr>
+                  <pic:blipFill>
+                    <a:blip r:embed="rId44"/>
+                    <a:stretch>
+                      <a:fillRect/>
+                    </a:stretch>
+                  </pic:blipFill>
+                  <pic:spPr>
+                    <a:xfrm>
+                      <a:off x="0" y="0"/>
+                      <a:ext cx="5040000" cy="2835000"/>
+                    </a:xfrm>
+                    <a:prstGeom prst="rect"/>
+                  </pic:spPr>
+                </pic:pic>
+              </a:graphicData>
+            </a:graphic>
+          </wp:inline>
+        </w:drawing>
+      </w:r>
+    </w:p>
+    <w:p>
+      <w:pPr>
         <w:spacing w:before="80" w:after="80"/>
       </w:pPr>
       <w:r>
@@ -3146,6 +4891,17 @@
           <w:sz w:val="22"/>
         </w:rPr>
         <w:t>Fourth: the constant-policy ceiling. AlwaysRATED beats bandits by roughly 30 percent. Bandits lead every admissible deployable alternative — but the headroom to Oracle remains large. This is honestly reported and defines the next phase of work.</w:t>
+      </w:r>
+    </w:p>
+    <w:p>
+      <w:pPr>
+        <w:spacing w:before="80" w:after="80"/>
+      </w:pPr>
+      <w:r>
+        <w:rPr>
+          <w:sz w:val="22"/>
+        </w:rPr>
+        <w:t>Those limits point directly to the next research agenda.</w:t>
       </w:r>
     </w:p>
     <w:p/>
@@ -3175,6 +4931,45 @@
     </w:p>
     <w:p>
       <w:pPr>
+        <w:jc w:val="center"/>
+      </w:pPr>
+      <w:r>
+        <w:drawing>
+          <wp:inline xmlns:a="http://schemas.openxmlformats.org/drawingml/2006/main" xmlns:pic="http://schemas.openxmlformats.org/drawingml/2006/picture">
+            <wp:extent cx="5040000" cy="2835000"/>
+            <wp:docPr id="37" name="Picture 37"/>
+            <wp:cNvGraphicFramePr>
+              <a:graphicFrameLocks noChangeAspect="1"/>
+            </wp:cNvGraphicFramePr>
+            <a:graphic>
+              <a:graphicData uri="http://schemas.openxmlformats.org/drawingml/2006/picture">
+                <pic:pic>
+                  <pic:nvPicPr>
+                    <pic:cNvPr id="0" name="slide_037.png"/>
+                    <pic:cNvPicPr/>
+                  </pic:nvPicPr>
+                  <pic:blipFill>
+                    <a:blip r:embed="rId45"/>
+                    <a:stretch>
+                      <a:fillRect/>
+                    </a:stretch>
+                  </pic:blipFill>
+                  <pic:spPr>
+                    <a:xfrm>
+                      <a:off x="0" y="0"/>
+                      <a:ext cx="5040000" cy="2835000"/>
+                    </a:xfrm>
+                    <a:prstGeom prst="rect"/>
+                  </pic:spPr>
+                </pic:pic>
+              </a:graphicData>
+            </a:graphic>
+          </wp:inline>
+        </w:drawing>
+      </w:r>
+    </w:p>
+    <w:p>
+      <w:pPr>
         <w:spacing w:before="80" w:after="80"/>
       </w:pPr>
       <w:r>
@@ -3226,6 +5021,17 @@
           <w:sz w:val="22"/>
         </w:rPr>
         <w:t>Fourth: multi-period customer value. Customer lifetime value, retention, and cross-selling would move the system beyond the single-decision reward framing.</w:t>
+      </w:r>
+    </w:p>
+    <w:p>
+      <w:pPr>
+        <w:spacing w:before="80" w:after="80"/>
+      </w:pPr>
+      <w:r>
+        <w:rPr>
+          <w:sz w:val="22"/>
+        </w:rPr>
+        <w:t>Each of these directions builds on the foundation this thesis has established. Finally, let me close with the story we began with.</w:t>
       </w:r>
     </w:p>
     <w:p/>
@@ -3255,6 +5061,45 @@
     </w:p>
     <w:p>
       <w:pPr>
+        <w:jc w:val="center"/>
+      </w:pPr>
+      <w:r>
+        <w:drawing>
+          <wp:inline xmlns:a="http://schemas.openxmlformats.org/drawingml/2006/main" xmlns:pic="http://schemas.openxmlformats.org/drawingml/2006/picture">
+            <wp:extent cx="5040000" cy="2835000"/>
+            <wp:docPr id="38" name="Picture 38"/>
+            <wp:cNvGraphicFramePr>
+              <a:graphicFrameLocks noChangeAspect="1"/>
+            </wp:cNvGraphicFramePr>
+            <a:graphic>
+              <a:graphicData uri="http://schemas.openxmlformats.org/drawingml/2006/picture">
+                <pic:pic>
+                  <pic:nvPicPr>
+                    <pic:cNvPr id="0" name="slide_038.png"/>
+                    <pic:cNvPicPr/>
+                  </pic:nvPicPr>
+                  <pic:blipFill>
+                    <a:blip r:embed="rId46"/>
+                    <a:stretch>
+                      <a:fillRect/>
+                    </a:stretch>
+                  </pic:blipFill>
+                  <pic:spPr>
+                    <a:xfrm>
+                      <a:off x="0" y="0"/>
+                      <a:ext cx="5040000" cy="2835000"/>
+                    </a:xfrm>
+                    <a:prstGeom prst="rect"/>
+                  </pic:spPr>
+                </pic:pic>
+              </a:graphicData>
+            </a:graphic>
+          </wp:inline>
+        </w:drawing>
+      </w:r>
+    </w:p>
+    <w:p>
+      <w:pPr>
         <w:spacing w:before="80" w:after="80"/>
       </w:pPr>
       <w:r>
@@ -3283,7 +5128,7 @@
         <w:rPr>
           <w:sz w:val="22"/>
         </w:rPr>
-        <w:t>In 2023, the static system declined Sophea. In 2026, the bandit issues STANDARD premium. Cambodia has hundreds of thousands of applicants like her — people whose risk profiles are nuanced, whose context matters, and who deserve a decision system capable of seeing them fully.</w:t>
+        <w:t>In 2023, the system told Sophea 'No.' In 2026, my system tells her 'Yes — at the right price': STANDARD premium, the correct actuarial answer. Cambodia has hundreds of thousands of applicants like her — people whose risk profiles are nuanced, whose context matters, and who deserve a decision system capable of seeing them fully.</w:t>
       </w:r>
     </w:p>
     <w:p>
@@ -3335,6 +5180,45 @@
     </w:p>
     <w:p>
       <w:pPr>
+        <w:jc w:val="center"/>
+      </w:pPr>
+      <w:r>
+        <w:drawing>
+          <wp:inline xmlns:a="http://schemas.openxmlformats.org/drawingml/2006/main" xmlns:pic="http://schemas.openxmlformats.org/drawingml/2006/picture">
+            <wp:extent cx="5040000" cy="2835000"/>
+            <wp:docPr id="39" name="Picture 39"/>
+            <wp:cNvGraphicFramePr>
+              <a:graphicFrameLocks noChangeAspect="1"/>
+            </wp:cNvGraphicFramePr>
+            <a:graphic>
+              <a:graphicData uri="http://schemas.openxmlformats.org/drawingml/2006/picture">
+                <pic:pic>
+                  <pic:nvPicPr>
+                    <pic:cNvPr id="0" name="slide_039.png"/>
+                    <pic:cNvPicPr/>
+                  </pic:nvPicPr>
+                  <pic:blipFill>
+                    <a:blip r:embed="rId47"/>
+                    <a:stretch>
+                      <a:fillRect/>
+                    </a:stretch>
+                  </pic:blipFill>
+                  <pic:spPr>
+                    <a:xfrm>
+                      <a:off x="0" y="0"/>
+                      <a:ext cx="5040000" cy="2835000"/>
+                    </a:xfrm>
+                    <a:prstGeom prst="rect"/>
+                  </pic:spPr>
+                </pic:pic>
+              </a:graphicData>
+            </a:graphic>
+          </wp:inline>
+        </w:drawing>
+      </w:r>
+    </w:p>
+    <w:p>
+      <w:pPr>
         <w:spacing w:before="80" w:after="80"/>
       </w:pPr>
       <w:r>
@@ -3437,6 +5321,45 @@
     </w:p>
     <w:p>
       <w:pPr>
+        <w:jc w:val="center"/>
+      </w:pPr>
+      <w:r>
+        <w:drawing>
+          <wp:inline xmlns:a="http://schemas.openxmlformats.org/drawingml/2006/main" xmlns:pic="http://schemas.openxmlformats.org/drawingml/2006/picture">
+            <wp:extent cx="5040000" cy="2835000"/>
+            <wp:docPr id="40" name="Picture 40"/>
+            <wp:cNvGraphicFramePr>
+              <a:graphicFrameLocks noChangeAspect="1"/>
+            </wp:cNvGraphicFramePr>
+            <a:graphic>
+              <a:graphicData uri="http://schemas.openxmlformats.org/drawingml/2006/picture">
+                <pic:pic>
+                  <pic:nvPicPr>
+                    <pic:cNvPr id="0" name="slide_040.png"/>
+                    <pic:cNvPicPr/>
+                  </pic:nvPicPr>
+                  <pic:blipFill>
+                    <a:blip r:embed="rId48"/>
+                    <a:stretch>
+                      <a:fillRect/>
+                    </a:stretch>
+                  </pic:blipFill>
+                  <pic:spPr>
+                    <a:xfrm>
+                      <a:off x="0" y="0"/>
+                      <a:ext cx="5040000" cy="2835000"/>
+                    </a:xfrm>
+                    <a:prstGeom prst="rect"/>
+                  </pic:spPr>
+                </pic:pic>
+              </a:graphicData>
+            </a:graphic>
+          </wp:inline>
+        </w:drawing>
+      </w:r>
+    </w:p>
+    <w:p>
+      <w:pPr>
         <w:spacing w:before="80" w:after="80"/>
       </w:pPr>
       <w:r>
@@ -3528,6 +5451,45 @@
     </w:p>
     <w:p>
       <w:pPr>
+        <w:jc w:val="center"/>
+      </w:pPr>
+      <w:r>
+        <w:drawing>
+          <wp:inline xmlns:a="http://schemas.openxmlformats.org/drawingml/2006/main" xmlns:pic="http://schemas.openxmlformats.org/drawingml/2006/picture">
+            <wp:extent cx="5040000" cy="2835000"/>
+            <wp:docPr id="41" name="Picture 41"/>
+            <wp:cNvGraphicFramePr>
+              <a:graphicFrameLocks noChangeAspect="1"/>
+            </wp:cNvGraphicFramePr>
+            <a:graphic>
+              <a:graphicData uri="http://schemas.openxmlformats.org/drawingml/2006/picture">
+                <pic:pic>
+                  <pic:nvPicPr>
+                    <pic:cNvPr id="0" name="slide_041.png"/>
+                    <pic:cNvPicPr/>
+                  </pic:nvPicPr>
+                  <pic:blipFill>
+                    <a:blip r:embed="rId49"/>
+                    <a:stretch>
+                      <a:fillRect/>
+                    </a:stretch>
+                  </pic:blipFill>
+                  <pic:spPr>
+                    <a:xfrm>
+                      <a:off x="0" y="0"/>
+                      <a:ext cx="5040000" cy="2835000"/>
+                    </a:xfrm>
+                    <a:prstGeom prst="rect"/>
+                  </pic:spPr>
+                </pic:pic>
+              </a:graphicData>
+            </a:graphic>
+          </wp:inline>
+        </w:drawing>
+      </w:r>
+    </w:p>
+    <w:p>
+      <w:pPr>
         <w:spacing w:before="80" w:after="80"/>
       </w:pPr>
       <w:r>
@@ -3652,6 +5614,45 @@
     </w:p>
     <w:p>
       <w:pPr>
+        <w:jc w:val="center"/>
+      </w:pPr>
+      <w:r>
+        <w:drawing>
+          <wp:inline xmlns:a="http://schemas.openxmlformats.org/drawingml/2006/main" xmlns:pic="http://schemas.openxmlformats.org/drawingml/2006/picture">
+            <wp:extent cx="5040000" cy="2835000"/>
+            <wp:docPr id="42" name="Picture 42"/>
+            <wp:cNvGraphicFramePr>
+              <a:graphicFrameLocks noChangeAspect="1"/>
+            </wp:cNvGraphicFramePr>
+            <a:graphic>
+              <a:graphicData uri="http://schemas.openxmlformats.org/drawingml/2006/picture">
+                <pic:pic>
+                  <pic:nvPicPr>
+                    <pic:cNvPr id="0" name="slide_042.png"/>
+                    <pic:cNvPicPr/>
+                  </pic:nvPicPr>
+                  <pic:blipFill>
+                    <a:blip r:embed="rId50"/>
+                    <a:stretch>
+                      <a:fillRect/>
+                    </a:stretch>
+                  </pic:blipFill>
+                  <pic:spPr>
+                    <a:xfrm>
+                      <a:off x="0" y="0"/>
+                      <a:ext cx="5040000" cy="2835000"/>
+                    </a:xfrm>
+                    <a:prstGeom prst="rect"/>
+                  </pic:spPr>
+                </pic:pic>
+              </a:graphicData>
+            </a:graphic>
+          </wp:inline>
+        </w:drawing>
+      </w:r>
+    </w:p>
+    <w:p>
+      <w:pPr>
         <w:spacing w:before="80" w:after="80"/>
       </w:pPr>
       <w:r>
@@ -3738,6 +5739,45 @@
     </w:p>
     <w:p>
       <w:pPr>
+        <w:jc w:val="center"/>
+      </w:pPr>
+      <w:r>
+        <w:drawing>
+          <wp:inline xmlns:a="http://schemas.openxmlformats.org/drawingml/2006/main" xmlns:pic="http://schemas.openxmlformats.org/drawingml/2006/picture">
+            <wp:extent cx="5040000" cy="2835000"/>
+            <wp:docPr id="43" name="Picture 43"/>
+            <wp:cNvGraphicFramePr>
+              <a:graphicFrameLocks noChangeAspect="1"/>
+            </wp:cNvGraphicFramePr>
+            <a:graphic>
+              <a:graphicData uri="http://schemas.openxmlformats.org/drawingml/2006/picture">
+                <pic:pic>
+                  <pic:nvPicPr>
+                    <pic:cNvPr id="0" name="slide_043.png"/>
+                    <pic:cNvPicPr/>
+                  </pic:nvPicPr>
+                  <pic:blipFill>
+                    <a:blip r:embed="rId51"/>
+                    <a:stretch>
+                      <a:fillRect/>
+                    </a:stretch>
+                  </pic:blipFill>
+                  <pic:spPr>
+                    <a:xfrm>
+                      <a:off x="0" y="0"/>
+                      <a:ext cx="5040000" cy="2835000"/>
+                    </a:xfrm>
+                    <a:prstGeom prst="rect"/>
+                  </pic:spPr>
+                </pic:pic>
+              </a:graphicData>
+            </a:graphic>
+          </wp:inline>
+        </w:drawing>
+      </w:r>
+    </w:p>
+    <w:p>
+      <w:pPr>
         <w:spacing w:before="80" w:after="80"/>
       </w:pPr>
       <w:r>
@@ -3822,6 +5862,125 @@
           <w:sz w:val="22"/>
         </w:rPr>
         <w:t>Across the EXP-011 ablation and EXP-012 sensitivity grid, the ranking of LinUCB and LinTS above all other admissible policies is stable. Sophea receives STANDARD across all parameter combinations tested.</w:t>
+      </w:r>
+    </w:p>
+    <w:p/>
+    <w:p>
+      <w:pPr>
+        <w:pStyle w:val="Heading2"/>
+      </w:pPr>
+      <w:r>
+        <w:rPr>
+          <w:color w:val="2E74B5"/>
+        </w:rPr>
+        <w:t>APPENDIX A6  ·  A6: WHY A BANDIT HAS NO TRAIN/TEST SPLIT</w:t>
+      </w:r>
+    </w:p>
+    <w:p>
+      <w:pPr>
+        <w:spacing w:before="0" w:after="80"/>
+      </w:pPr>
+      <w:r>
+        <w:rPr>
+          <w:i/>
+          <w:color w:val="707070"/>
+          <w:sz w:val="18"/>
+        </w:rPr>
+        <w:t>Timing: if asked</w:t>
+      </w:r>
+    </w:p>
+    <w:p>
+      <w:pPr>
+        <w:jc w:val="center"/>
+      </w:pPr>
+      <w:r>
+        <w:drawing>
+          <wp:inline xmlns:a="http://schemas.openxmlformats.org/drawingml/2006/main" xmlns:pic="http://schemas.openxmlformats.org/drawingml/2006/picture">
+            <wp:extent cx="5040000" cy="2835000"/>
+            <wp:docPr id="44" name="Picture 44"/>
+            <wp:cNvGraphicFramePr>
+              <a:graphicFrameLocks noChangeAspect="1"/>
+            </wp:cNvGraphicFramePr>
+            <a:graphic>
+              <a:graphicData uri="http://schemas.openxmlformats.org/drawingml/2006/picture">
+                <pic:pic>
+                  <pic:nvPicPr>
+                    <pic:cNvPr id="0" name="slide_044.png"/>
+                    <pic:cNvPicPr/>
+                  </pic:nvPicPr>
+                  <pic:blipFill>
+                    <a:blip r:embed="rId52"/>
+                    <a:stretch>
+                      <a:fillRect/>
+                    </a:stretch>
+                  </pic:blipFill>
+                  <pic:spPr>
+                    <a:xfrm>
+                      <a:off x="0" y="0"/>
+                      <a:ext cx="5040000" cy="2835000"/>
+                    </a:xfrm>
+                    <a:prstGeom prst="rect"/>
+                  </pic:spPr>
+                </pic:pic>
+              </a:graphicData>
+            </a:graphic>
+          </wp:inline>
+        </w:drawing>
+      </w:r>
+    </w:p>
+    <w:p>
+      <w:pPr>
+        <w:spacing w:before="80" w:after="80"/>
+      </w:pPr>
+      <w:r>
+        <w:rPr>
+          <w:sz w:val="22"/>
+        </w:rPr>
+        <w:t>[Show if the Committee asks why there is no train/test split, or challenges whether the bandit's numbers could be overfit.]</w:t>
+      </w:r>
+    </w:p>
+    <w:p>
+      <w:pPr>
+        <w:spacing w:before="80" w:after="80"/>
+      </w:pPr>
+      <w:r>
+        <w:rPr>
+          <w:sz w:val="22"/>
+        </w:rPr>
+        <w:t>This is a fair question, because it does not map onto the workflow this Committee is used to seeing from supervised learning.</w:t>
+      </w:r>
+    </w:p>
+    <w:p>
+      <w:pPr>
+        <w:spacing w:before="80" w:after="80"/>
+      </w:pPr>
+      <w:r>
+        <w:rPr>
+          <w:sz w:val="22"/>
+        </w:rPr>
+        <w:t>Supervised ML — like the Static XGB incumbent — splits data into train, validation, and test sets, fits once on the training set, freezes the weights, and deploys unchanged. Generalisation is measured as the score on a held-out test set.</w:t>
+      </w:r>
+    </w:p>
+    <w:p>
+      <w:pPr>
+        <w:spacing w:before="80" w:after="80"/>
+      </w:pPr>
+      <w:r>
+        <w:rPr>
+          <w:sz w:val="22"/>
+        </w:rPr>
+        <w:t>A contextual bandit does not work that way. There is no split, because it meets applicants one at a time: select an arm, observe the reward, update. Every single round is simultaneously training and testing — the model is always being evaluated on the next applicant it has never seen, and immediately updating from that outcome.</w:t>
+      </w:r>
+    </w:p>
+    <w:p>
+      <w:pPr>
+        <w:spacing w:before="80" w:after="80"/>
+      </w:pPr>
+      <w:r>
+        <w:rPr>
+          <w:sz w:val="22"/>
+        </w:rPr>
+        <w:t>So how do we measure generalisation without a holdout set? Three ways. First, performance is reported as cumulative regret against the Oracle, averaged over 20 independent random seeds — the seeds play the role the test set would normally play. Second, all pass criteria and seeds are pre-registered and fixed, so the results are fully reproducible and there is no test-set leakage, because there is no test set to leak. Third, and importantly, the Static XGB incumbent — the thing we are comparing against — IS fit offline and frozen, exactly like standard supervised practice. So the benchmark is fair: a supervised model at its best, versus a bandit learning from scratch, evaluated across 20 seeds.</w:t>
       </w:r>
     </w:p>
     <w:p/>

</xml_diff>